<commit_message>
Inserção do seção de toxinas para o protocolo
</commit_message>
<xml_diff>
--- a/src/assets/protocol/template_protocolo_microrganismos.docx
+++ b/src/assets/protocol/template_protocolo_microrganismos.docx
@@ -4096,7 +4096,7 @@
                 <w:sz w:val="18"/>
                 <w:szCs w:val="18"/>
               </w:rPr>
-              <w:t xml:space="preserve">.                   </w:t>
+              <w:t xml:space="preserve">                   </w:t>
             </w:r>
             <w:r>
               <w:rPr>
@@ -4106,7 +4106,7 @@
                 <w:sz w:val="24"/>
                 <w:szCs w:val="24"/>
               </w:rPr>
-              <w:t xml:space="preserve">PROTOCOLO MICRORGANISMOS </w:t>
+              <w:t>PROTOCOLO</w:t>
             </w:r>
             <w:r>
               <w:rPr>
@@ -4116,9 +4116,8 @@
                 <w:sz w:val="24"/>
                 <w:szCs w:val="24"/>
               </w:rPr>
-              <w:t>- {{</w:t>
-            </w:r>
-            <w:proofErr w:type="spellStart"/>
+              <w:t xml:space="preserve"> METAIS</w:t>
+            </w:r>
             <w:r>
               <w:rPr>
                 <w:rFonts w:ascii="Calibri" w:eastAsia="Calibri" w:hAnsi="Calibri" w:cs="Calibri"/>
@@ -4127,18 +4126,7 @@
                 <w:sz w:val="24"/>
                 <w:szCs w:val="24"/>
               </w:rPr>
-              <w:t>name</w:t>
-            </w:r>
-            <w:proofErr w:type="spellEnd"/>
-            <w:r>
-              <w:rPr>
-                <w:rFonts w:ascii="Calibri" w:eastAsia="Calibri" w:hAnsi="Calibri" w:cs="Calibri"/>
-                <w:b/>
-                <w:bCs/>
-                <w:sz w:val="24"/>
-                <w:szCs w:val="24"/>
-              </w:rPr>
-              <w:t>}}</w:t>
+              <w:t xml:space="preserve"> </w:t>
             </w:r>
           </w:p>
         </w:tc>
@@ -4216,7 +4204,7 @@
                 <w:szCs w:val="18"/>
                 <w:lang w:val="en-US"/>
               </w:rPr>
-              <w:t>microorganisms_protocol</w:t>
+              <w:t>metals_protocol</w:t>
             </w:r>
             <w:proofErr w:type="spellEnd"/>
             <w:r>
@@ -4374,7 +4362,6 @@
                 <w:bCs/>
                 <w:sz w:val="26"/>
                 <w:szCs w:val="26"/>
-                <w:u w:val="single"/>
               </w:rPr>
             </w:pPr>
             <w:r>
@@ -4392,7 +4379,17 @@
                 <w:szCs w:val="18"/>
               </w:rPr>
               <w:tab/>
-              <w:t>Microrganismos não encontrados</w:t>
+              <w:t xml:space="preserve">                   </w:t>
+            </w:r>
+            <w:r>
+              <w:rPr>
+                <w:rFonts w:ascii="Calibri" w:eastAsia="Calibri" w:hAnsi="Calibri" w:cs="Calibri"/>
+                <w:b/>
+                <w:bCs/>
+                <w:sz w:val="24"/>
+                <w:szCs w:val="24"/>
+              </w:rPr>
+              <w:t>PROTOCOLO MICRORGANISMOS</w:t>
             </w:r>
           </w:p>
         </w:tc>
@@ -4470,38 +4467,17 @@
                 <w:szCs w:val="18"/>
                 <w:lang w:val="en-US"/>
               </w:rPr>
-              <w:t>microorganisms_not_founded</w:t>
+              <w:t>microorganisms_protocol</w:t>
             </w:r>
             <w:proofErr w:type="spellEnd"/>
-          </w:p>
-          <w:p>
-            <w:pPr>
-              <w:widowControl w:val="0"/>
-              <w:pBdr>
-                <w:top w:val="nil"/>
-                <w:left w:val="nil"/>
-                <w:bottom w:val="nil"/>
-                <w:right w:val="nil"/>
-                <w:between w:val="nil"/>
-              </w:pBdr>
-              <w:shd w:val="clear" w:color="auto" w:fill="D9D9D9" w:themeFill="background1" w:themeFillShade="D9"/>
-              <w:ind w:left="-850"/>
-              <w:jc w:val="center"/>
+            <w:r>
               <w:rPr>
                 <w:rFonts w:ascii="Calibri" w:eastAsia="Calibri" w:hAnsi="Calibri" w:cs="Calibri"/>
                 <w:sz w:val="18"/>
                 <w:szCs w:val="18"/>
                 <w:lang w:val="en-US"/>
               </w:rPr>
-            </w:pPr>
-            <w:r>
-              <w:rPr>
-                <w:rFonts w:ascii="Calibri" w:eastAsia="Calibri" w:hAnsi="Calibri" w:cs="Calibri"/>
-                <w:sz w:val="18"/>
-                <w:szCs w:val="18"/>
-                <w:lang w:val="en-US"/>
-              </w:rPr>
-              <w:t>%}</w:t>
+              <w:t xml:space="preserve"> %}</w:t>
             </w:r>
           </w:p>
         </w:tc>
@@ -4556,6 +4532,558 @@
               <w:right w:val="single" w:sz="4" w:space="0" w:color="000000"/>
             </w:tcBorders>
             <w:shd w:val="clear" w:color="auto" w:fill="FFFFFF" w:themeFill="background1"/>
+          </w:tcPr>
+          <w:p>
+            <w:pPr>
+              <w:spacing w:line="240" w:lineRule="auto"/>
+              <w:rPr>
+                <w:rFonts w:ascii="Calibri" w:eastAsia="Calibri" w:hAnsi="Calibri" w:cs="Calibri"/>
+                <w:sz w:val="18"/>
+                <w:szCs w:val="18"/>
+              </w:rPr>
+            </w:pPr>
+            <w:r>
+              <w:rPr>
+                <w:rFonts w:ascii="Calibri" w:eastAsia="Calibri" w:hAnsi="Calibri" w:cs="Calibri"/>
+                <w:sz w:val="18"/>
+                <w:szCs w:val="18"/>
+              </w:rPr>
+              <w:t xml:space="preserve">{% </w:t>
+            </w:r>
+            <w:proofErr w:type="spellStart"/>
+            <w:r>
+              <w:rPr>
+                <w:rFonts w:ascii="Calibri" w:eastAsia="Calibri" w:hAnsi="Calibri" w:cs="Calibri"/>
+                <w:sz w:val="18"/>
+                <w:szCs w:val="18"/>
+              </w:rPr>
+              <w:t>endfor</w:t>
+            </w:r>
+            <w:proofErr w:type="spellEnd"/>
+            <w:r>
+              <w:rPr>
+                <w:rFonts w:ascii="Calibri" w:eastAsia="Calibri" w:hAnsi="Calibri" w:cs="Calibri"/>
+                <w:sz w:val="18"/>
+                <w:szCs w:val="18"/>
+              </w:rPr>
+              <w:t xml:space="preserve"> %}</w:t>
+            </w:r>
+          </w:p>
+        </w:tc>
+      </w:tr>
+    </w:tbl>
+    <w:p/>
+    <w:tbl>
+      <w:tblPr>
+        <w:tblW w:w="4815" w:type="dxa"/>
+        <w:tblInd w:w="125" w:type="dxa"/>
+        <w:tblBorders>
+          <w:top w:val="single" w:sz="4" w:space="0" w:color="E2EFD9"/>
+          <w:left w:val="single" w:sz="4" w:space="0" w:color="E2EFD9"/>
+          <w:bottom w:val="single" w:sz="4" w:space="0" w:color="E2EFD9"/>
+          <w:right w:val="single" w:sz="4" w:space="0" w:color="E2EFD9"/>
+          <w:insideH w:val="single" w:sz="4" w:space="0" w:color="E2EFD9"/>
+          <w:insideV w:val="single" w:sz="4" w:space="0" w:color="E2EFD9"/>
+        </w:tblBorders>
+        <w:tblLayout w:type="fixed"/>
+        <w:tblLook w:val="0400" w:firstRow="0" w:lastRow="0" w:firstColumn="0" w:lastColumn="0" w:noHBand="0" w:noVBand="1"/>
+      </w:tblPr>
+      <w:tblGrid>
+        <w:gridCol w:w="4815"/>
+      </w:tblGrid>
+      <w:tr>
+        <w:trPr>
+          <w:trHeight w:val="196"/>
+        </w:trPr>
+        <w:tc>
+          <w:tcPr>
+            <w:tcW w:w="4815" w:type="dxa"/>
+            <w:tcBorders>
+              <w:top w:val="single" w:sz="4" w:space="0" w:color="000000"/>
+              <w:left w:val="single" w:sz="4" w:space="0" w:color="000000"/>
+              <w:bottom w:val="single" w:sz="4" w:space="0" w:color="000000"/>
+              <w:right w:val="single" w:sz="4" w:space="0" w:color="000000"/>
+            </w:tcBorders>
+            <w:shd w:val="clear" w:color="auto" w:fill="D9E2F3"/>
+            <w:vAlign w:val="center"/>
+          </w:tcPr>
+          <w:p>
+            <w:pPr>
+              <w:widowControl w:val="0"/>
+              <w:pBdr>
+                <w:top w:val="nil"/>
+                <w:left w:val="nil"/>
+                <w:bottom w:val="nil"/>
+                <w:right w:val="nil"/>
+                <w:between w:val="nil"/>
+              </w:pBdr>
+              <w:ind w:left="-850"/>
+              <w:jc w:val="center"/>
+              <w:rPr>
+                <w:rFonts w:ascii="Calibri" w:eastAsia="Calibri" w:hAnsi="Calibri" w:cs="Calibri"/>
+                <w:b/>
+                <w:bCs/>
+                <w:sz w:val="26"/>
+                <w:szCs w:val="26"/>
+                <w:u w:val="single"/>
+              </w:rPr>
+            </w:pPr>
+            <w:r>
+              <w:rPr>
+                <w:rFonts w:ascii="Calibri" w:eastAsia="Calibri" w:hAnsi="Calibri" w:cs="Calibri"/>
+                <w:sz w:val="18"/>
+                <w:szCs w:val="18"/>
+              </w:rPr>
+              <w:tab/>
+              <w:t>Metais não encontrados</w:t>
+            </w:r>
+          </w:p>
+        </w:tc>
+      </w:tr>
+      <w:tr>
+        <w:trPr>
+          <w:trHeight w:val="196"/>
+        </w:trPr>
+        <w:tc>
+          <w:tcPr>
+            <w:tcW w:w="4815" w:type="dxa"/>
+            <w:tcBorders>
+              <w:top w:val="single" w:sz="4" w:space="0" w:color="000000"/>
+              <w:left w:val="single" w:sz="4" w:space="0" w:color="000000"/>
+              <w:bottom w:val="single" w:sz="4" w:space="0" w:color="000000"/>
+              <w:right w:val="single" w:sz="4" w:space="0" w:color="000000"/>
+            </w:tcBorders>
+            <w:shd w:val="clear" w:color="auto" w:fill="D9E2F3"/>
+            <w:vAlign w:val="center"/>
+          </w:tcPr>
+          <w:p>
+            <w:pPr>
+              <w:widowControl w:val="0"/>
+              <w:pBdr>
+                <w:top w:val="nil"/>
+                <w:left w:val="nil"/>
+                <w:bottom w:val="nil"/>
+                <w:right w:val="nil"/>
+                <w:between w:val="nil"/>
+              </w:pBdr>
+              <w:shd w:val="clear" w:color="auto" w:fill="D9D9D9" w:themeFill="background1" w:themeFillShade="D9"/>
+              <w:ind w:left="-850"/>
+              <w:jc w:val="center"/>
+              <w:rPr>
+                <w:rFonts w:ascii="Calibri" w:eastAsia="Calibri" w:hAnsi="Calibri" w:cs="Calibri"/>
+                <w:sz w:val="18"/>
+                <w:szCs w:val="18"/>
+                <w:lang w:val="en-US"/>
+              </w:rPr>
+            </w:pPr>
+            <w:r>
+              <w:rPr>
+                <w:rFonts w:ascii="Calibri" w:eastAsia="Calibri" w:hAnsi="Calibri" w:cs="Calibri"/>
+                <w:sz w:val="18"/>
+                <w:szCs w:val="18"/>
+                <w:lang w:val="en-US"/>
+              </w:rPr>
+              <w:t xml:space="preserve">{% for </w:t>
+            </w:r>
+            <w:proofErr w:type="spellStart"/>
+            <w:r>
+              <w:rPr>
+                <w:rFonts w:ascii="Calibri" w:eastAsia="Calibri" w:hAnsi="Calibri" w:cs="Calibri"/>
+                <w:sz w:val="18"/>
+                <w:szCs w:val="18"/>
+                <w:lang w:val="en-US"/>
+              </w:rPr>
+              <w:t>i</w:t>
+            </w:r>
+            <w:proofErr w:type="spellEnd"/>
+            <w:r>
+              <w:rPr>
+                <w:rFonts w:ascii="Calibri" w:eastAsia="Calibri" w:hAnsi="Calibri" w:cs="Calibri"/>
+                <w:sz w:val="18"/>
+                <w:szCs w:val="18"/>
+                <w:lang w:val="en-US"/>
+              </w:rPr>
+              <w:t xml:space="preserve"> in </w:t>
+            </w:r>
+            <w:proofErr w:type="spellStart"/>
+            <w:r>
+              <w:rPr>
+                <w:rFonts w:ascii="Calibri" w:eastAsia="Calibri" w:hAnsi="Calibri" w:cs="Calibri"/>
+                <w:sz w:val="18"/>
+                <w:szCs w:val="18"/>
+                <w:lang w:val="en-US"/>
+              </w:rPr>
+              <w:t>metals</w:t>
+            </w:r>
+            <w:r>
+              <w:rPr>
+                <w:rFonts w:ascii="Calibri" w:eastAsia="Calibri" w:hAnsi="Calibri" w:cs="Calibri"/>
+                <w:sz w:val="18"/>
+                <w:szCs w:val="18"/>
+                <w:lang w:val="en-US"/>
+              </w:rPr>
+              <w:t>_not_founded</w:t>
+            </w:r>
+            <w:proofErr w:type="spellEnd"/>
+          </w:p>
+          <w:p>
+            <w:pPr>
+              <w:widowControl w:val="0"/>
+              <w:pBdr>
+                <w:top w:val="nil"/>
+                <w:left w:val="nil"/>
+                <w:bottom w:val="nil"/>
+                <w:right w:val="nil"/>
+                <w:between w:val="nil"/>
+              </w:pBdr>
+              <w:shd w:val="clear" w:color="auto" w:fill="D9D9D9" w:themeFill="background1" w:themeFillShade="D9"/>
+              <w:ind w:left="-850"/>
+              <w:jc w:val="center"/>
+              <w:rPr>
+                <w:rFonts w:ascii="Calibri" w:eastAsia="Calibri" w:hAnsi="Calibri" w:cs="Calibri"/>
+                <w:sz w:val="18"/>
+                <w:szCs w:val="18"/>
+                <w:lang w:val="en-US"/>
+              </w:rPr>
+            </w:pPr>
+            <w:r>
+              <w:rPr>
+                <w:rFonts w:ascii="Calibri" w:eastAsia="Calibri" w:hAnsi="Calibri" w:cs="Calibri"/>
+                <w:sz w:val="18"/>
+                <w:szCs w:val="18"/>
+                <w:lang w:val="en-US"/>
+              </w:rPr>
+              <w:t>%}</w:t>
+            </w:r>
+          </w:p>
+        </w:tc>
+      </w:tr>
+      <w:tr>
+        <w:trPr>
+          <w:trHeight w:val="224"/>
+        </w:trPr>
+        <w:tc>
+          <w:tcPr>
+            <w:tcW w:w="4815" w:type="dxa"/>
+            <w:tcBorders>
+              <w:top w:val="single" w:sz="4" w:space="0" w:color="000000"/>
+              <w:left w:val="single" w:sz="4" w:space="0" w:color="000000"/>
+              <w:bottom w:val="single" w:sz="4" w:space="0" w:color="000000"/>
+              <w:right w:val="single" w:sz="4" w:space="0" w:color="000000"/>
+            </w:tcBorders>
+            <w:shd w:val="clear" w:color="auto" w:fill="D9D9D9" w:themeFill="background1" w:themeFillShade="D9"/>
+          </w:tcPr>
+          <w:p>
+            <w:pPr>
+              <w:keepLines/>
+              <w:spacing w:line="240" w:lineRule="auto"/>
+              <w:rPr>
+                <w:rFonts w:ascii="Calibri" w:eastAsia="Calibri" w:hAnsi="Calibri" w:cs="Calibri"/>
+                <w:sz w:val="18"/>
+                <w:szCs w:val="18"/>
+              </w:rPr>
+            </w:pPr>
+            <w:r>
+              <w:rPr>
+                <w:rFonts w:ascii="Calibri" w:eastAsia="Calibri" w:hAnsi="Calibri" w:cs="Calibri"/>
+                <w:sz w:val="18"/>
+                <w:szCs w:val="18"/>
+              </w:rPr>
+              <w:t>{{i}}</w:t>
+            </w:r>
+          </w:p>
+        </w:tc>
+      </w:tr>
+      <w:tr>
+        <w:trPr>
+          <w:trHeight w:val="180"/>
+        </w:trPr>
+        <w:tc>
+          <w:tcPr>
+            <w:tcW w:w="4815" w:type="dxa"/>
+            <w:tcBorders>
+              <w:top w:val="single" w:sz="4" w:space="0" w:color="000000"/>
+              <w:left w:val="single" w:sz="4" w:space="0" w:color="000000"/>
+              <w:bottom w:val="single" w:sz="4" w:space="0" w:color="000000"/>
+              <w:right w:val="single" w:sz="4" w:space="0" w:color="000000"/>
+            </w:tcBorders>
+            <w:shd w:val="clear" w:color="auto" w:fill="D9D9D9" w:themeFill="background1" w:themeFillShade="D9"/>
+          </w:tcPr>
+          <w:p>
+            <w:pPr>
+              <w:spacing w:line="240" w:lineRule="auto"/>
+              <w:rPr>
+                <w:rFonts w:ascii="Calibri" w:eastAsia="Calibri" w:hAnsi="Calibri" w:cs="Calibri"/>
+                <w:sz w:val="18"/>
+                <w:szCs w:val="18"/>
+              </w:rPr>
+            </w:pPr>
+            <w:r>
+              <w:rPr>
+                <w:rFonts w:ascii="Calibri" w:eastAsia="Calibri" w:hAnsi="Calibri" w:cs="Calibri"/>
+                <w:sz w:val="18"/>
+                <w:szCs w:val="18"/>
+              </w:rPr>
+              <w:t xml:space="preserve">{% </w:t>
+            </w:r>
+            <w:proofErr w:type="spellStart"/>
+            <w:r>
+              <w:rPr>
+                <w:rFonts w:ascii="Calibri" w:eastAsia="Calibri" w:hAnsi="Calibri" w:cs="Calibri"/>
+                <w:sz w:val="18"/>
+                <w:szCs w:val="18"/>
+              </w:rPr>
+              <w:t>endfor</w:t>
+            </w:r>
+            <w:proofErr w:type="spellEnd"/>
+            <w:r>
+              <w:rPr>
+                <w:rFonts w:ascii="Calibri" w:eastAsia="Calibri" w:hAnsi="Calibri" w:cs="Calibri"/>
+                <w:sz w:val="18"/>
+                <w:szCs w:val="18"/>
+              </w:rPr>
+              <w:t xml:space="preserve"> %}</w:t>
+            </w:r>
+          </w:p>
+        </w:tc>
+      </w:tr>
+    </w:tbl>
+    <w:p/>
+    <w:p/>
+    <w:tbl>
+      <w:tblPr>
+        <w:tblW w:w="4815" w:type="dxa"/>
+        <w:tblInd w:w="125" w:type="dxa"/>
+        <w:tblBorders>
+          <w:top w:val="single" w:sz="4" w:space="0" w:color="E2EFD9"/>
+          <w:left w:val="single" w:sz="4" w:space="0" w:color="E2EFD9"/>
+          <w:bottom w:val="single" w:sz="4" w:space="0" w:color="E2EFD9"/>
+          <w:right w:val="single" w:sz="4" w:space="0" w:color="E2EFD9"/>
+          <w:insideH w:val="single" w:sz="4" w:space="0" w:color="E2EFD9"/>
+          <w:insideV w:val="single" w:sz="4" w:space="0" w:color="E2EFD9"/>
+        </w:tblBorders>
+        <w:tblLayout w:type="fixed"/>
+        <w:tblLook w:val="0400" w:firstRow="0" w:lastRow="0" w:firstColumn="0" w:lastColumn="0" w:noHBand="0" w:noVBand="1"/>
+      </w:tblPr>
+      <w:tblGrid>
+        <w:gridCol w:w="4815"/>
+      </w:tblGrid>
+      <w:tr>
+        <w:trPr>
+          <w:trHeight w:val="196"/>
+        </w:trPr>
+        <w:tc>
+          <w:tcPr>
+            <w:tcW w:w="4815" w:type="dxa"/>
+            <w:tcBorders>
+              <w:top w:val="single" w:sz="4" w:space="0" w:color="000000"/>
+              <w:left w:val="single" w:sz="4" w:space="0" w:color="000000"/>
+              <w:bottom w:val="single" w:sz="4" w:space="0" w:color="000000"/>
+              <w:right w:val="single" w:sz="4" w:space="0" w:color="000000"/>
+            </w:tcBorders>
+            <w:shd w:val="clear" w:color="auto" w:fill="D9E2F3"/>
+            <w:vAlign w:val="center"/>
+          </w:tcPr>
+          <w:p>
+            <w:pPr>
+              <w:widowControl w:val="0"/>
+              <w:pBdr>
+                <w:top w:val="nil"/>
+                <w:left w:val="nil"/>
+                <w:bottom w:val="nil"/>
+                <w:right w:val="nil"/>
+                <w:between w:val="nil"/>
+              </w:pBdr>
+              <w:ind w:left="-850"/>
+              <w:jc w:val="center"/>
+              <w:rPr>
+                <w:rFonts w:ascii="Calibri" w:eastAsia="Calibri" w:hAnsi="Calibri" w:cs="Calibri"/>
+                <w:b/>
+                <w:bCs/>
+                <w:sz w:val="26"/>
+                <w:szCs w:val="26"/>
+                <w:u w:val="single"/>
+              </w:rPr>
+            </w:pPr>
+            <w:r>
+              <w:rPr>
+                <w:rFonts w:ascii="Calibri" w:eastAsia="Calibri" w:hAnsi="Calibri" w:cs="Calibri"/>
+                <w:sz w:val="18"/>
+                <w:szCs w:val="18"/>
+              </w:rPr>
+              <w:tab/>
+            </w:r>
+            <w:r>
+              <w:rPr>
+                <w:rFonts w:ascii="Calibri" w:eastAsia="Calibri" w:hAnsi="Calibri" w:cs="Calibri"/>
+                <w:sz w:val="18"/>
+                <w:szCs w:val="18"/>
+              </w:rPr>
+              <w:tab/>
+              <w:t>Microrganismos não encontrados</w:t>
+            </w:r>
+          </w:p>
+        </w:tc>
+      </w:tr>
+      <w:tr>
+        <w:trPr>
+          <w:trHeight w:val="196"/>
+        </w:trPr>
+        <w:tc>
+          <w:tcPr>
+            <w:tcW w:w="4815" w:type="dxa"/>
+            <w:tcBorders>
+              <w:top w:val="single" w:sz="4" w:space="0" w:color="000000"/>
+              <w:left w:val="single" w:sz="4" w:space="0" w:color="000000"/>
+              <w:bottom w:val="single" w:sz="4" w:space="0" w:color="000000"/>
+              <w:right w:val="single" w:sz="4" w:space="0" w:color="000000"/>
+            </w:tcBorders>
+            <w:shd w:val="clear" w:color="auto" w:fill="D9E2F3"/>
+            <w:vAlign w:val="center"/>
+          </w:tcPr>
+          <w:p>
+            <w:pPr>
+              <w:widowControl w:val="0"/>
+              <w:pBdr>
+                <w:top w:val="nil"/>
+                <w:left w:val="nil"/>
+                <w:bottom w:val="nil"/>
+                <w:right w:val="nil"/>
+                <w:between w:val="nil"/>
+              </w:pBdr>
+              <w:shd w:val="clear" w:color="auto" w:fill="D9D9D9" w:themeFill="background1" w:themeFillShade="D9"/>
+              <w:ind w:left="-850"/>
+              <w:jc w:val="center"/>
+              <w:rPr>
+                <w:rFonts w:ascii="Calibri" w:eastAsia="Calibri" w:hAnsi="Calibri" w:cs="Calibri"/>
+                <w:sz w:val="18"/>
+                <w:szCs w:val="18"/>
+                <w:lang w:val="en-US"/>
+              </w:rPr>
+            </w:pPr>
+            <w:r>
+              <w:rPr>
+                <w:rFonts w:ascii="Calibri" w:eastAsia="Calibri" w:hAnsi="Calibri" w:cs="Calibri"/>
+                <w:sz w:val="18"/>
+                <w:szCs w:val="18"/>
+                <w:lang w:val="en-US"/>
+              </w:rPr>
+              <w:t xml:space="preserve">{% for </w:t>
+            </w:r>
+            <w:proofErr w:type="spellStart"/>
+            <w:r>
+              <w:rPr>
+                <w:rFonts w:ascii="Calibri" w:eastAsia="Calibri" w:hAnsi="Calibri" w:cs="Calibri"/>
+                <w:sz w:val="18"/>
+                <w:szCs w:val="18"/>
+                <w:lang w:val="en-US"/>
+              </w:rPr>
+              <w:t>i</w:t>
+            </w:r>
+            <w:proofErr w:type="spellEnd"/>
+            <w:r>
+              <w:rPr>
+                <w:rFonts w:ascii="Calibri" w:eastAsia="Calibri" w:hAnsi="Calibri" w:cs="Calibri"/>
+                <w:sz w:val="18"/>
+                <w:szCs w:val="18"/>
+                <w:lang w:val="en-US"/>
+              </w:rPr>
+              <w:t xml:space="preserve"> in </w:t>
+            </w:r>
+            <w:proofErr w:type="spellStart"/>
+            <w:r>
+              <w:rPr>
+                <w:rFonts w:ascii="Calibri" w:eastAsia="Calibri" w:hAnsi="Calibri" w:cs="Calibri"/>
+                <w:sz w:val="18"/>
+                <w:szCs w:val="18"/>
+                <w:lang w:val="en-US"/>
+              </w:rPr>
+              <w:t>microorganisms_not_founded</w:t>
+            </w:r>
+            <w:proofErr w:type="spellEnd"/>
+          </w:p>
+          <w:p>
+            <w:pPr>
+              <w:widowControl w:val="0"/>
+              <w:pBdr>
+                <w:top w:val="nil"/>
+                <w:left w:val="nil"/>
+                <w:bottom w:val="nil"/>
+                <w:right w:val="nil"/>
+                <w:between w:val="nil"/>
+              </w:pBdr>
+              <w:shd w:val="clear" w:color="auto" w:fill="D9D9D9" w:themeFill="background1" w:themeFillShade="D9"/>
+              <w:ind w:left="-850"/>
+              <w:jc w:val="center"/>
+              <w:rPr>
+                <w:rFonts w:ascii="Calibri" w:eastAsia="Calibri" w:hAnsi="Calibri" w:cs="Calibri"/>
+                <w:sz w:val="18"/>
+                <w:szCs w:val="18"/>
+                <w:lang w:val="en-US"/>
+              </w:rPr>
+            </w:pPr>
+            <w:r>
+              <w:rPr>
+                <w:rFonts w:ascii="Calibri" w:eastAsia="Calibri" w:hAnsi="Calibri" w:cs="Calibri"/>
+                <w:sz w:val="18"/>
+                <w:szCs w:val="18"/>
+                <w:lang w:val="en-US"/>
+              </w:rPr>
+              <w:t>%}</w:t>
+            </w:r>
+          </w:p>
+        </w:tc>
+      </w:tr>
+      <w:tr>
+        <w:trPr>
+          <w:trHeight w:val="224"/>
+        </w:trPr>
+        <w:tc>
+          <w:tcPr>
+            <w:tcW w:w="4815" w:type="dxa"/>
+            <w:tcBorders>
+              <w:top w:val="single" w:sz="4" w:space="0" w:color="000000"/>
+              <w:left w:val="single" w:sz="4" w:space="0" w:color="000000"/>
+              <w:bottom w:val="single" w:sz="4" w:space="0" w:color="000000"/>
+              <w:right w:val="single" w:sz="4" w:space="0" w:color="000000"/>
+            </w:tcBorders>
+            <w:shd w:val="clear" w:color="auto" w:fill="D9D9D9" w:themeFill="background1" w:themeFillShade="D9"/>
+          </w:tcPr>
+          <w:p>
+            <w:pPr>
+              <w:keepLines/>
+              <w:spacing w:line="240" w:lineRule="auto"/>
+              <w:rPr>
+                <w:rFonts w:ascii="Calibri" w:eastAsia="Calibri" w:hAnsi="Calibri" w:cs="Calibri"/>
+                <w:sz w:val="18"/>
+                <w:szCs w:val="18"/>
+              </w:rPr>
+            </w:pPr>
+            <w:r>
+              <w:rPr>
+                <w:rFonts w:ascii="Calibri" w:eastAsia="Calibri" w:hAnsi="Calibri" w:cs="Calibri"/>
+                <w:sz w:val="18"/>
+                <w:szCs w:val="18"/>
+              </w:rPr>
+              <w:t>{{i}}</w:t>
+            </w:r>
+          </w:p>
+        </w:tc>
+      </w:tr>
+      <w:tr>
+        <w:trPr>
+          <w:trHeight w:val="180"/>
+        </w:trPr>
+        <w:tc>
+          <w:tcPr>
+            <w:tcW w:w="4815" w:type="dxa"/>
+            <w:tcBorders>
+              <w:top w:val="single" w:sz="4" w:space="0" w:color="000000"/>
+              <w:left w:val="single" w:sz="4" w:space="0" w:color="000000"/>
+              <w:bottom w:val="single" w:sz="4" w:space="0" w:color="000000"/>
+              <w:right w:val="single" w:sz="4" w:space="0" w:color="000000"/>
+            </w:tcBorders>
+            <w:shd w:val="clear" w:color="auto" w:fill="D9D9D9" w:themeFill="background1" w:themeFillShade="D9"/>
           </w:tcPr>
           <w:p>
             <w:pPr>

</xml_diff>

<commit_message>
feat: new protocol template
</commit_message>
<xml_diff>
--- a/src/assets/protocol/template_protocolo_microrganismos.docx
+++ b/src/assets/protocol/template_protocolo_microrganismos.docx
@@ -4012,174 +4012,367 @@
     </w:tbl>
     <w:p/>
     <w:p/>
+    <w:p/>
+    <w:p/>
+    <w:tbl>
+      <w:tblPr>
+        <w:tblStyle w:val="SimplesTabela1"/>
+        <w:tblW w:w="0" w:type="auto"/>
+        <w:tblLook w:val="04A0" w:firstRow="1" w:lastRow="0" w:firstColumn="1" w:lastColumn="0" w:noHBand="0" w:noVBand="1"/>
+      </w:tblPr>
+      <w:tblGrid>
+        <w:gridCol w:w="4895"/>
+      </w:tblGrid>
+      <w:tr>
+        <w:trPr>
+          <w:cnfStyle w:val="100000000000" w:firstRow="1" w:lastRow="0" w:firstColumn="0" w:lastColumn="0" w:oddVBand="0" w:evenVBand="0" w:oddHBand="0" w:evenHBand="0" w:firstRowFirstColumn="0" w:firstRowLastColumn="0" w:lastRowFirstColumn="0" w:lastRowLastColumn="0"/>
+          <w:trHeight w:val="328"/>
+          <w:tblHeader/>
+        </w:trPr>
+        <w:tc>
+          <w:tcPr>
+            <w:cnfStyle w:val="001000000000" w:firstRow="0" w:lastRow="0" w:firstColumn="1" w:lastColumn="0" w:oddVBand="0" w:evenVBand="0" w:oddHBand="0" w:evenHBand="0" w:firstRowFirstColumn="0" w:firstRowLastColumn="0" w:lastRowFirstColumn="0" w:lastRowLastColumn="0"/>
+            <w:tcW w:w="4895" w:type="dxa"/>
+            <w:shd w:val="clear" w:color="auto" w:fill="A5C9EB" w:themeFill="text2" w:themeFillTint="40"/>
+          </w:tcPr>
+          <w:p>
+            <w:pPr>
+              <w:jc w:val="center"/>
+              <w:rPr>
+                <w:rFonts w:ascii="Calibri" w:hAnsi="Calibri" w:cs="Calibri"/>
+                <w:b w:val="0"/>
+                <w:bCs w:val="0"/>
+              </w:rPr>
+            </w:pPr>
+            <w:r>
+              <w:rPr>
+                <w:rFonts w:ascii="Calibri" w:hAnsi="Calibri" w:cs="Calibri"/>
+              </w:rPr>
+              <w:lastRenderedPageBreak/>
+              <w:t>PROTOCOLO MICRORGANISMOS</w:t>
+            </w:r>
+          </w:p>
+        </w:tc>
+      </w:tr>
+      <w:tr>
+        <w:trPr>
+          <w:cnfStyle w:val="000000100000" w:firstRow="0" w:lastRow="0" w:firstColumn="0" w:lastColumn="0" w:oddVBand="0" w:evenVBand="0" w:oddHBand="1" w:evenHBand="0" w:firstRowFirstColumn="0" w:firstRowLastColumn="0" w:lastRowFirstColumn="0" w:lastRowLastColumn="0"/>
+          <w:trHeight w:val="328"/>
+        </w:trPr>
+        <w:tc>
+          <w:tcPr>
+            <w:cnfStyle w:val="001000000000" w:firstRow="0" w:lastRow="0" w:firstColumn="1" w:lastColumn="0" w:oddVBand="0" w:evenVBand="0" w:oddHBand="0" w:evenHBand="0" w:firstRowFirstColumn="0" w:firstRowLastColumn="0" w:lastRowFirstColumn="0" w:lastRowLastColumn="0"/>
+            <w:tcW w:w="4895" w:type="dxa"/>
+          </w:tcPr>
+          <w:p>
+            <w:pPr>
+              <w:rPr>
+                <w:rFonts w:ascii="Calibri" w:hAnsi="Calibri" w:cs="Calibri"/>
+                <w:sz w:val="18"/>
+                <w:szCs w:val="18"/>
+                <w:lang w:val="en-US"/>
+              </w:rPr>
+            </w:pPr>
+            <w:r>
+              <w:rPr>
+                <w:rFonts w:ascii="Calibri" w:hAnsi="Calibri" w:cs="Calibri"/>
+                <w:sz w:val="18"/>
+                <w:szCs w:val="18"/>
+                <w:lang w:val="en-US"/>
+              </w:rPr>
+              <w:t>{%</w:t>
+            </w:r>
+            <w:r>
+              <w:rPr>
+                <w:rFonts w:ascii="Calibri" w:hAnsi="Calibri" w:cs="Calibri"/>
+                <w:sz w:val="18"/>
+                <w:szCs w:val="18"/>
+                <w:lang w:val="en-US"/>
+              </w:rPr>
+              <w:t>tr</w:t>
+            </w:r>
+            <w:r>
+              <w:rPr>
+                <w:rFonts w:ascii="Calibri" w:hAnsi="Calibri" w:cs="Calibri"/>
+                <w:sz w:val="18"/>
+                <w:szCs w:val="18"/>
+                <w:lang w:val="en-US"/>
+              </w:rPr>
+              <w:t xml:space="preserve"> for </w:t>
+            </w:r>
+            <w:proofErr w:type="spellStart"/>
+            <w:r>
+              <w:rPr>
+                <w:rFonts w:ascii="Calibri" w:hAnsi="Calibri" w:cs="Calibri"/>
+                <w:sz w:val="18"/>
+                <w:szCs w:val="18"/>
+                <w:lang w:val="en-US"/>
+              </w:rPr>
+              <w:t>i</w:t>
+            </w:r>
+            <w:proofErr w:type="spellEnd"/>
+            <w:r>
+              <w:rPr>
+                <w:rFonts w:ascii="Calibri" w:hAnsi="Calibri" w:cs="Calibri"/>
+                <w:sz w:val="18"/>
+                <w:szCs w:val="18"/>
+                <w:lang w:val="en-US"/>
+              </w:rPr>
+              <w:t xml:space="preserve"> in </w:t>
+            </w:r>
+            <w:proofErr w:type="spellStart"/>
+            <w:r>
+              <w:rPr>
+                <w:rFonts w:ascii="Calibri" w:eastAsia="Calibri" w:hAnsi="Calibri" w:cs="Calibri"/>
+                <w:sz w:val="18"/>
+                <w:szCs w:val="18"/>
+                <w:lang w:val="en-US"/>
+              </w:rPr>
+              <w:t>microorganisms_protocol</w:t>
+            </w:r>
+            <w:proofErr w:type="spellEnd"/>
+            <w:r>
+              <w:rPr>
+                <w:rFonts w:ascii="Calibri" w:hAnsi="Calibri" w:cs="Calibri"/>
+                <w:sz w:val="18"/>
+                <w:szCs w:val="18"/>
+                <w:lang w:val="en-US"/>
+              </w:rPr>
+              <w:t xml:space="preserve"> %}</w:t>
+            </w:r>
+          </w:p>
+        </w:tc>
+      </w:tr>
+      <w:tr>
+        <w:trPr>
+          <w:trHeight w:val="328"/>
+        </w:trPr>
+        <w:tc>
+          <w:tcPr>
+            <w:cnfStyle w:val="001000000000" w:firstRow="0" w:lastRow="0" w:firstColumn="1" w:lastColumn="0" w:oddVBand="0" w:evenVBand="0" w:oddHBand="0" w:evenHBand="0" w:firstRowFirstColumn="0" w:firstRowLastColumn="0" w:lastRowFirstColumn="0" w:lastRowLastColumn="0"/>
+            <w:tcW w:w="4895" w:type="dxa"/>
+          </w:tcPr>
+          <w:p>
+            <w:pPr>
+              <w:rPr>
+                <w:rFonts w:ascii="Calibri" w:hAnsi="Calibri" w:cs="Calibri"/>
+                <w:b w:val="0"/>
+                <w:bCs w:val="0"/>
+                <w:sz w:val="18"/>
+                <w:szCs w:val="18"/>
+                <w:lang w:val="en-US"/>
+              </w:rPr>
+            </w:pPr>
+            <w:r>
+              <w:rPr>
+                <w:rFonts w:ascii="Calibri" w:hAnsi="Calibri" w:cs="Calibri"/>
+                <w:b w:val="0"/>
+                <w:bCs w:val="0"/>
+                <w:sz w:val="18"/>
+                <w:szCs w:val="18"/>
+                <w:lang w:val="en-US"/>
+              </w:rPr>
+              <w:t>{{</w:t>
+            </w:r>
+            <w:proofErr w:type="spellStart"/>
+            <w:r>
+              <w:rPr>
+                <w:rFonts w:ascii="Calibri" w:hAnsi="Calibri" w:cs="Calibri"/>
+                <w:b w:val="0"/>
+                <w:bCs w:val="0"/>
+                <w:sz w:val="18"/>
+                <w:szCs w:val="18"/>
+                <w:lang w:val="en-US"/>
+              </w:rPr>
+              <w:t>i</w:t>
+            </w:r>
+            <w:proofErr w:type="spellEnd"/>
+            <w:r>
+              <w:rPr>
+                <w:rFonts w:ascii="Calibri" w:hAnsi="Calibri" w:cs="Calibri"/>
+                <w:b w:val="0"/>
+                <w:bCs w:val="0"/>
+                <w:sz w:val="18"/>
+                <w:szCs w:val="18"/>
+                <w:lang w:val="en-US"/>
+              </w:rPr>
+              <w:t>}}</w:t>
+            </w:r>
+          </w:p>
+        </w:tc>
+      </w:tr>
+      <w:tr>
+        <w:trPr>
+          <w:cnfStyle w:val="000000100000" w:firstRow="0" w:lastRow="0" w:firstColumn="0" w:lastColumn="0" w:oddVBand="0" w:evenVBand="0" w:oddHBand="1" w:evenHBand="0" w:firstRowFirstColumn="0" w:firstRowLastColumn="0" w:lastRowFirstColumn="0" w:lastRowLastColumn="0"/>
+          <w:trHeight w:val="328"/>
+        </w:trPr>
+        <w:tc>
+          <w:tcPr>
+            <w:cnfStyle w:val="001000000000" w:firstRow="0" w:lastRow="0" w:firstColumn="1" w:lastColumn="0" w:oddVBand="0" w:evenVBand="0" w:oddHBand="0" w:evenHBand="0" w:firstRowFirstColumn="0" w:firstRowLastColumn="0" w:lastRowFirstColumn="0" w:lastRowLastColumn="0"/>
+            <w:tcW w:w="4895" w:type="dxa"/>
+          </w:tcPr>
+          <w:p>
+            <w:pPr>
+              <w:rPr>
+                <w:rFonts w:ascii="Calibri" w:hAnsi="Calibri" w:cs="Calibri"/>
+                <w:sz w:val="18"/>
+                <w:szCs w:val="18"/>
+                <w:lang w:val="en-US"/>
+              </w:rPr>
+            </w:pPr>
+            <w:r>
+              <w:rPr>
+                <w:rFonts w:ascii="Calibri" w:hAnsi="Calibri" w:cs="Calibri"/>
+                <w:sz w:val="18"/>
+                <w:szCs w:val="18"/>
+                <w:lang w:val="en-US"/>
+              </w:rPr>
+              <w:t>{%</w:t>
+            </w:r>
+            <w:r>
+              <w:rPr>
+                <w:rFonts w:ascii="Calibri" w:hAnsi="Calibri" w:cs="Calibri"/>
+                <w:sz w:val="18"/>
+                <w:szCs w:val="18"/>
+                <w:lang w:val="en-US"/>
+              </w:rPr>
+              <w:t>tr</w:t>
+            </w:r>
+            <w:r>
+              <w:rPr>
+                <w:rFonts w:ascii="Calibri" w:hAnsi="Calibri" w:cs="Calibri"/>
+                <w:sz w:val="18"/>
+                <w:szCs w:val="18"/>
+                <w:lang w:val="en-US"/>
+              </w:rPr>
+              <w:t xml:space="preserve"> </w:t>
+            </w:r>
+            <w:proofErr w:type="spellStart"/>
+            <w:r>
+              <w:rPr>
+                <w:rFonts w:ascii="Calibri" w:hAnsi="Calibri" w:cs="Calibri"/>
+                <w:sz w:val="18"/>
+                <w:szCs w:val="18"/>
+                <w:lang w:val="en-US"/>
+              </w:rPr>
+              <w:t>endfor</w:t>
+            </w:r>
+            <w:proofErr w:type="spellEnd"/>
+            <w:r>
+              <w:rPr>
+                <w:rFonts w:ascii="Calibri" w:hAnsi="Calibri" w:cs="Calibri"/>
+                <w:sz w:val="18"/>
+                <w:szCs w:val="18"/>
+                <w:lang w:val="en-US"/>
+              </w:rPr>
+              <w:t xml:space="preserve"> %}</w:t>
+            </w:r>
+          </w:p>
+        </w:tc>
+      </w:tr>
+    </w:tbl>
     <w:p>
       <w:pPr>
         <w:rPr>
-          <w:u w:val="single"/>
+          <w:lang w:val="en-US"/>
         </w:rPr>
       </w:pPr>
     </w:p>
     <w:tbl>
       <w:tblPr>
-        <w:tblW w:w="4815" w:type="dxa"/>
-        <w:tblInd w:w="125" w:type="dxa"/>
-        <w:tblBorders>
-          <w:top w:val="single" w:sz="4" w:space="0" w:color="E2EFD9"/>
-          <w:left w:val="single" w:sz="4" w:space="0" w:color="E2EFD9"/>
-          <w:bottom w:val="single" w:sz="4" w:space="0" w:color="E2EFD9"/>
-          <w:right w:val="single" w:sz="4" w:space="0" w:color="E2EFD9"/>
-          <w:insideH w:val="single" w:sz="4" w:space="0" w:color="E2EFD9"/>
-          <w:insideV w:val="single" w:sz="4" w:space="0" w:color="E2EFD9"/>
-        </w:tblBorders>
-        <w:tblLayout w:type="fixed"/>
-        <w:tblLook w:val="0400" w:firstRow="0" w:lastRow="0" w:firstColumn="0" w:lastColumn="0" w:noHBand="0" w:noVBand="1"/>
+        <w:tblStyle w:val="SimplesTabela1"/>
+        <w:tblW w:w="0" w:type="auto"/>
+        <w:tblLook w:val="04A0" w:firstRow="1" w:lastRow="0" w:firstColumn="1" w:lastColumn="0" w:noHBand="0" w:noVBand="1"/>
       </w:tblPr>
       <w:tblGrid>
-        <w:gridCol w:w="4815"/>
+        <w:gridCol w:w="4895"/>
       </w:tblGrid>
       <w:tr>
         <w:trPr>
-          <w:trHeight w:val="196"/>
+          <w:cnfStyle w:val="100000000000" w:firstRow="1" w:lastRow="0" w:firstColumn="0" w:lastColumn="0" w:oddVBand="0" w:evenVBand="0" w:oddHBand="0" w:evenHBand="0" w:firstRowFirstColumn="0" w:firstRowLastColumn="0" w:lastRowFirstColumn="0" w:lastRowLastColumn="0"/>
+          <w:trHeight w:val="328"/>
+          <w:tblHeader/>
         </w:trPr>
         <w:tc>
           <w:tcPr>
-            <w:tcW w:w="4815" w:type="dxa"/>
-            <w:tcBorders>
-              <w:top w:val="single" w:sz="4" w:space="0" w:color="000000"/>
-              <w:left w:val="single" w:sz="4" w:space="0" w:color="000000"/>
-              <w:bottom w:val="single" w:sz="4" w:space="0" w:color="000000"/>
-              <w:right w:val="single" w:sz="4" w:space="0" w:color="000000"/>
-            </w:tcBorders>
-            <w:shd w:val="clear" w:color="auto" w:fill="D9E2F3"/>
-            <w:vAlign w:val="center"/>
+            <w:cnfStyle w:val="001000000000" w:firstRow="0" w:lastRow="0" w:firstColumn="1" w:lastColumn="0" w:oddVBand="0" w:evenVBand="0" w:oddHBand="0" w:evenHBand="0" w:firstRowFirstColumn="0" w:firstRowLastColumn="0" w:lastRowFirstColumn="0" w:lastRowLastColumn="0"/>
+            <w:tcW w:w="4895" w:type="dxa"/>
+            <w:shd w:val="clear" w:color="auto" w:fill="A5C9EB" w:themeFill="text2" w:themeFillTint="40"/>
           </w:tcPr>
           <w:p>
             <w:pPr>
-              <w:widowControl w:val="0"/>
-              <w:pBdr>
-                <w:top w:val="nil"/>
-                <w:left w:val="nil"/>
-                <w:bottom w:val="nil"/>
-                <w:right w:val="nil"/>
-                <w:between w:val="nil"/>
-              </w:pBdr>
-              <w:ind w:left="-850"/>
               <w:jc w:val="center"/>
               <w:rPr>
-                <w:rFonts w:ascii="Calibri" w:eastAsia="Calibri" w:hAnsi="Calibri" w:cs="Calibri"/>
-                <w:b/>
-                <w:bCs/>
-                <w:sz w:val="26"/>
-                <w:szCs w:val="26"/>
-              </w:rPr>
-            </w:pPr>
-            <w:r>
-              <w:rPr>
-                <w:rFonts w:ascii="Calibri" w:eastAsia="Calibri" w:hAnsi="Calibri" w:cs="Calibri"/>
-                <w:sz w:val="18"/>
-                <w:szCs w:val="18"/>
-              </w:rPr>
-              <w:lastRenderedPageBreak/>
-              <w:tab/>
-            </w:r>
-            <w:r>
-              <w:rPr>
-                <w:rFonts w:ascii="Calibri" w:eastAsia="Calibri" w:hAnsi="Calibri" w:cs="Calibri"/>
-                <w:sz w:val="18"/>
-                <w:szCs w:val="18"/>
-              </w:rPr>
-              <w:tab/>
-            </w:r>
-            <w:r>
-              <w:rPr>
-                <w:rFonts w:ascii="Calibri" w:eastAsia="Calibri" w:hAnsi="Calibri" w:cs="Calibri"/>
-                <w:sz w:val="18"/>
-                <w:szCs w:val="18"/>
-              </w:rPr>
-              <w:t xml:space="preserve">                   </w:t>
-            </w:r>
-            <w:r>
-              <w:rPr>
-                <w:rFonts w:ascii="Calibri" w:eastAsia="Calibri" w:hAnsi="Calibri" w:cs="Calibri"/>
-                <w:b/>
-                <w:bCs/>
-                <w:sz w:val="24"/>
-                <w:szCs w:val="24"/>
-              </w:rPr>
-              <w:t>PROTOCOLO</w:t>
-            </w:r>
-            <w:r>
-              <w:rPr>
-                <w:rFonts w:ascii="Calibri" w:eastAsia="Calibri" w:hAnsi="Calibri" w:cs="Calibri"/>
-                <w:b/>
-                <w:bCs/>
-                <w:sz w:val="24"/>
-                <w:szCs w:val="24"/>
-              </w:rPr>
-              <w:t xml:space="preserve"> METAIS</w:t>
-            </w:r>
-            <w:r>
-              <w:rPr>
-                <w:rFonts w:ascii="Calibri" w:eastAsia="Calibri" w:hAnsi="Calibri" w:cs="Calibri"/>
-                <w:b/>
-                <w:bCs/>
-                <w:sz w:val="24"/>
-                <w:szCs w:val="24"/>
-              </w:rPr>
-              <w:t xml:space="preserve"> </w:t>
+                <w:rFonts w:ascii="Calibri" w:hAnsi="Calibri" w:cs="Calibri"/>
+                <w:b w:val="0"/>
+                <w:bCs w:val="0"/>
+              </w:rPr>
+            </w:pPr>
+            <w:r>
+              <w:rPr>
+                <w:rFonts w:ascii="Calibri" w:hAnsi="Calibri" w:cs="Calibri"/>
+              </w:rPr>
+              <w:t xml:space="preserve">PROTOCOLO </w:t>
+            </w:r>
+            <w:r>
+              <w:rPr>
+                <w:rFonts w:ascii="Calibri" w:hAnsi="Calibri" w:cs="Calibri"/>
+              </w:rPr>
+              <w:t>METAIS</w:t>
             </w:r>
           </w:p>
         </w:tc>
       </w:tr>
       <w:tr>
         <w:trPr>
-          <w:trHeight w:val="196"/>
+          <w:cnfStyle w:val="000000100000" w:firstRow="0" w:lastRow="0" w:firstColumn="0" w:lastColumn="0" w:oddVBand="0" w:evenVBand="0" w:oddHBand="1" w:evenHBand="0" w:firstRowFirstColumn="0" w:firstRowLastColumn="0" w:lastRowFirstColumn="0" w:lastRowLastColumn="0"/>
+          <w:trHeight w:val="328"/>
         </w:trPr>
         <w:tc>
           <w:tcPr>
-            <w:tcW w:w="4815" w:type="dxa"/>
-            <w:tcBorders>
-              <w:top w:val="single" w:sz="4" w:space="0" w:color="000000"/>
-              <w:left w:val="single" w:sz="4" w:space="0" w:color="000000"/>
-              <w:bottom w:val="single" w:sz="4" w:space="0" w:color="000000"/>
-              <w:right w:val="single" w:sz="4" w:space="0" w:color="000000"/>
-            </w:tcBorders>
-            <w:shd w:val="clear" w:color="auto" w:fill="D9E2F3"/>
-            <w:vAlign w:val="center"/>
+            <w:cnfStyle w:val="001000000000" w:firstRow="0" w:lastRow="0" w:firstColumn="1" w:lastColumn="0" w:oddVBand="0" w:evenVBand="0" w:oddHBand="0" w:evenHBand="0" w:firstRowFirstColumn="0" w:firstRowLastColumn="0" w:lastRowFirstColumn="0" w:lastRowLastColumn="0"/>
+            <w:tcW w:w="4895" w:type="dxa"/>
           </w:tcPr>
           <w:p>
             <w:pPr>
-              <w:widowControl w:val="0"/>
-              <w:pBdr>
-                <w:top w:val="nil"/>
-                <w:left w:val="nil"/>
-                <w:bottom w:val="nil"/>
-                <w:right w:val="nil"/>
-                <w:between w:val="nil"/>
-              </w:pBdr>
-              <w:shd w:val="clear" w:color="auto" w:fill="D9D9D9" w:themeFill="background1" w:themeFillShade="D9"/>
-              <w:ind w:left="-850"/>
-              <w:jc w:val="center"/>
-              <w:rPr>
-                <w:rFonts w:ascii="Calibri" w:eastAsia="Calibri" w:hAnsi="Calibri" w:cs="Calibri"/>
-                <w:sz w:val="18"/>
-                <w:szCs w:val="18"/>
-                <w:lang w:val="en-US"/>
-              </w:rPr>
-            </w:pPr>
-            <w:r>
-              <w:rPr>
-                <w:rFonts w:ascii="Calibri" w:eastAsia="Calibri" w:hAnsi="Calibri" w:cs="Calibri"/>
-                <w:sz w:val="18"/>
-                <w:szCs w:val="18"/>
-                <w:lang w:val="en-US"/>
-              </w:rPr>
-              <w:t xml:space="preserve">{% for </w:t>
+              <w:rPr>
+                <w:rFonts w:ascii="Calibri" w:hAnsi="Calibri" w:cs="Calibri"/>
+                <w:sz w:val="18"/>
+                <w:szCs w:val="18"/>
+                <w:lang w:val="en-US"/>
+              </w:rPr>
+            </w:pPr>
+            <w:r>
+              <w:rPr>
+                <w:rFonts w:ascii="Calibri" w:hAnsi="Calibri" w:cs="Calibri"/>
+                <w:sz w:val="18"/>
+                <w:szCs w:val="18"/>
+                <w:lang w:val="en-US"/>
+              </w:rPr>
+              <w:t>{%</w:t>
+            </w:r>
+            <w:r>
+              <w:rPr>
+                <w:rFonts w:ascii="Calibri" w:hAnsi="Calibri" w:cs="Calibri"/>
+                <w:sz w:val="18"/>
+                <w:szCs w:val="18"/>
+                <w:lang w:val="en-US"/>
+              </w:rPr>
+              <w:t>tr</w:t>
+            </w:r>
+            <w:r>
+              <w:rPr>
+                <w:rFonts w:ascii="Calibri" w:hAnsi="Calibri" w:cs="Calibri"/>
+                <w:sz w:val="18"/>
+                <w:szCs w:val="18"/>
+                <w:lang w:val="en-US"/>
+              </w:rPr>
+              <w:t xml:space="preserve"> for </w:t>
             </w:r>
             <w:proofErr w:type="spellStart"/>
             <w:r>
               <w:rPr>
-                <w:rFonts w:ascii="Calibri" w:eastAsia="Calibri" w:hAnsi="Calibri" w:cs="Calibri"/>
+                <w:rFonts w:ascii="Calibri" w:hAnsi="Calibri" w:cs="Calibri"/>
                 <w:sz w:val="18"/>
                 <w:szCs w:val="18"/>
                 <w:lang w:val="en-US"/>
@@ -4189,7 +4382,7 @@
             <w:proofErr w:type="spellEnd"/>
             <w:r>
               <w:rPr>
-                <w:rFonts w:ascii="Calibri" w:eastAsia="Calibri" w:hAnsi="Calibri" w:cs="Calibri"/>
+                <w:rFonts w:ascii="Calibri" w:hAnsi="Calibri" w:cs="Calibri"/>
                 <w:sz w:val="18"/>
                 <w:szCs w:val="18"/>
                 <w:lang w:val="en-US"/>
@@ -4204,12 +4397,30 @@
                 <w:szCs w:val="18"/>
                 <w:lang w:val="en-US"/>
               </w:rPr>
-              <w:t>metals_protocol</w:t>
+              <w:t>m</w:t>
+            </w:r>
+            <w:r>
+              <w:rPr>
+                <w:rFonts w:ascii="Calibri" w:eastAsia="Calibri" w:hAnsi="Calibri" w:cs="Calibri"/>
+                <w:sz w:val="18"/>
+                <w:szCs w:val="18"/>
+                <w:lang w:val="en-US"/>
+              </w:rPr>
+              <w:t>etals</w:t>
+            </w:r>
+            <w:r>
+              <w:rPr>
+                <w:rFonts w:ascii="Calibri" w:eastAsia="Calibri" w:hAnsi="Calibri" w:cs="Calibri"/>
+                <w:sz w:val="18"/>
+                <w:szCs w:val="18"/>
+                <w:lang w:val="en-US"/>
+              </w:rPr>
+              <w:t>_protocol</w:t>
             </w:r>
             <w:proofErr w:type="spellEnd"/>
             <w:r>
               <w:rPr>
-                <w:rFonts w:ascii="Calibri" w:eastAsia="Calibri" w:hAnsi="Calibri" w:cs="Calibri"/>
+                <w:rFonts w:ascii="Calibri" w:hAnsi="Calibri" w:cs="Calibri"/>
                 <w:sz w:val="18"/>
                 <w:szCs w:val="18"/>
                 <w:lang w:val="en-US"/>
@@ -4221,87 +4432,125 @@
       </w:tr>
       <w:tr>
         <w:trPr>
-          <w:trHeight w:val="224"/>
+          <w:trHeight w:val="328"/>
         </w:trPr>
         <w:tc>
           <w:tcPr>
-            <w:tcW w:w="4815" w:type="dxa"/>
-            <w:tcBorders>
-              <w:top w:val="single" w:sz="4" w:space="0" w:color="000000"/>
-              <w:left w:val="single" w:sz="4" w:space="0" w:color="000000"/>
-              <w:bottom w:val="single" w:sz="4" w:space="0" w:color="000000"/>
-              <w:right w:val="single" w:sz="4" w:space="0" w:color="000000"/>
-            </w:tcBorders>
-            <w:shd w:val="clear" w:color="auto" w:fill="D9D9D9" w:themeFill="background1" w:themeFillShade="D9"/>
+            <w:cnfStyle w:val="001000000000" w:firstRow="0" w:lastRow="0" w:firstColumn="1" w:lastColumn="0" w:oddVBand="0" w:evenVBand="0" w:oddHBand="0" w:evenHBand="0" w:firstRowFirstColumn="0" w:firstRowLastColumn="0" w:lastRowFirstColumn="0" w:lastRowLastColumn="0"/>
+            <w:tcW w:w="4895" w:type="dxa"/>
           </w:tcPr>
           <w:p>
             <w:pPr>
-              <w:keepLines/>
-              <w:spacing w:line="240" w:lineRule="auto"/>
-              <w:rPr>
-                <w:rFonts w:ascii="Calibri" w:eastAsia="Calibri" w:hAnsi="Calibri" w:cs="Calibri"/>
-                <w:sz w:val="18"/>
-                <w:szCs w:val="18"/>
-              </w:rPr>
-            </w:pPr>
-            <w:r>
-              <w:rPr>
-                <w:rFonts w:ascii="Calibri" w:eastAsia="Calibri" w:hAnsi="Calibri" w:cs="Calibri"/>
-                <w:sz w:val="18"/>
-                <w:szCs w:val="18"/>
-              </w:rPr>
-              <w:t>{{i}}</w:t>
+              <w:rPr>
+                <w:rFonts w:ascii="Calibri" w:hAnsi="Calibri" w:cs="Calibri"/>
+                <w:b w:val="0"/>
+                <w:bCs w:val="0"/>
+                <w:sz w:val="18"/>
+                <w:szCs w:val="18"/>
+                <w:lang w:val="en-US"/>
+              </w:rPr>
+            </w:pPr>
+            <w:r>
+              <w:rPr>
+                <w:rFonts w:ascii="Calibri" w:hAnsi="Calibri" w:cs="Calibri"/>
+                <w:b w:val="0"/>
+                <w:bCs w:val="0"/>
+                <w:sz w:val="18"/>
+                <w:szCs w:val="18"/>
+                <w:lang w:val="en-US"/>
+              </w:rPr>
+              <w:t>{{</w:t>
+            </w:r>
+            <w:proofErr w:type="spellStart"/>
+            <w:r>
+              <w:rPr>
+                <w:rFonts w:ascii="Calibri" w:hAnsi="Calibri" w:cs="Calibri"/>
+                <w:b w:val="0"/>
+                <w:bCs w:val="0"/>
+                <w:sz w:val="18"/>
+                <w:szCs w:val="18"/>
+                <w:lang w:val="en-US"/>
+              </w:rPr>
+              <w:t>i</w:t>
+            </w:r>
+            <w:proofErr w:type="spellEnd"/>
+            <w:r>
+              <w:rPr>
+                <w:rFonts w:ascii="Calibri" w:hAnsi="Calibri" w:cs="Calibri"/>
+                <w:b w:val="0"/>
+                <w:bCs w:val="0"/>
+                <w:sz w:val="18"/>
+                <w:szCs w:val="18"/>
+                <w:lang w:val="en-US"/>
+              </w:rPr>
+              <w:t>}}</w:t>
             </w:r>
           </w:p>
         </w:tc>
       </w:tr>
       <w:tr>
         <w:trPr>
-          <w:trHeight w:val="180"/>
+          <w:cnfStyle w:val="000000100000" w:firstRow="0" w:lastRow="0" w:firstColumn="0" w:lastColumn="0" w:oddVBand="0" w:evenVBand="0" w:oddHBand="1" w:evenHBand="0" w:firstRowFirstColumn="0" w:firstRowLastColumn="0" w:lastRowFirstColumn="0" w:lastRowLastColumn="0"/>
+          <w:trHeight w:val="328"/>
         </w:trPr>
         <w:tc>
           <w:tcPr>
-            <w:tcW w:w="4815" w:type="dxa"/>
-            <w:tcBorders>
-              <w:top w:val="single" w:sz="4" w:space="0" w:color="000000"/>
-              <w:left w:val="single" w:sz="4" w:space="0" w:color="000000"/>
-              <w:bottom w:val="single" w:sz="4" w:space="0" w:color="000000"/>
-              <w:right w:val="single" w:sz="4" w:space="0" w:color="000000"/>
-            </w:tcBorders>
-            <w:shd w:val="clear" w:color="auto" w:fill="FFFFFF" w:themeFill="background1"/>
+            <w:cnfStyle w:val="001000000000" w:firstRow="0" w:lastRow="0" w:firstColumn="1" w:lastColumn="0" w:oddVBand="0" w:evenVBand="0" w:oddHBand="0" w:evenHBand="0" w:firstRowFirstColumn="0" w:firstRowLastColumn="0" w:lastRowFirstColumn="0" w:lastRowLastColumn="0"/>
+            <w:tcW w:w="4895" w:type="dxa"/>
           </w:tcPr>
           <w:p>
             <w:pPr>
-              <w:spacing w:line="240" w:lineRule="auto"/>
-              <w:rPr>
-                <w:rFonts w:ascii="Calibri" w:eastAsia="Calibri" w:hAnsi="Calibri" w:cs="Calibri"/>
-                <w:sz w:val="18"/>
-                <w:szCs w:val="18"/>
-              </w:rPr>
-            </w:pPr>
-            <w:r>
-              <w:rPr>
-                <w:rFonts w:ascii="Calibri" w:eastAsia="Calibri" w:hAnsi="Calibri" w:cs="Calibri"/>
-                <w:sz w:val="18"/>
-                <w:szCs w:val="18"/>
-              </w:rPr>
-              <w:t xml:space="preserve">{% </w:t>
+              <w:rPr>
+                <w:rFonts w:ascii="Calibri" w:hAnsi="Calibri" w:cs="Calibri"/>
+                <w:sz w:val="18"/>
+                <w:szCs w:val="18"/>
+                <w:lang w:val="en-US"/>
+              </w:rPr>
+            </w:pPr>
+            <w:r>
+              <w:rPr>
+                <w:rFonts w:ascii="Calibri" w:hAnsi="Calibri" w:cs="Calibri"/>
+                <w:sz w:val="18"/>
+                <w:szCs w:val="18"/>
+                <w:lang w:val="en-US"/>
+              </w:rPr>
+              <w:t>{%</w:t>
+            </w:r>
+            <w:r>
+              <w:rPr>
+                <w:rFonts w:ascii="Calibri" w:hAnsi="Calibri" w:cs="Calibri"/>
+                <w:sz w:val="18"/>
+                <w:szCs w:val="18"/>
+                <w:lang w:val="en-US"/>
+              </w:rPr>
+              <w:t>tr</w:t>
+            </w:r>
+            <w:r>
+              <w:rPr>
+                <w:rFonts w:ascii="Calibri" w:hAnsi="Calibri" w:cs="Calibri"/>
+                <w:sz w:val="18"/>
+                <w:szCs w:val="18"/>
+                <w:lang w:val="en-US"/>
+              </w:rPr>
+              <w:t xml:space="preserve"> </w:t>
             </w:r>
             <w:proofErr w:type="spellStart"/>
             <w:r>
               <w:rPr>
-                <w:rFonts w:ascii="Calibri" w:eastAsia="Calibri" w:hAnsi="Calibri" w:cs="Calibri"/>
-                <w:sz w:val="18"/>
-                <w:szCs w:val="18"/>
+                <w:rFonts w:ascii="Calibri" w:hAnsi="Calibri" w:cs="Calibri"/>
+                <w:sz w:val="18"/>
+                <w:szCs w:val="18"/>
+                <w:lang w:val="en-US"/>
               </w:rPr>
               <w:t>endfor</w:t>
             </w:r>
             <w:proofErr w:type="spellEnd"/>
             <w:r>
               <w:rPr>
-                <w:rFonts w:ascii="Calibri" w:eastAsia="Calibri" w:hAnsi="Calibri" w:cs="Calibri"/>
-                <w:sz w:val="18"/>
-                <w:szCs w:val="18"/>
+                <w:rFonts w:ascii="Calibri" w:hAnsi="Calibri" w:cs="Calibri"/>
+                <w:sz w:val="18"/>
+                <w:szCs w:val="18"/>
+                <w:lang w:val="en-US"/>
               </w:rPr>
               <w:t xml:space="preserve"> %}</w:t>
             </w:r>
@@ -4309,140 +4558,108 @@
         </w:tc>
       </w:tr>
     </w:tbl>
-    <w:p/>
+    <w:p>
+      <w:pPr>
+        <w:rPr>
+          <w:lang w:val="en-US"/>
+        </w:rPr>
+      </w:pPr>
+    </w:p>
     <w:tbl>
       <w:tblPr>
-        <w:tblW w:w="4815" w:type="dxa"/>
-        <w:tblInd w:w="125" w:type="dxa"/>
-        <w:tblBorders>
-          <w:top w:val="single" w:sz="4" w:space="0" w:color="E2EFD9"/>
-          <w:left w:val="single" w:sz="4" w:space="0" w:color="E2EFD9"/>
-          <w:bottom w:val="single" w:sz="4" w:space="0" w:color="E2EFD9"/>
-          <w:right w:val="single" w:sz="4" w:space="0" w:color="E2EFD9"/>
-          <w:insideH w:val="single" w:sz="4" w:space="0" w:color="E2EFD9"/>
-          <w:insideV w:val="single" w:sz="4" w:space="0" w:color="E2EFD9"/>
-        </w:tblBorders>
-        <w:tblLayout w:type="fixed"/>
-        <w:tblLook w:val="0400" w:firstRow="0" w:lastRow="0" w:firstColumn="0" w:lastColumn="0" w:noHBand="0" w:noVBand="1"/>
+        <w:tblStyle w:val="SimplesTabela1"/>
+        <w:tblW w:w="0" w:type="auto"/>
+        <w:tblLook w:val="04A0" w:firstRow="1" w:lastRow="0" w:firstColumn="1" w:lastColumn="0" w:noHBand="0" w:noVBand="1"/>
       </w:tblPr>
       <w:tblGrid>
-        <w:gridCol w:w="4815"/>
+        <w:gridCol w:w="4895"/>
       </w:tblGrid>
       <w:tr>
         <w:trPr>
-          <w:trHeight w:val="196"/>
+          <w:cnfStyle w:val="100000000000" w:firstRow="1" w:lastRow="0" w:firstColumn="0" w:lastColumn="0" w:oddVBand="0" w:evenVBand="0" w:oddHBand="0" w:evenHBand="0" w:firstRowFirstColumn="0" w:firstRowLastColumn="0" w:lastRowFirstColumn="0" w:lastRowLastColumn="0"/>
+          <w:trHeight w:val="328"/>
+          <w:tblHeader/>
         </w:trPr>
         <w:tc>
           <w:tcPr>
-            <w:tcW w:w="4815" w:type="dxa"/>
-            <w:tcBorders>
-              <w:top w:val="single" w:sz="4" w:space="0" w:color="000000"/>
-              <w:left w:val="single" w:sz="4" w:space="0" w:color="000000"/>
-              <w:bottom w:val="single" w:sz="4" w:space="0" w:color="000000"/>
-              <w:right w:val="single" w:sz="4" w:space="0" w:color="000000"/>
-            </w:tcBorders>
-            <w:shd w:val="clear" w:color="auto" w:fill="D9E2F3"/>
-            <w:vAlign w:val="center"/>
+            <w:cnfStyle w:val="001000000000" w:firstRow="0" w:lastRow="0" w:firstColumn="1" w:lastColumn="0" w:oddVBand="0" w:evenVBand="0" w:oddHBand="0" w:evenHBand="0" w:firstRowFirstColumn="0" w:firstRowLastColumn="0" w:lastRowFirstColumn="0" w:lastRowLastColumn="0"/>
+            <w:tcW w:w="4895" w:type="dxa"/>
+            <w:shd w:val="clear" w:color="auto" w:fill="A5C9EB" w:themeFill="text2" w:themeFillTint="40"/>
           </w:tcPr>
           <w:p>
             <w:pPr>
-              <w:widowControl w:val="0"/>
-              <w:pBdr>
-                <w:top w:val="nil"/>
-                <w:left w:val="nil"/>
-                <w:bottom w:val="nil"/>
-                <w:right w:val="nil"/>
-                <w:between w:val="nil"/>
-              </w:pBdr>
-              <w:ind w:left="-850"/>
               <w:jc w:val="center"/>
               <w:rPr>
-                <w:rFonts w:ascii="Calibri" w:eastAsia="Calibri" w:hAnsi="Calibri" w:cs="Calibri"/>
-                <w:b/>
-                <w:bCs/>
-                <w:sz w:val="26"/>
-                <w:szCs w:val="26"/>
-              </w:rPr>
-            </w:pPr>
-            <w:r>
-              <w:rPr>
-                <w:rFonts w:ascii="Calibri" w:eastAsia="Calibri" w:hAnsi="Calibri" w:cs="Calibri"/>
-                <w:sz w:val="18"/>
-                <w:szCs w:val="18"/>
-              </w:rPr>
-              <w:tab/>
-            </w:r>
-            <w:r>
-              <w:rPr>
-                <w:rFonts w:ascii="Calibri" w:eastAsia="Calibri" w:hAnsi="Calibri" w:cs="Calibri"/>
-                <w:sz w:val="18"/>
-                <w:szCs w:val="18"/>
-              </w:rPr>
-              <w:tab/>
-              <w:t xml:space="preserve">                   </w:t>
-            </w:r>
-            <w:r>
-              <w:rPr>
-                <w:rFonts w:ascii="Calibri" w:eastAsia="Calibri" w:hAnsi="Calibri" w:cs="Calibri"/>
-                <w:b/>
-                <w:bCs/>
-                <w:sz w:val="24"/>
-                <w:szCs w:val="24"/>
-              </w:rPr>
-              <w:t>PROTOCOLO MICRORGANISMOS</w:t>
+                <w:rFonts w:ascii="Calibri" w:hAnsi="Calibri" w:cs="Calibri"/>
+                <w:b w:val="0"/>
+                <w:bCs w:val="0"/>
+              </w:rPr>
+            </w:pPr>
+            <w:r>
+              <w:rPr>
+                <w:rFonts w:ascii="Calibri" w:hAnsi="Calibri" w:cs="Calibri"/>
+              </w:rPr>
+              <w:t>MICRORGANISMOS</w:t>
+            </w:r>
+            <w:r>
+              <w:rPr>
+                <w:rFonts w:ascii="Calibri" w:hAnsi="Calibri" w:cs="Calibri"/>
+              </w:rPr>
+              <w:t xml:space="preserve"> NÃO ENCONTRADOS</w:t>
             </w:r>
           </w:p>
         </w:tc>
       </w:tr>
       <w:tr>
         <w:trPr>
-          <w:trHeight w:val="196"/>
+          <w:cnfStyle w:val="000000100000" w:firstRow="0" w:lastRow="0" w:firstColumn="0" w:lastColumn="0" w:oddVBand="0" w:evenVBand="0" w:oddHBand="1" w:evenHBand="0" w:firstRowFirstColumn="0" w:firstRowLastColumn="0" w:lastRowFirstColumn="0" w:lastRowLastColumn="0"/>
+          <w:trHeight w:val="328"/>
         </w:trPr>
         <w:tc>
           <w:tcPr>
-            <w:tcW w:w="4815" w:type="dxa"/>
-            <w:tcBorders>
-              <w:top w:val="single" w:sz="4" w:space="0" w:color="000000"/>
-              <w:left w:val="single" w:sz="4" w:space="0" w:color="000000"/>
-              <w:bottom w:val="single" w:sz="4" w:space="0" w:color="000000"/>
-              <w:right w:val="single" w:sz="4" w:space="0" w:color="000000"/>
-            </w:tcBorders>
-            <w:shd w:val="clear" w:color="auto" w:fill="D9E2F3"/>
-            <w:vAlign w:val="center"/>
+            <w:cnfStyle w:val="001000000000" w:firstRow="0" w:lastRow="0" w:firstColumn="1" w:lastColumn="0" w:oddVBand="0" w:evenVBand="0" w:oddHBand="0" w:evenHBand="0" w:firstRowFirstColumn="0" w:firstRowLastColumn="0" w:lastRowFirstColumn="0" w:lastRowLastColumn="0"/>
+            <w:tcW w:w="4895" w:type="dxa"/>
           </w:tcPr>
           <w:p>
             <w:pPr>
-              <w:widowControl w:val="0"/>
-              <w:pBdr>
-                <w:top w:val="nil"/>
-                <w:left w:val="nil"/>
-                <w:bottom w:val="nil"/>
-                <w:right w:val="nil"/>
-                <w:between w:val="nil"/>
-              </w:pBdr>
-              <w:shd w:val="clear" w:color="auto" w:fill="D9D9D9" w:themeFill="background1" w:themeFillShade="D9"/>
-              <w:ind w:left="-850"/>
-              <w:jc w:val="center"/>
-              <w:rPr>
-                <w:rFonts w:ascii="Calibri" w:eastAsia="Calibri" w:hAnsi="Calibri" w:cs="Calibri"/>
-                <w:sz w:val="18"/>
-                <w:szCs w:val="18"/>
-                <w:lang w:val="en-US"/>
-              </w:rPr>
-            </w:pPr>
-            <w:r>
-              <w:rPr>
-                <w:rFonts w:ascii="Calibri" w:eastAsia="Calibri" w:hAnsi="Calibri" w:cs="Calibri"/>
-                <w:sz w:val="18"/>
-                <w:szCs w:val="18"/>
-                <w:lang w:val="en-US"/>
-              </w:rPr>
-              <w:t xml:space="preserve">{% for </w:t>
+              <w:rPr>
+                <w:rFonts w:ascii="Calibri" w:hAnsi="Calibri" w:cs="Calibri"/>
+                <w:sz w:val="18"/>
+                <w:szCs w:val="18"/>
+                <w:lang w:val="en-US"/>
+              </w:rPr>
+            </w:pPr>
+            <w:r>
+              <w:rPr>
+                <w:rFonts w:ascii="Calibri" w:hAnsi="Calibri" w:cs="Calibri"/>
+                <w:sz w:val="18"/>
+                <w:szCs w:val="18"/>
+                <w:lang w:val="en-US"/>
+              </w:rPr>
+              <w:t>{%</w:t>
+            </w:r>
+            <w:r>
+              <w:rPr>
+                <w:rFonts w:ascii="Calibri" w:hAnsi="Calibri" w:cs="Calibri"/>
+                <w:sz w:val="18"/>
+                <w:szCs w:val="18"/>
+                <w:lang w:val="en-US"/>
+              </w:rPr>
+              <w:t>tr</w:t>
+            </w:r>
+            <w:r>
+              <w:rPr>
+                <w:rFonts w:ascii="Calibri" w:hAnsi="Calibri" w:cs="Calibri"/>
+                <w:sz w:val="18"/>
+                <w:szCs w:val="18"/>
+                <w:lang w:val="en-US"/>
+              </w:rPr>
+              <w:t xml:space="preserve"> for </w:t>
             </w:r>
             <w:proofErr w:type="spellStart"/>
             <w:r>
               <w:rPr>
-                <w:rFonts w:ascii="Calibri" w:eastAsia="Calibri" w:hAnsi="Calibri" w:cs="Calibri"/>
+                <w:rFonts w:ascii="Calibri" w:hAnsi="Calibri" w:cs="Calibri"/>
                 <w:sz w:val="18"/>
                 <w:szCs w:val="18"/>
                 <w:lang w:val="en-US"/>
@@ -4452,7 +4669,7 @@
             <w:proofErr w:type="spellEnd"/>
             <w:r>
               <w:rPr>
-                <w:rFonts w:ascii="Calibri" w:eastAsia="Calibri" w:hAnsi="Calibri" w:cs="Calibri"/>
+                <w:rFonts w:ascii="Calibri" w:hAnsi="Calibri" w:cs="Calibri"/>
                 <w:sz w:val="18"/>
                 <w:szCs w:val="18"/>
                 <w:lang w:val="en-US"/>
@@ -4467,12 +4684,12 @@
                 <w:szCs w:val="18"/>
                 <w:lang w:val="en-US"/>
               </w:rPr>
-              <w:t>microorganisms_protocol</w:t>
+              <w:t>microorganisms_not_founded</w:t>
             </w:r>
             <w:proofErr w:type="spellEnd"/>
             <w:r>
               <w:rPr>
-                <w:rFonts w:ascii="Calibri" w:eastAsia="Calibri" w:hAnsi="Calibri" w:cs="Calibri"/>
+                <w:rFonts w:ascii="Calibri" w:hAnsi="Calibri" w:cs="Calibri"/>
                 <w:sz w:val="18"/>
                 <w:szCs w:val="18"/>
                 <w:lang w:val="en-US"/>
@@ -4484,87 +4701,125 @@
       </w:tr>
       <w:tr>
         <w:trPr>
-          <w:trHeight w:val="224"/>
+          <w:trHeight w:val="328"/>
         </w:trPr>
         <w:tc>
           <w:tcPr>
-            <w:tcW w:w="4815" w:type="dxa"/>
-            <w:tcBorders>
-              <w:top w:val="single" w:sz="4" w:space="0" w:color="000000"/>
-              <w:left w:val="single" w:sz="4" w:space="0" w:color="000000"/>
-              <w:bottom w:val="single" w:sz="4" w:space="0" w:color="000000"/>
-              <w:right w:val="single" w:sz="4" w:space="0" w:color="000000"/>
-            </w:tcBorders>
-            <w:shd w:val="clear" w:color="auto" w:fill="D9D9D9" w:themeFill="background1" w:themeFillShade="D9"/>
+            <w:cnfStyle w:val="001000000000" w:firstRow="0" w:lastRow="0" w:firstColumn="1" w:lastColumn="0" w:oddVBand="0" w:evenVBand="0" w:oddHBand="0" w:evenHBand="0" w:firstRowFirstColumn="0" w:firstRowLastColumn="0" w:lastRowFirstColumn="0" w:lastRowLastColumn="0"/>
+            <w:tcW w:w="4895" w:type="dxa"/>
           </w:tcPr>
           <w:p>
             <w:pPr>
-              <w:keepLines/>
-              <w:spacing w:line="240" w:lineRule="auto"/>
-              <w:rPr>
-                <w:rFonts w:ascii="Calibri" w:eastAsia="Calibri" w:hAnsi="Calibri" w:cs="Calibri"/>
-                <w:sz w:val="18"/>
-                <w:szCs w:val="18"/>
-              </w:rPr>
-            </w:pPr>
-            <w:r>
-              <w:rPr>
-                <w:rFonts w:ascii="Calibri" w:eastAsia="Calibri" w:hAnsi="Calibri" w:cs="Calibri"/>
-                <w:sz w:val="18"/>
-                <w:szCs w:val="18"/>
-              </w:rPr>
-              <w:t>{{i}}</w:t>
+              <w:rPr>
+                <w:rFonts w:ascii="Calibri" w:hAnsi="Calibri" w:cs="Calibri"/>
+                <w:b w:val="0"/>
+                <w:bCs w:val="0"/>
+                <w:sz w:val="18"/>
+                <w:szCs w:val="18"/>
+                <w:lang w:val="en-US"/>
+              </w:rPr>
+            </w:pPr>
+            <w:r>
+              <w:rPr>
+                <w:rFonts w:ascii="Calibri" w:hAnsi="Calibri" w:cs="Calibri"/>
+                <w:b w:val="0"/>
+                <w:bCs w:val="0"/>
+                <w:sz w:val="18"/>
+                <w:szCs w:val="18"/>
+                <w:lang w:val="en-US"/>
+              </w:rPr>
+              <w:t>{{</w:t>
+            </w:r>
+            <w:proofErr w:type="spellStart"/>
+            <w:r>
+              <w:rPr>
+                <w:rFonts w:ascii="Calibri" w:hAnsi="Calibri" w:cs="Calibri"/>
+                <w:b w:val="0"/>
+                <w:bCs w:val="0"/>
+                <w:sz w:val="18"/>
+                <w:szCs w:val="18"/>
+                <w:lang w:val="en-US"/>
+              </w:rPr>
+              <w:t>i</w:t>
+            </w:r>
+            <w:proofErr w:type="spellEnd"/>
+            <w:r>
+              <w:rPr>
+                <w:rFonts w:ascii="Calibri" w:hAnsi="Calibri" w:cs="Calibri"/>
+                <w:b w:val="0"/>
+                <w:bCs w:val="0"/>
+                <w:sz w:val="18"/>
+                <w:szCs w:val="18"/>
+                <w:lang w:val="en-US"/>
+              </w:rPr>
+              <w:t>}}</w:t>
             </w:r>
           </w:p>
         </w:tc>
       </w:tr>
       <w:tr>
         <w:trPr>
-          <w:trHeight w:val="180"/>
+          <w:cnfStyle w:val="000000100000" w:firstRow="0" w:lastRow="0" w:firstColumn="0" w:lastColumn="0" w:oddVBand="0" w:evenVBand="0" w:oddHBand="1" w:evenHBand="0" w:firstRowFirstColumn="0" w:firstRowLastColumn="0" w:lastRowFirstColumn="0" w:lastRowLastColumn="0"/>
+          <w:trHeight w:val="328"/>
         </w:trPr>
         <w:tc>
           <w:tcPr>
-            <w:tcW w:w="4815" w:type="dxa"/>
-            <w:tcBorders>
-              <w:top w:val="single" w:sz="4" w:space="0" w:color="000000"/>
-              <w:left w:val="single" w:sz="4" w:space="0" w:color="000000"/>
-              <w:bottom w:val="single" w:sz="4" w:space="0" w:color="000000"/>
-              <w:right w:val="single" w:sz="4" w:space="0" w:color="000000"/>
-            </w:tcBorders>
-            <w:shd w:val="clear" w:color="auto" w:fill="FFFFFF" w:themeFill="background1"/>
+            <w:cnfStyle w:val="001000000000" w:firstRow="0" w:lastRow="0" w:firstColumn="1" w:lastColumn="0" w:oddVBand="0" w:evenVBand="0" w:oddHBand="0" w:evenHBand="0" w:firstRowFirstColumn="0" w:firstRowLastColumn="0" w:lastRowFirstColumn="0" w:lastRowLastColumn="0"/>
+            <w:tcW w:w="4895" w:type="dxa"/>
           </w:tcPr>
           <w:p>
             <w:pPr>
-              <w:spacing w:line="240" w:lineRule="auto"/>
-              <w:rPr>
-                <w:rFonts w:ascii="Calibri" w:eastAsia="Calibri" w:hAnsi="Calibri" w:cs="Calibri"/>
-                <w:sz w:val="18"/>
-                <w:szCs w:val="18"/>
-              </w:rPr>
-            </w:pPr>
-            <w:r>
-              <w:rPr>
-                <w:rFonts w:ascii="Calibri" w:eastAsia="Calibri" w:hAnsi="Calibri" w:cs="Calibri"/>
-                <w:sz w:val="18"/>
-                <w:szCs w:val="18"/>
-              </w:rPr>
-              <w:t xml:space="preserve">{% </w:t>
+              <w:rPr>
+                <w:rFonts w:ascii="Calibri" w:hAnsi="Calibri" w:cs="Calibri"/>
+                <w:sz w:val="18"/>
+                <w:szCs w:val="18"/>
+                <w:lang w:val="en-US"/>
+              </w:rPr>
+            </w:pPr>
+            <w:r>
+              <w:rPr>
+                <w:rFonts w:ascii="Calibri" w:hAnsi="Calibri" w:cs="Calibri"/>
+                <w:sz w:val="18"/>
+                <w:szCs w:val="18"/>
+                <w:lang w:val="en-US"/>
+              </w:rPr>
+              <w:t>{%</w:t>
+            </w:r>
+            <w:r>
+              <w:rPr>
+                <w:rFonts w:ascii="Calibri" w:hAnsi="Calibri" w:cs="Calibri"/>
+                <w:sz w:val="18"/>
+                <w:szCs w:val="18"/>
+                <w:lang w:val="en-US"/>
+              </w:rPr>
+              <w:t>tr</w:t>
+            </w:r>
+            <w:r>
+              <w:rPr>
+                <w:rFonts w:ascii="Calibri" w:hAnsi="Calibri" w:cs="Calibri"/>
+                <w:sz w:val="18"/>
+                <w:szCs w:val="18"/>
+                <w:lang w:val="en-US"/>
+              </w:rPr>
+              <w:t xml:space="preserve"> </w:t>
             </w:r>
             <w:proofErr w:type="spellStart"/>
             <w:r>
               <w:rPr>
-                <w:rFonts w:ascii="Calibri" w:eastAsia="Calibri" w:hAnsi="Calibri" w:cs="Calibri"/>
-                <w:sz w:val="18"/>
-                <w:szCs w:val="18"/>
+                <w:rFonts w:ascii="Calibri" w:hAnsi="Calibri" w:cs="Calibri"/>
+                <w:sz w:val="18"/>
+                <w:szCs w:val="18"/>
+                <w:lang w:val="en-US"/>
               </w:rPr>
               <w:t>endfor</w:t>
             </w:r>
             <w:proofErr w:type="spellEnd"/>
             <w:r>
               <w:rPr>
-                <w:rFonts w:ascii="Calibri" w:eastAsia="Calibri" w:hAnsi="Calibri" w:cs="Calibri"/>
-                <w:sz w:val="18"/>
-                <w:szCs w:val="18"/>
+                <w:rFonts w:ascii="Calibri" w:hAnsi="Calibri" w:cs="Calibri"/>
+                <w:sz w:val="18"/>
+                <w:szCs w:val="18"/>
+                <w:lang w:val="en-US"/>
               </w:rPr>
               <w:t xml:space="preserve"> %}</w:t>
             </w:r>
@@ -4572,123 +4827,108 @@
         </w:tc>
       </w:tr>
     </w:tbl>
-    <w:p/>
+    <w:p>
+      <w:pPr>
+        <w:rPr>
+          <w:lang w:val="en-US"/>
+        </w:rPr>
+      </w:pPr>
+    </w:p>
     <w:tbl>
       <w:tblPr>
-        <w:tblW w:w="4815" w:type="dxa"/>
-        <w:tblInd w:w="125" w:type="dxa"/>
-        <w:tblBorders>
-          <w:top w:val="single" w:sz="4" w:space="0" w:color="E2EFD9"/>
-          <w:left w:val="single" w:sz="4" w:space="0" w:color="E2EFD9"/>
-          <w:bottom w:val="single" w:sz="4" w:space="0" w:color="E2EFD9"/>
-          <w:right w:val="single" w:sz="4" w:space="0" w:color="E2EFD9"/>
-          <w:insideH w:val="single" w:sz="4" w:space="0" w:color="E2EFD9"/>
-          <w:insideV w:val="single" w:sz="4" w:space="0" w:color="E2EFD9"/>
-        </w:tblBorders>
-        <w:tblLayout w:type="fixed"/>
-        <w:tblLook w:val="0400" w:firstRow="0" w:lastRow="0" w:firstColumn="0" w:lastColumn="0" w:noHBand="0" w:noVBand="1"/>
+        <w:tblStyle w:val="SimplesTabela1"/>
+        <w:tblW w:w="0" w:type="auto"/>
+        <w:tblLook w:val="04A0" w:firstRow="1" w:lastRow="0" w:firstColumn="1" w:lastColumn="0" w:noHBand="0" w:noVBand="1"/>
       </w:tblPr>
       <w:tblGrid>
-        <w:gridCol w:w="4815"/>
+        <w:gridCol w:w="4895"/>
       </w:tblGrid>
       <w:tr>
         <w:trPr>
-          <w:trHeight w:val="196"/>
+          <w:cnfStyle w:val="100000000000" w:firstRow="1" w:lastRow="0" w:firstColumn="0" w:lastColumn="0" w:oddVBand="0" w:evenVBand="0" w:oddHBand="0" w:evenHBand="0" w:firstRowFirstColumn="0" w:firstRowLastColumn="0" w:lastRowFirstColumn="0" w:lastRowLastColumn="0"/>
+          <w:trHeight w:val="328"/>
+          <w:tblHeader/>
         </w:trPr>
         <w:tc>
           <w:tcPr>
-            <w:tcW w:w="4815" w:type="dxa"/>
-            <w:tcBorders>
-              <w:top w:val="single" w:sz="4" w:space="0" w:color="000000"/>
-              <w:left w:val="single" w:sz="4" w:space="0" w:color="000000"/>
-              <w:bottom w:val="single" w:sz="4" w:space="0" w:color="000000"/>
-              <w:right w:val="single" w:sz="4" w:space="0" w:color="000000"/>
-            </w:tcBorders>
-            <w:shd w:val="clear" w:color="auto" w:fill="D9E2F3"/>
-            <w:vAlign w:val="center"/>
+            <w:cnfStyle w:val="001000000000" w:firstRow="0" w:lastRow="0" w:firstColumn="1" w:lastColumn="0" w:oddVBand="0" w:evenVBand="0" w:oddHBand="0" w:evenHBand="0" w:firstRowFirstColumn="0" w:firstRowLastColumn="0" w:lastRowFirstColumn="0" w:lastRowLastColumn="0"/>
+            <w:tcW w:w="4895" w:type="dxa"/>
+            <w:shd w:val="clear" w:color="auto" w:fill="A5C9EB" w:themeFill="text2" w:themeFillTint="40"/>
           </w:tcPr>
           <w:p>
             <w:pPr>
-              <w:widowControl w:val="0"/>
-              <w:pBdr>
-                <w:top w:val="nil"/>
-                <w:left w:val="nil"/>
-                <w:bottom w:val="nil"/>
-                <w:right w:val="nil"/>
-                <w:between w:val="nil"/>
-              </w:pBdr>
-              <w:ind w:left="-850"/>
               <w:jc w:val="center"/>
               <w:rPr>
-                <w:rFonts w:ascii="Calibri" w:eastAsia="Calibri" w:hAnsi="Calibri" w:cs="Calibri"/>
-                <w:b/>
-                <w:bCs/>
-                <w:sz w:val="26"/>
-                <w:szCs w:val="26"/>
-                <w:u w:val="single"/>
-              </w:rPr>
-            </w:pPr>
-            <w:r>
-              <w:rPr>
-                <w:rFonts w:ascii="Calibri" w:eastAsia="Calibri" w:hAnsi="Calibri" w:cs="Calibri"/>
-                <w:sz w:val="18"/>
-                <w:szCs w:val="18"/>
-              </w:rPr>
-              <w:tab/>
-              <w:t>Metais não encontrados</w:t>
+                <w:rFonts w:ascii="Calibri" w:hAnsi="Calibri" w:cs="Calibri"/>
+                <w:b w:val="0"/>
+                <w:bCs w:val="0"/>
+              </w:rPr>
+            </w:pPr>
+            <w:r>
+              <w:rPr>
+                <w:rFonts w:ascii="Calibri" w:hAnsi="Calibri" w:cs="Calibri"/>
+              </w:rPr>
+              <w:t>METAIS</w:t>
+            </w:r>
+            <w:r>
+              <w:rPr>
+                <w:rFonts w:ascii="Calibri" w:hAnsi="Calibri" w:cs="Calibri"/>
+              </w:rPr>
+              <w:t xml:space="preserve"> NÃO ENCONTRADOS</w:t>
             </w:r>
           </w:p>
         </w:tc>
       </w:tr>
       <w:tr>
         <w:trPr>
-          <w:trHeight w:val="196"/>
+          <w:cnfStyle w:val="000000100000" w:firstRow="0" w:lastRow="0" w:firstColumn="0" w:lastColumn="0" w:oddVBand="0" w:evenVBand="0" w:oddHBand="1" w:evenHBand="0" w:firstRowFirstColumn="0" w:firstRowLastColumn="0" w:lastRowFirstColumn="0" w:lastRowLastColumn="0"/>
+          <w:trHeight w:val="328"/>
         </w:trPr>
         <w:tc>
           <w:tcPr>
-            <w:tcW w:w="4815" w:type="dxa"/>
-            <w:tcBorders>
-              <w:top w:val="single" w:sz="4" w:space="0" w:color="000000"/>
-              <w:left w:val="single" w:sz="4" w:space="0" w:color="000000"/>
-              <w:bottom w:val="single" w:sz="4" w:space="0" w:color="000000"/>
-              <w:right w:val="single" w:sz="4" w:space="0" w:color="000000"/>
-            </w:tcBorders>
-            <w:shd w:val="clear" w:color="auto" w:fill="D9E2F3"/>
-            <w:vAlign w:val="center"/>
+            <w:cnfStyle w:val="001000000000" w:firstRow="0" w:lastRow="0" w:firstColumn="1" w:lastColumn="0" w:oddVBand="0" w:evenVBand="0" w:oddHBand="0" w:evenHBand="0" w:firstRowFirstColumn="0" w:firstRowLastColumn="0" w:lastRowFirstColumn="0" w:lastRowLastColumn="0"/>
+            <w:tcW w:w="4895" w:type="dxa"/>
           </w:tcPr>
           <w:p>
             <w:pPr>
-              <w:widowControl w:val="0"/>
-              <w:pBdr>
-                <w:top w:val="nil"/>
-                <w:left w:val="nil"/>
-                <w:bottom w:val="nil"/>
-                <w:right w:val="nil"/>
-                <w:between w:val="nil"/>
-              </w:pBdr>
-              <w:shd w:val="clear" w:color="auto" w:fill="D9D9D9" w:themeFill="background1" w:themeFillShade="D9"/>
-              <w:ind w:left="-850"/>
-              <w:jc w:val="center"/>
-              <w:rPr>
-                <w:rFonts w:ascii="Calibri" w:eastAsia="Calibri" w:hAnsi="Calibri" w:cs="Calibri"/>
-                <w:sz w:val="18"/>
-                <w:szCs w:val="18"/>
-                <w:lang w:val="en-US"/>
-              </w:rPr>
-            </w:pPr>
-            <w:r>
-              <w:rPr>
-                <w:rFonts w:ascii="Calibri" w:eastAsia="Calibri" w:hAnsi="Calibri" w:cs="Calibri"/>
-                <w:sz w:val="18"/>
-                <w:szCs w:val="18"/>
-                <w:lang w:val="en-US"/>
-              </w:rPr>
-              <w:t xml:space="preserve">{% for </w:t>
+              <w:rPr>
+                <w:rFonts w:ascii="Calibri" w:hAnsi="Calibri" w:cs="Calibri"/>
+                <w:sz w:val="18"/>
+                <w:szCs w:val="18"/>
+                <w:lang w:val="en-US"/>
+              </w:rPr>
+            </w:pPr>
+            <w:r>
+              <w:rPr>
+                <w:rFonts w:ascii="Calibri" w:hAnsi="Calibri" w:cs="Calibri"/>
+                <w:sz w:val="18"/>
+                <w:szCs w:val="18"/>
+                <w:lang w:val="en-US"/>
+              </w:rPr>
+              <w:t>{%</w:t>
+            </w:r>
+            <w:r>
+              <w:rPr>
+                <w:rFonts w:ascii="Calibri" w:hAnsi="Calibri" w:cs="Calibri"/>
+                <w:sz w:val="18"/>
+                <w:szCs w:val="18"/>
+                <w:lang w:val="en-US"/>
+              </w:rPr>
+              <w:t>tr</w:t>
+            </w:r>
+            <w:r>
+              <w:rPr>
+                <w:rFonts w:ascii="Calibri" w:hAnsi="Calibri" w:cs="Calibri"/>
+                <w:sz w:val="18"/>
+                <w:szCs w:val="18"/>
+                <w:lang w:val="en-US"/>
+              </w:rPr>
+              <w:t xml:space="preserve"> for </w:t>
             </w:r>
             <w:proofErr w:type="spellStart"/>
             <w:r>
               <w:rPr>
-                <w:rFonts w:ascii="Calibri" w:eastAsia="Calibri" w:hAnsi="Calibri" w:cs="Calibri"/>
+                <w:rFonts w:ascii="Calibri" w:hAnsi="Calibri" w:cs="Calibri"/>
                 <w:sz w:val="18"/>
                 <w:szCs w:val="18"/>
                 <w:lang w:val="en-US"/>
@@ -4698,7 +4938,7 @@
             <w:proofErr w:type="spellEnd"/>
             <w:r>
               <w:rPr>
-                <w:rFonts w:ascii="Calibri" w:eastAsia="Calibri" w:hAnsi="Calibri" w:cs="Calibri"/>
+                <w:rFonts w:ascii="Calibri" w:hAnsi="Calibri" w:cs="Calibri"/>
                 <w:sz w:val="18"/>
                 <w:szCs w:val="18"/>
                 <w:lang w:val="en-US"/>
@@ -4725,30 +4965,18 @@
               <w:t>_not_founded</w:t>
             </w:r>
             <w:proofErr w:type="spellEnd"/>
-          </w:p>
-          <w:p>
-            <w:pPr>
-              <w:widowControl w:val="0"/>
-              <w:pBdr>
-                <w:top w:val="nil"/>
-                <w:left w:val="nil"/>
-                <w:bottom w:val="nil"/>
-                <w:right w:val="nil"/>
-                <w:between w:val="nil"/>
-              </w:pBdr>
-              <w:shd w:val="clear" w:color="auto" w:fill="D9D9D9" w:themeFill="background1" w:themeFillShade="D9"/>
-              <w:ind w:left="-850"/>
-              <w:jc w:val="center"/>
-              <w:rPr>
-                <w:rFonts w:ascii="Calibri" w:eastAsia="Calibri" w:hAnsi="Calibri" w:cs="Calibri"/>
-                <w:sz w:val="18"/>
-                <w:szCs w:val="18"/>
-                <w:lang w:val="en-US"/>
-              </w:rPr>
-            </w:pPr>
-            <w:r>
-              <w:rPr>
-                <w:rFonts w:ascii="Calibri" w:eastAsia="Calibri" w:hAnsi="Calibri" w:cs="Calibri"/>
+            <w:r>
+              <w:rPr>
+                <w:rFonts w:ascii="Calibri" w:hAnsi="Calibri" w:cs="Calibri"/>
+                <w:sz w:val="18"/>
+                <w:szCs w:val="18"/>
+                <w:lang w:val="en-US"/>
+              </w:rPr>
+              <w:t xml:space="preserve"> </w:t>
+            </w:r>
+            <w:r>
+              <w:rPr>
+                <w:rFonts w:ascii="Calibri" w:hAnsi="Calibri" w:cs="Calibri"/>
                 <w:sz w:val="18"/>
                 <w:szCs w:val="18"/>
                 <w:lang w:val="en-US"/>
@@ -4760,87 +4988,125 @@
       </w:tr>
       <w:tr>
         <w:trPr>
-          <w:trHeight w:val="224"/>
+          <w:trHeight w:val="328"/>
         </w:trPr>
         <w:tc>
           <w:tcPr>
-            <w:tcW w:w="4815" w:type="dxa"/>
-            <w:tcBorders>
-              <w:top w:val="single" w:sz="4" w:space="0" w:color="000000"/>
-              <w:left w:val="single" w:sz="4" w:space="0" w:color="000000"/>
-              <w:bottom w:val="single" w:sz="4" w:space="0" w:color="000000"/>
-              <w:right w:val="single" w:sz="4" w:space="0" w:color="000000"/>
-            </w:tcBorders>
-            <w:shd w:val="clear" w:color="auto" w:fill="D9D9D9" w:themeFill="background1" w:themeFillShade="D9"/>
+            <w:cnfStyle w:val="001000000000" w:firstRow="0" w:lastRow="0" w:firstColumn="1" w:lastColumn="0" w:oddVBand="0" w:evenVBand="0" w:oddHBand="0" w:evenHBand="0" w:firstRowFirstColumn="0" w:firstRowLastColumn="0" w:lastRowFirstColumn="0" w:lastRowLastColumn="0"/>
+            <w:tcW w:w="4895" w:type="dxa"/>
           </w:tcPr>
           <w:p>
             <w:pPr>
-              <w:keepLines/>
-              <w:spacing w:line="240" w:lineRule="auto"/>
-              <w:rPr>
-                <w:rFonts w:ascii="Calibri" w:eastAsia="Calibri" w:hAnsi="Calibri" w:cs="Calibri"/>
-                <w:sz w:val="18"/>
-                <w:szCs w:val="18"/>
-              </w:rPr>
-            </w:pPr>
-            <w:r>
-              <w:rPr>
-                <w:rFonts w:ascii="Calibri" w:eastAsia="Calibri" w:hAnsi="Calibri" w:cs="Calibri"/>
-                <w:sz w:val="18"/>
-                <w:szCs w:val="18"/>
-              </w:rPr>
-              <w:t>{{i}}</w:t>
+              <w:rPr>
+                <w:rFonts w:ascii="Calibri" w:hAnsi="Calibri" w:cs="Calibri"/>
+                <w:b w:val="0"/>
+                <w:bCs w:val="0"/>
+                <w:sz w:val="18"/>
+                <w:szCs w:val="18"/>
+                <w:lang w:val="en-US"/>
+              </w:rPr>
+            </w:pPr>
+            <w:r>
+              <w:rPr>
+                <w:rFonts w:ascii="Calibri" w:hAnsi="Calibri" w:cs="Calibri"/>
+                <w:b w:val="0"/>
+                <w:bCs w:val="0"/>
+                <w:sz w:val="18"/>
+                <w:szCs w:val="18"/>
+                <w:lang w:val="en-US"/>
+              </w:rPr>
+              <w:t>{{</w:t>
+            </w:r>
+            <w:proofErr w:type="spellStart"/>
+            <w:r>
+              <w:rPr>
+                <w:rFonts w:ascii="Calibri" w:hAnsi="Calibri" w:cs="Calibri"/>
+                <w:b w:val="0"/>
+                <w:bCs w:val="0"/>
+                <w:sz w:val="18"/>
+                <w:szCs w:val="18"/>
+                <w:lang w:val="en-US"/>
+              </w:rPr>
+              <w:t>i</w:t>
+            </w:r>
+            <w:proofErr w:type="spellEnd"/>
+            <w:r>
+              <w:rPr>
+                <w:rFonts w:ascii="Calibri" w:hAnsi="Calibri" w:cs="Calibri"/>
+                <w:b w:val="0"/>
+                <w:bCs w:val="0"/>
+                <w:sz w:val="18"/>
+                <w:szCs w:val="18"/>
+                <w:lang w:val="en-US"/>
+              </w:rPr>
+              <w:t>}}</w:t>
             </w:r>
           </w:p>
         </w:tc>
       </w:tr>
       <w:tr>
         <w:trPr>
-          <w:trHeight w:val="180"/>
+          <w:cnfStyle w:val="000000100000" w:firstRow="0" w:lastRow="0" w:firstColumn="0" w:lastColumn="0" w:oddVBand="0" w:evenVBand="0" w:oddHBand="1" w:evenHBand="0" w:firstRowFirstColumn="0" w:firstRowLastColumn="0" w:lastRowFirstColumn="0" w:lastRowLastColumn="0"/>
+          <w:trHeight w:val="328"/>
         </w:trPr>
         <w:tc>
           <w:tcPr>
-            <w:tcW w:w="4815" w:type="dxa"/>
-            <w:tcBorders>
-              <w:top w:val="single" w:sz="4" w:space="0" w:color="000000"/>
-              <w:left w:val="single" w:sz="4" w:space="0" w:color="000000"/>
-              <w:bottom w:val="single" w:sz="4" w:space="0" w:color="000000"/>
-              <w:right w:val="single" w:sz="4" w:space="0" w:color="000000"/>
-            </w:tcBorders>
-            <w:shd w:val="clear" w:color="auto" w:fill="D9D9D9" w:themeFill="background1" w:themeFillShade="D9"/>
+            <w:cnfStyle w:val="001000000000" w:firstRow="0" w:lastRow="0" w:firstColumn="1" w:lastColumn="0" w:oddVBand="0" w:evenVBand="0" w:oddHBand="0" w:evenHBand="0" w:firstRowFirstColumn="0" w:firstRowLastColumn="0" w:lastRowFirstColumn="0" w:lastRowLastColumn="0"/>
+            <w:tcW w:w="4895" w:type="dxa"/>
           </w:tcPr>
           <w:p>
             <w:pPr>
-              <w:spacing w:line="240" w:lineRule="auto"/>
-              <w:rPr>
-                <w:rFonts w:ascii="Calibri" w:eastAsia="Calibri" w:hAnsi="Calibri" w:cs="Calibri"/>
-                <w:sz w:val="18"/>
-                <w:szCs w:val="18"/>
-              </w:rPr>
-            </w:pPr>
-            <w:r>
-              <w:rPr>
-                <w:rFonts w:ascii="Calibri" w:eastAsia="Calibri" w:hAnsi="Calibri" w:cs="Calibri"/>
-                <w:sz w:val="18"/>
-                <w:szCs w:val="18"/>
-              </w:rPr>
-              <w:t xml:space="preserve">{% </w:t>
+              <w:rPr>
+                <w:rFonts w:ascii="Calibri" w:hAnsi="Calibri" w:cs="Calibri"/>
+                <w:sz w:val="18"/>
+                <w:szCs w:val="18"/>
+                <w:lang w:val="en-US"/>
+              </w:rPr>
+            </w:pPr>
+            <w:r>
+              <w:rPr>
+                <w:rFonts w:ascii="Calibri" w:hAnsi="Calibri" w:cs="Calibri"/>
+                <w:sz w:val="18"/>
+                <w:szCs w:val="18"/>
+                <w:lang w:val="en-US"/>
+              </w:rPr>
+              <w:t>{%</w:t>
+            </w:r>
+            <w:r>
+              <w:rPr>
+                <w:rFonts w:ascii="Calibri" w:hAnsi="Calibri" w:cs="Calibri"/>
+                <w:sz w:val="18"/>
+                <w:szCs w:val="18"/>
+                <w:lang w:val="en-US"/>
+              </w:rPr>
+              <w:t>tr</w:t>
+            </w:r>
+            <w:r>
+              <w:rPr>
+                <w:rFonts w:ascii="Calibri" w:hAnsi="Calibri" w:cs="Calibri"/>
+                <w:sz w:val="18"/>
+                <w:szCs w:val="18"/>
+                <w:lang w:val="en-US"/>
+              </w:rPr>
+              <w:t xml:space="preserve"> </w:t>
             </w:r>
             <w:proofErr w:type="spellStart"/>
             <w:r>
               <w:rPr>
-                <w:rFonts w:ascii="Calibri" w:eastAsia="Calibri" w:hAnsi="Calibri" w:cs="Calibri"/>
-                <w:sz w:val="18"/>
-                <w:szCs w:val="18"/>
+                <w:rFonts w:ascii="Calibri" w:hAnsi="Calibri" w:cs="Calibri"/>
+                <w:sz w:val="18"/>
+                <w:szCs w:val="18"/>
+                <w:lang w:val="en-US"/>
               </w:rPr>
               <w:t>endfor</w:t>
             </w:r>
             <w:proofErr w:type="spellEnd"/>
             <w:r>
               <w:rPr>
-                <w:rFonts w:ascii="Calibri" w:eastAsia="Calibri" w:hAnsi="Calibri" w:cs="Calibri"/>
-                <w:sz w:val="18"/>
-                <w:szCs w:val="18"/>
+                <w:rFonts w:ascii="Calibri" w:hAnsi="Calibri" w:cs="Calibri"/>
+                <w:sz w:val="18"/>
+                <w:szCs w:val="18"/>
+                <w:lang w:val="en-US"/>
               </w:rPr>
               <w:t xml:space="preserve"> %}</w:t>
             </w:r>
@@ -4848,283 +5114,13 @@
         </w:tc>
       </w:tr>
     </w:tbl>
-    <w:p/>
-    <w:p/>
-    <w:tbl>
-      <w:tblPr>
-        <w:tblW w:w="4815" w:type="dxa"/>
-        <w:tblInd w:w="125" w:type="dxa"/>
-        <w:tblBorders>
-          <w:top w:val="single" w:sz="4" w:space="0" w:color="E2EFD9"/>
-          <w:left w:val="single" w:sz="4" w:space="0" w:color="E2EFD9"/>
-          <w:bottom w:val="single" w:sz="4" w:space="0" w:color="E2EFD9"/>
-          <w:right w:val="single" w:sz="4" w:space="0" w:color="E2EFD9"/>
-          <w:insideH w:val="single" w:sz="4" w:space="0" w:color="E2EFD9"/>
-          <w:insideV w:val="single" w:sz="4" w:space="0" w:color="E2EFD9"/>
-        </w:tblBorders>
-        <w:tblLayout w:type="fixed"/>
-        <w:tblLook w:val="0400" w:firstRow="0" w:lastRow="0" w:firstColumn="0" w:lastColumn="0" w:noHBand="0" w:noVBand="1"/>
-      </w:tblPr>
-      <w:tblGrid>
-        <w:gridCol w:w="4815"/>
-      </w:tblGrid>
-      <w:tr>
-        <w:trPr>
-          <w:trHeight w:val="196"/>
-        </w:trPr>
-        <w:tc>
-          <w:tcPr>
-            <w:tcW w:w="4815" w:type="dxa"/>
-            <w:tcBorders>
-              <w:top w:val="single" w:sz="4" w:space="0" w:color="000000"/>
-              <w:left w:val="single" w:sz="4" w:space="0" w:color="000000"/>
-              <w:bottom w:val="single" w:sz="4" w:space="0" w:color="000000"/>
-              <w:right w:val="single" w:sz="4" w:space="0" w:color="000000"/>
-            </w:tcBorders>
-            <w:shd w:val="clear" w:color="auto" w:fill="D9E2F3"/>
-            <w:vAlign w:val="center"/>
-          </w:tcPr>
-          <w:p>
-            <w:pPr>
-              <w:widowControl w:val="0"/>
-              <w:pBdr>
-                <w:top w:val="nil"/>
-                <w:left w:val="nil"/>
-                <w:bottom w:val="nil"/>
-                <w:right w:val="nil"/>
-                <w:between w:val="nil"/>
-              </w:pBdr>
-              <w:ind w:left="-850"/>
-              <w:jc w:val="center"/>
-              <w:rPr>
-                <w:rFonts w:ascii="Calibri" w:eastAsia="Calibri" w:hAnsi="Calibri" w:cs="Calibri"/>
-                <w:b/>
-                <w:bCs/>
-                <w:sz w:val="26"/>
-                <w:szCs w:val="26"/>
-                <w:u w:val="single"/>
-              </w:rPr>
-            </w:pPr>
-            <w:r>
-              <w:rPr>
-                <w:rFonts w:ascii="Calibri" w:eastAsia="Calibri" w:hAnsi="Calibri" w:cs="Calibri"/>
-                <w:sz w:val="18"/>
-                <w:szCs w:val="18"/>
-              </w:rPr>
-              <w:tab/>
-            </w:r>
-            <w:r>
-              <w:rPr>
-                <w:rFonts w:ascii="Calibri" w:eastAsia="Calibri" w:hAnsi="Calibri" w:cs="Calibri"/>
-                <w:sz w:val="18"/>
-                <w:szCs w:val="18"/>
-              </w:rPr>
-              <w:tab/>
-              <w:t>Microrganismos não encontrados</w:t>
-            </w:r>
-          </w:p>
-        </w:tc>
-      </w:tr>
-      <w:tr>
-        <w:trPr>
-          <w:trHeight w:val="196"/>
-        </w:trPr>
-        <w:tc>
-          <w:tcPr>
-            <w:tcW w:w="4815" w:type="dxa"/>
-            <w:tcBorders>
-              <w:top w:val="single" w:sz="4" w:space="0" w:color="000000"/>
-              <w:left w:val="single" w:sz="4" w:space="0" w:color="000000"/>
-              <w:bottom w:val="single" w:sz="4" w:space="0" w:color="000000"/>
-              <w:right w:val="single" w:sz="4" w:space="0" w:color="000000"/>
-            </w:tcBorders>
-            <w:shd w:val="clear" w:color="auto" w:fill="D9E2F3"/>
-            <w:vAlign w:val="center"/>
-          </w:tcPr>
-          <w:p>
-            <w:pPr>
-              <w:widowControl w:val="0"/>
-              <w:pBdr>
-                <w:top w:val="nil"/>
-                <w:left w:val="nil"/>
-                <w:bottom w:val="nil"/>
-                <w:right w:val="nil"/>
-                <w:between w:val="nil"/>
-              </w:pBdr>
-              <w:shd w:val="clear" w:color="auto" w:fill="D9D9D9" w:themeFill="background1" w:themeFillShade="D9"/>
-              <w:ind w:left="-850"/>
-              <w:jc w:val="center"/>
-              <w:rPr>
-                <w:rFonts w:ascii="Calibri" w:eastAsia="Calibri" w:hAnsi="Calibri" w:cs="Calibri"/>
-                <w:sz w:val="18"/>
-                <w:szCs w:val="18"/>
-                <w:lang w:val="en-US"/>
-              </w:rPr>
-            </w:pPr>
-            <w:r>
-              <w:rPr>
-                <w:rFonts w:ascii="Calibri" w:eastAsia="Calibri" w:hAnsi="Calibri" w:cs="Calibri"/>
-                <w:sz w:val="18"/>
-                <w:szCs w:val="18"/>
-                <w:lang w:val="en-US"/>
-              </w:rPr>
-              <w:t xml:space="preserve">{% for </w:t>
-            </w:r>
-            <w:proofErr w:type="spellStart"/>
-            <w:r>
-              <w:rPr>
-                <w:rFonts w:ascii="Calibri" w:eastAsia="Calibri" w:hAnsi="Calibri" w:cs="Calibri"/>
-                <w:sz w:val="18"/>
-                <w:szCs w:val="18"/>
-                <w:lang w:val="en-US"/>
-              </w:rPr>
-              <w:t>i</w:t>
-            </w:r>
-            <w:proofErr w:type="spellEnd"/>
-            <w:r>
-              <w:rPr>
-                <w:rFonts w:ascii="Calibri" w:eastAsia="Calibri" w:hAnsi="Calibri" w:cs="Calibri"/>
-                <w:sz w:val="18"/>
-                <w:szCs w:val="18"/>
-                <w:lang w:val="en-US"/>
-              </w:rPr>
-              <w:t xml:space="preserve"> in </w:t>
-            </w:r>
-            <w:proofErr w:type="spellStart"/>
-            <w:r>
-              <w:rPr>
-                <w:rFonts w:ascii="Calibri" w:eastAsia="Calibri" w:hAnsi="Calibri" w:cs="Calibri"/>
-                <w:sz w:val="18"/>
-                <w:szCs w:val="18"/>
-                <w:lang w:val="en-US"/>
-              </w:rPr>
-              <w:t>microorganisms_not_founded</w:t>
-            </w:r>
-            <w:proofErr w:type="spellEnd"/>
-          </w:p>
-          <w:p>
-            <w:pPr>
-              <w:widowControl w:val="0"/>
-              <w:pBdr>
-                <w:top w:val="nil"/>
-                <w:left w:val="nil"/>
-                <w:bottom w:val="nil"/>
-                <w:right w:val="nil"/>
-                <w:between w:val="nil"/>
-              </w:pBdr>
-              <w:shd w:val="clear" w:color="auto" w:fill="D9D9D9" w:themeFill="background1" w:themeFillShade="D9"/>
-              <w:ind w:left="-850"/>
-              <w:jc w:val="center"/>
-              <w:rPr>
-                <w:rFonts w:ascii="Calibri" w:eastAsia="Calibri" w:hAnsi="Calibri" w:cs="Calibri"/>
-                <w:sz w:val="18"/>
-                <w:szCs w:val="18"/>
-                <w:lang w:val="en-US"/>
-              </w:rPr>
-            </w:pPr>
-            <w:r>
-              <w:rPr>
-                <w:rFonts w:ascii="Calibri" w:eastAsia="Calibri" w:hAnsi="Calibri" w:cs="Calibri"/>
-                <w:sz w:val="18"/>
-                <w:szCs w:val="18"/>
-                <w:lang w:val="en-US"/>
-              </w:rPr>
-              <w:t>%}</w:t>
-            </w:r>
-          </w:p>
-        </w:tc>
-      </w:tr>
-      <w:tr>
-        <w:trPr>
-          <w:trHeight w:val="224"/>
-        </w:trPr>
-        <w:tc>
-          <w:tcPr>
-            <w:tcW w:w="4815" w:type="dxa"/>
-            <w:tcBorders>
-              <w:top w:val="single" w:sz="4" w:space="0" w:color="000000"/>
-              <w:left w:val="single" w:sz="4" w:space="0" w:color="000000"/>
-              <w:bottom w:val="single" w:sz="4" w:space="0" w:color="000000"/>
-              <w:right w:val="single" w:sz="4" w:space="0" w:color="000000"/>
-            </w:tcBorders>
-            <w:shd w:val="clear" w:color="auto" w:fill="D9D9D9" w:themeFill="background1" w:themeFillShade="D9"/>
-          </w:tcPr>
-          <w:p>
-            <w:pPr>
-              <w:keepLines/>
-              <w:spacing w:line="240" w:lineRule="auto"/>
-              <w:rPr>
-                <w:rFonts w:ascii="Calibri" w:eastAsia="Calibri" w:hAnsi="Calibri" w:cs="Calibri"/>
-                <w:sz w:val="18"/>
-                <w:szCs w:val="18"/>
-              </w:rPr>
-            </w:pPr>
-            <w:r>
-              <w:rPr>
-                <w:rFonts w:ascii="Calibri" w:eastAsia="Calibri" w:hAnsi="Calibri" w:cs="Calibri"/>
-                <w:sz w:val="18"/>
-                <w:szCs w:val="18"/>
-              </w:rPr>
-              <w:t>{{i}}</w:t>
-            </w:r>
-          </w:p>
-        </w:tc>
-      </w:tr>
-      <w:tr>
-        <w:trPr>
-          <w:trHeight w:val="180"/>
-        </w:trPr>
-        <w:tc>
-          <w:tcPr>
-            <w:tcW w:w="4815" w:type="dxa"/>
-            <w:tcBorders>
-              <w:top w:val="single" w:sz="4" w:space="0" w:color="000000"/>
-              <w:left w:val="single" w:sz="4" w:space="0" w:color="000000"/>
-              <w:bottom w:val="single" w:sz="4" w:space="0" w:color="000000"/>
-              <w:right w:val="single" w:sz="4" w:space="0" w:color="000000"/>
-            </w:tcBorders>
-            <w:shd w:val="clear" w:color="auto" w:fill="D9D9D9" w:themeFill="background1" w:themeFillShade="D9"/>
-          </w:tcPr>
-          <w:p>
-            <w:pPr>
-              <w:spacing w:line="240" w:lineRule="auto"/>
-              <w:rPr>
-                <w:rFonts w:ascii="Calibri" w:eastAsia="Calibri" w:hAnsi="Calibri" w:cs="Calibri"/>
-                <w:sz w:val="18"/>
-                <w:szCs w:val="18"/>
-              </w:rPr>
-            </w:pPr>
-            <w:r>
-              <w:rPr>
-                <w:rFonts w:ascii="Calibri" w:eastAsia="Calibri" w:hAnsi="Calibri" w:cs="Calibri"/>
-                <w:sz w:val="18"/>
-                <w:szCs w:val="18"/>
-              </w:rPr>
-              <w:t xml:space="preserve">{% </w:t>
-            </w:r>
-            <w:proofErr w:type="spellStart"/>
-            <w:r>
-              <w:rPr>
-                <w:rFonts w:ascii="Calibri" w:eastAsia="Calibri" w:hAnsi="Calibri" w:cs="Calibri"/>
-                <w:sz w:val="18"/>
-                <w:szCs w:val="18"/>
-              </w:rPr>
-              <w:t>endfor</w:t>
-            </w:r>
-            <w:proofErr w:type="spellEnd"/>
-            <w:r>
-              <w:rPr>
-                <w:rFonts w:ascii="Calibri" w:eastAsia="Calibri" w:hAnsi="Calibri" w:cs="Calibri"/>
-                <w:sz w:val="18"/>
-                <w:szCs w:val="18"/>
-              </w:rPr>
-              <w:t xml:space="preserve"> %}</w:t>
-            </w:r>
-          </w:p>
-        </w:tc>
-      </w:tr>
-    </w:tbl>
-    <w:p/>
+    <w:p>
+      <w:pPr>
+        <w:rPr>
+          <w:lang w:val="en-US"/>
+        </w:rPr>
+      </w:pPr>
+    </w:p>
     <w:sectPr>
       <w:pgSz w:w="11906" w:h="16838"/>
       <w:pgMar w:top="1417" w:right="1701" w:bottom="1417" w:left="1701" w:header="708" w:footer="708" w:gutter="0"/>
@@ -5535,7 +5531,7 @@
   <w:style w:type="paragraph" w:default="1" w:styleId="Normal">
     <w:name w:val="Normal"/>
     <w:qFormat/>
-    <w:rsid w:val="00A508B6"/>
+    <w:rsid w:val="00801B30"/>
     <w:pPr>
       <w:spacing w:after="0" w:line="276" w:lineRule="auto"/>
     </w:pPr>
@@ -6151,6 +6147,88 @@
     <w:basedOn w:val="Fontepargpadro"/>
     <w:rsid w:val="00A508B6"/>
   </w:style>
+  <w:style w:type="table" w:styleId="Tabelacomgrade">
+    <w:name w:val="Table Grid"/>
+    <w:basedOn w:val="Tabelanormal"/>
+    <w:uiPriority w:val="39"/>
+    <w:rsid w:val="00E37125"/>
+    <w:pPr>
+      <w:spacing w:after="0" w:line="240" w:lineRule="auto"/>
+    </w:pPr>
+    <w:tblPr>
+      <w:tblBorders>
+        <w:top w:val="single" w:sz="4" w:space="0" w:color="auto"/>
+        <w:left w:val="single" w:sz="4" w:space="0" w:color="auto"/>
+        <w:bottom w:val="single" w:sz="4" w:space="0" w:color="auto"/>
+        <w:right w:val="single" w:sz="4" w:space="0" w:color="auto"/>
+        <w:insideH w:val="single" w:sz="4" w:space="0" w:color="auto"/>
+        <w:insideV w:val="single" w:sz="4" w:space="0" w:color="auto"/>
+      </w:tblBorders>
+    </w:tblPr>
+  </w:style>
+  <w:style w:type="table" w:styleId="SimplesTabela1">
+    <w:name w:val="Plain Table 1"/>
+    <w:basedOn w:val="Tabelanormal"/>
+    <w:uiPriority w:val="41"/>
+    <w:rsid w:val="0047070A"/>
+    <w:pPr>
+      <w:spacing w:after="0" w:line="240" w:lineRule="auto"/>
+    </w:pPr>
+    <w:tblPr>
+      <w:tblStyleRowBandSize w:val="1"/>
+      <w:tblStyleColBandSize w:val="1"/>
+      <w:tblBorders>
+        <w:top w:val="single" w:sz="4" w:space="0" w:color="BFBFBF" w:themeColor="background1" w:themeShade="BF"/>
+        <w:left w:val="single" w:sz="4" w:space="0" w:color="BFBFBF" w:themeColor="background1" w:themeShade="BF"/>
+        <w:bottom w:val="single" w:sz="4" w:space="0" w:color="BFBFBF" w:themeColor="background1" w:themeShade="BF"/>
+        <w:right w:val="single" w:sz="4" w:space="0" w:color="BFBFBF" w:themeColor="background1" w:themeShade="BF"/>
+        <w:insideH w:val="single" w:sz="4" w:space="0" w:color="BFBFBF" w:themeColor="background1" w:themeShade="BF"/>
+        <w:insideV w:val="single" w:sz="4" w:space="0" w:color="BFBFBF" w:themeColor="background1" w:themeShade="BF"/>
+      </w:tblBorders>
+    </w:tblPr>
+    <w:tblStylePr w:type="firstRow">
+      <w:rPr>
+        <w:b/>
+        <w:bCs/>
+      </w:rPr>
+    </w:tblStylePr>
+    <w:tblStylePr w:type="lastRow">
+      <w:rPr>
+        <w:b/>
+        <w:bCs/>
+      </w:rPr>
+      <w:tblPr/>
+      <w:tcPr>
+        <w:tcBorders>
+          <w:top w:val="double" w:sz="4" w:space="0" w:color="BFBFBF" w:themeColor="background1" w:themeShade="BF"/>
+        </w:tcBorders>
+      </w:tcPr>
+    </w:tblStylePr>
+    <w:tblStylePr w:type="firstCol">
+      <w:rPr>
+        <w:b/>
+        <w:bCs/>
+      </w:rPr>
+    </w:tblStylePr>
+    <w:tblStylePr w:type="lastCol">
+      <w:rPr>
+        <w:b/>
+        <w:bCs/>
+      </w:rPr>
+    </w:tblStylePr>
+    <w:tblStylePr w:type="band1Vert">
+      <w:tblPr/>
+      <w:tcPr>
+        <w:shd w:val="clear" w:color="auto" w:fill="F2F2F2" w:themeFill="background1" w:themeFillShade="F2"/>
+      </w:tcPr>
+    </w:tblStylePr>
+    <w:tblStylePr w:type="band1Horz">
+      <w:tblPr/>
+      <w:tcPr>
+        <w:shd w:val="clear" w:color="auto" w:fill="F2F2F2" w:themeFill="background1" w:themeFillShade="F2"/>
+      </w:tcPr>
+    </w:tblStylePr>
+  </w:style>
 </w:styles>
 </file>
 

</xml_diff>

<commit_message>
Update microorganism protocol template
</commit_message>
<xml_diff>
--- a/src/assets/protocol/template_protocolo_microrganismos.docx
+++ b/src/assets/protocol/template_protocolo_microrganismos.docx
@@ -113,15 +113,7 @@
                 <w:b/>
                 <w:bCs/>
               </w:rPr>
-              <w:t xml:space="preserve">}}  </w:t>
-            </w:r>
-            <w:r>
-              <w:rPr>
-                <w:rFonts w:ascii="Calibri" w:eastAsia="Calibri" w:hAnsi="Calibri" w:cs="Calibri"/>
-                <w:b/>
-                <w:bCs/>
-              </w:rPr>
-              <w:t xml:space="preserve"> </w:t>
+              <w:t xml:space="preserve">}}   </w:t>
             </w:r>
             <w:proofErr w:type="gramEnd"/>
             <w:r>
@@ -337,26 +329,7 @@
                 <w:sz w:val="18"/>
                 <w:szCs w:val="18"/>
               </w:rPr>
-              <w:t># Óxido de grafeno</w:t>
-            </w:r>
-          </w:p>
-          <w:p>
-            <w:pPr>
-              <w:keepLines/>
-              <w:spacing w:line="240" w:lineRule="auto"/>
-              <w:rPr>
-                <w:rFonts w:ascii="Calibri" w:eastAsia="Calibri" w:hAnsi="Calibri" w:cs="Calibri"/>
-                <w:sz w:val="18"/>
-                <w:szCs w:val="18"/>
-              </w:rPr>
-            </w:pPr>
-            <w:r>
-              <w:rPr>
-                <w:rFonts w:ascii="Calibri" w:eastAsia="Calibri" w:hAnsi="Calibri" w:cs="Calibri"/>
-                <w:sz w:val="18"/>
-                <w:szCs w:val="18"/>
-              </w:rPr>
-              <w:t>#tempo: 57 minutos</w:t>
+              <w:t xml:space="preserve"># Óxido de grafeno </w:t>
             </w:r>
           </w:p>
           <w:p>
@@ -942,42 +915,6 @@
                 <w:sz w:val="18"/>
                 <w:szCs w:val="18"/>
               </w:rPr>
-              <w:t>#tempo: 0:51</w:t>
-            </w:r>
-          </w:p>
-          <w:p>
-            <w:pPr>
-              <w:spacing w:line="240" w:lineRule="auto"/>
-              <w:rPr>
-                <w:rFonts w:ascii="Calibri" w:eastAsia="Calibri" w:hAnsi="Calibri" w:cs="Calibri"/>
-                <w:sz w:val="18"/>
-                <w:szCs w:val="18"/>
-              </w:rPr>
-            </w:pPr>
-            <w:r>
-              <w:rPr>
-                <w:rFonts w:ascii="Calibri" w:eastAsia="Calibri" w:hAnsi="Calibri" w:cs="Calibri"/>
-                <w:sz w:val="18"/>
-                <w:szCs w:val="18"/>
-              </w:rPr>
-              <w:t>#usar em POSITIVO</w:t>
-            </w:r>
-          </w:p>
-          <w:p>
-            <w:pPr>
-              <w:spacing w:line="240" w:lineRule="auto"/>
-              <w:rPr>
-                <w:rFonts w:ascii="Calibri" w:eastAsia="Calibri" w:hAnsi="Calibri" w:cs="Calibri"/>
-                <w:sz w:val="18"/>
-                <w:szCs w:val="18"/>
-              </w:rPr>
-            </w:pPr>
-            <w:r>
-              <w:rPr>
-                <w:rFonts w:ascii="Calibri" w:eastAsia="Calibri" w:hAnsi="Calibri" w:cs="Calibri"/>
-                <w:sz w:val="18"/>
-                <w:szCs w:val="18"/>
-              </w:rPr>
               <w:t>1004.5, 180</w:t>
             </w:r>
           </w:p>
@@ -1685,102 +1622,64 @@
                 <w:sz w:val="18"/>
                 <w:szCs w:val="18"/>
               </w:rPr>
+              <w:t>312, 360</w:t>
+            </w:r>
+          </w:p>
+          <w:p>
+            <w:pPr>
+              <w:keepLines/>
+              <w:spacing w:line="240" w:lineRule="auto"/>
+              <w:rPr>
+                <w:rFonts w:ascii="Calibri" w:eastAsia="Calibri" w:hAnsi="Calibri" w:cs="Calibri"/>
+                <w:sz w:val="18"/>
+                <w:szCs w:val="18"/>
+              </w:rPr>
+            </w:pPr>
+            <w:r>
+              <w:rPr>
+                <w:rFonts w:ascii="Calibri" w:eastAsia="Calibri" w:hAnsi="Calibri" w:cs="Calibri"/>
+                <w:sz w:val="18"/>
+                <w:szCs w:val="18"/>
+              </w:rPr>
+              <w:t>145, 360</w:t>
+            </w:r>
+          </w:p>
+          <w:p>
+            <w:pPr>
+              <w:keepLines/>
+              <w:spacing w:line="240" w:lineRule="auto"/>
+              <w:rPr>
+                <w:rFonts w:ascii="Calibri" w:eastAsia="Calibri" w:hAnsi="Calibri" w:cs="Calibri"/>
+                <w:sz w:val="18"/>
+                <w:szCs w:val="18"/>
+              </w:rPr>
+            </w:pPr>
+            <w:r>
+              <w:rPr>
+                <w:rFonts w:ascii="Calibri" w:eastAsia="Calibri" w:hAnsi="Calibri" w:cs="Calibri"/>
+                <w:sz w:val="18"/>
+                <w:szCs w:val="18"/>
+              </w:rPr>
+              <w:t>566, 360</w:t>
+            </w:r>
+          </w:p>
+          <w:p>
+            <w:pPr>
+              <w:keepLines/>
+              <w:spacing w:line="240" w:lineRule="auto"/>
+              <w:rPr>
+                <w:rFonts w:ascii="Calibri" w:eastAsia="Calibri" w:hAnsi="Calibri" w:cs="Calibri"/>
+                <w:sz w:val="18"/>
+                <w:szCs w:val="18"/>
+              </w:rPr>
+            </w:pPr>
+            <w:r>
+              <w:rPr>
+                <w:rFonts w:ascii="Calibri" w:eastAsia="Calibri" w:hAnsi="Calibri" w:cs="Calibri"/>
+                <w:sz w:val="18"/>
+                <w:szCs w:val="18"/>
+              </w:rPr>
               <w:lastRenderedPageBreak/>
-              <w:t># Tempo: 60 minutos</w:t>
-            </w:r>
-          </w:p>
-          <w:p>
-            <w:pPr>
-              <w:keepLines/>
-              <w:spacing w:line="240" w:lineRule="auto"/>
-              <w:rPr>
-                <w:rFonts w:ascii="Calibri" w:eastAsia="Calibri" w:hAnsi="Calibri" w:cs="Calibri"/>
-                <w:sz w:val="18"/>
-                <w:szCs w:val="18"/>
-              </w:rPr>
-            </w:pPr>
-            <w:r>
-              <w:rPr>
-                <w:rFonts w:ascii="Calibri" w:eastAsia="Calibri" w:hAnsi="Calibri" w:cs="Calibri"/>
-                <w:sz w:val="18"/>
-                <w:szCs w:val="18"/>
-              </w:rPr>
-              <w:t># Usar em offset Negativo</w:t>
-            </w:r>
-          </w:p>
-          <w:p>
-            <w:pPr>
-              <w:keepLines/>
-              <w:spacing w:line="240" w:lineRule="auto"/>
-              <w:rPr>
-                <w:rFonts w:ascii="Calibri" w:eastAsia="Calibri" w:hAnsi="Calibri" w:cs="Calibri"/>
-                <w:sz w:val="18"/>
-                <w:szCs w:val="18"/>
-              </w:rPr>
-            </w:pPr>
-            <w:r>
-              <w:rPr>
-                <w:rFonts w:ascii="Calibri" w:eastAsia="Calibri" w:hAnsi="Calibri" w:cs="Calibri"/>
-                <w:sz w:val="18"/>
-                <w:szCs w:val="18"/>
-              </w:rPr>
-              <w:t>312, 360</w:t>
-            </w:r>
-          </w:p>
-          <w:p>
-            <w:pPr>
-              <w:keepLines/>
-              <w:spacing w:line="240" w:lineRule="auto"/>
-              <w:rPr>
-                <w:rFonts w:ascii="Calibri" w:eastAsia="Calibri" w:hAnsi="Calibri" w:cs="Calibri"/>
-                <w:sz w:val="18"/>
-                <w:szCs w:val="18"/>
-              </w:rPr>
-            </w:pPr>
-            <w:r>
-              <w:rPr>
-                <w:rFonts w:ascii="Calibri" w:eastAsia="Calibri" w:hAnsi="Calibri" w:cs="Calibri"/>
-                <w:sz w:val="18"/>
-                <w:szCs w:val="18"/>
-              </w:rPr>
-              <w:t>145, 360</w:t>
-            </w:r>
-          </w:p>
-          <w:p>
-            <w:pPr>
-              <w:keepLines/>
-              <w:spacing w:line="240" w:lineRule="auto"/>
-              <w:rPr>
-                <w:rFonts w:ascii="Calibri" w:eastAsia="Calibri" w:hAnsi="Calibri" w:cs="Calibri"/>
-                <w:sz w:val="18"/>
-                <w:szCs w:val="18"/>
-              </w:rPr>
-            </w:pPr>
-            <w:r>
-              <w:rPr>
-                <w:rFonts w:ascii="Calibri" w:eastAsia="Calibri" w:hAnsi="Calibri" w:cs="Calibri"/>
-                <w:sz w:val="18"/>
-                <w:szCs w:val="18"/>
-              </w:rPr>
-              <w:t>566, 360</w:t>
-            </w:r>
-          </w:p>
-          <w:p>
-            <w:pPr>
-              <w:keepLines/>
-              <w:spacing w:line="240" w:lineRule="auto"/>
-              <w:rPr>
-                <w:rFonts w:ascii="Calibri" w:eastAsia="Calibri" w:hAnsi="Calibri" w:cs="Calibri"/>
-                <w:sz w:val="18"/>
-                <w:szCs w:val="18"/>
-              </w:rPr>
-            </w:pPr>
-            <w:r>
-              <w:rPr>
-                <w:rFonts w:ascii="Calibri" w:eastAsia="Calibri" w:hAnsi="Calibri" w:cs="Calibri"/>
-                <w:sz w:val="18"/>
-                <w:szCs w:val="18"/>
-              </w:rPr>
               <w:t>1287, 360</w:t>
             </w:r>
           </w:p>
@@ -2108,6 +2007,7 @@
           <w:p>
             <w:pPr>
               <w:widowControl w:val="0"/>
+              <w:spacing w:line="240" w:lineRule="auto"/>
               <w:rPr>
                 <w:rFonts w:ascii="Calibri" w:eastAsia="Calibri" w:hAnsi="Calibri" w:cs="Calibri"/>
                 <w:sz w:val="18"/>
@@ -2126,186 +2026,178 @@
           <w:p>
             <w:pPr>
               <w:widowControl w:val="0"/>
-              <w:rPr>
-                <w:rFonts w:ascii="Calibri" w:eastAsia="Calibri" w:hAnsi="Calibri" w:cs="Calibri"/>
-                <w:sz w:val="18"/>
-                <w:szCs w:val="18"/>
-              </w:rPr>
-            </w:pPr>
-            <w:r>
-              <w:rPr>
-                <w:rFonts w:ascii="Calibri" w:eastAsia="Calibri" w:hAnsi="Calibri" w:cs="Calibri"/>
-                <w:sz w:val="18"/>
-                <w:szCs w:val="18"/>
-              </w:rPr>
-              <w:t># tempo: (30min) </w:t>
+              <w:spacing w:line="240" w:lineRule="auto"/>
+              <w:rPr>
+                <w:rFonts w:ascii="Calibri" w:eastAsia="Calibri" w:hAnsi="Calibri" w:cs="Calibri"/>
+                <w:sz w:val="18"/>
+                <w:szCs w:val="18"/>
+              </w:rPr>
+            </w:pPr>
+            <w:r>
+              <w:rPr>
+                <w:rFonts w:ascii="Calibri" w:eastAsia="Calibri" w:hAnsi="Calibri" w:cs="Calibri"/>
+                <w:sz w:val="18"/>
+                <w:szCs w:val="18"/>
+              </w:rPr>
+              <w:t>150, 180</w:t>
             </w:r>
           </w:p>
           <w:p>
             <w:pPr>
               <w:widowControl w:val="0"/>
-              <w:rPr>
-                <w:rFonts w:ascii="Calibri" w:eastAsia="Calibri" w:hAnsi="Calibri" w:cs="Calibri"/>
-                <w:sz w:val="18"/>
-                <w:szCs w:val="18"/>
-              </w:rPr>
-            </w:pPr>
-            <w:r>
-              <w:rPr>
-                <w:rFonts w:ascii="Calibri" w:eastAsia="Calibri" w:hAnsi="Calibri" w:cs="Calibri"/>
-                <w:sz w:val="18"/>
-                <w:szCs w:val="18"/>
-              </w:rPr>
-              <w:t>150, 180</w:t>
+              <w:spacing w:line="240" w:lineRule="auto"/>
+              <w:rPr>
+                <w:rFonts w:ascii="Calibri" w:eastAsia="Calibri" w:hAnsi="Calibri" w:cs="Calibri"/>
+                <w:sz w:val="18"/>
+                <w:szCs w:val="18"/>
+              </w:rPr>
+            </w:pPr>
+            <w:r>
+              <w:rPr>
+                <w:rFonts w:ascii="Calibri" w:eastAsia="Calibri" w:hAnsi="Calibri" w:cs="Calibri"/>
+                <w:sz w:val="18"/>
+                <w:szCs w:val="18"/>
+              </w:rPr>
+              <w:t>250, 180</w:t>
             </w:r>
           </w:p>
           <w:p>
             <w:pPr>
               <w:widowControl w:val="0"/>
-              <w:rPr>
-                <w:rFonts w:ascii="Calibri" w:eastAsia="Calibri" w:hAnsi="Calibri" w:cs="Calibri"/>
-                <w:sz w:val="18"/>
-                <w:szCs w:val="18"/>
-              </w:rPr>
-            </w:pPr>
-            <w:r>
-              <w:rPr>
-                <w:rFonts w:ascii="Calibri" w:eastAsia="Calibri" w:hAnsi="Calibri" w:cs="Calibri"/>
-                <w:sz w:val="18"/>
-                <w:szCs w:val="18"/>
-              </w:rPr>
-              <w:t>250, 180</w:t>
+              <w:spacing w:line="240" w:lineRule="auto"/>
+              <w:rPr>
+                <w:rFonts w:ascii="Calibri" w:eastAsia="Calibri" w:hAnsi="Calibri" w:cs="Calibri"/>
+                <w:sz w:val="18"/>
+                <w:szCs w:val="18"/>
+              </w:rPr>
+            </w:pPr>
+            <w:r>
+              <w:rPr>
+                <w:rFonts w:ascii="Calibri" w:eastAsia="Calibri" w:hAnsi="Calibri" w:cs="Calibri"/>
+                <w:sz w:val="18"/>
+                <w:szCs w:val="18"/>
+              </w:rPr>
+              <w:t>567.2, 180</w:t>
             </w:r>
           </w:p>
           <w:p>
             <w:pPr>
               <w:widowControl w:val="0"/>
-              <w:rPr>
-                <w:rFonts w:ascii="Calibri" w:eastAsia="Calibri" w:hAnsi="Calibri" w:cs="Calibri"/>
-                <w:sz w:val="18"/>
-                <w:szCs w:val="18"/>
-              </w:rPr>
-            </w:pPr>
-            <w:r>
-              <w:rPr>
-                <w:rFonts w:ascii="Calibri" w:eastAsia="Calibri" w:hAnsi="Calibri" w:cs="Calibri"/>
-                <w:sz w:val="18"/>
-                <w:szCs w:val="18"/>
-              </w:rPr>
-              <w:t>567.2, 180</w:t>
+              <w:spacing w:line="240" w:lineRule="auto"/>
+              <w:rPr>
+                <w:rFonts w:ascii="Calibri" w:eastAsia="Calibri" w:hAnsi="Calibri" w:cs="Calibri"/>
+                <w:sz w:val="18"/>
+                <w:szCs w:val="18"/>
+              </w:rPr>
+            </w:pPr>
+            <w:r>
+              <w:rPr>
+                <w:rFonts w:ascii="Calibri" w:eastAsia="Calibri" w:hAnsi="Calibri" w:cs="Calibri"/>
+                <w:sz w:val="18"/>
+                <w:szCs w:val="18"/>
+              </w:rPr>
+              <w:t>743.2, 180</w:t>
             </w:r>
           </w:p>
           <w:p>
             <w:pPr>
               <w:widowControl w:val="0"/>
-              <w:rPr>
-                <w:rFonts w:ascii="Calibri" w:eastAsia="Calibri" w:hAnsi="Calibri" w:cs="Calibri"/>
-                <w:sz w:val="18"/>
-                <w:szCs w:val="18"/>
-              </w:rPr>
-            </w:pPr>
-            <w:r>
-              <w:rPr>
-                <w:rFonts w:ascii="Calibri" w:eastAsia="Calibri" w:hAnsi="Calibri" w:cs="Calibri"/>
-                <w:sz w:val="18"/>
-                <w:szCs w:val="18"/>
-              </w:rPr>
-              <w:t>743.2, 180</w:t>
+              <w:spacing w:line="240" w:lineRule="auto"/>
+              <w:rPr>
+                <w:rFonts w:ascii="Calibri" w:eastAsia="Calibri" w:hAnsi="Calibri" w:cs="Calibri"/>
+                <w:sz w:val="18"/>
+                <w:szCs w:val="18"/>
+              </w:rPr>
+            </w:pPr>
+            <w:r>
+              <w:rPr>
+                <w:rFonts w:ascii="Calibri" w:eastAsia="Calibri" w:hAnsi="Calibri" w:cs="Calibri"/>
+                <w:sz w:val="18"/>
+                <w:szCs w:val="18"/>
+              </w:rPr>
+              <w:t>951, 180</w:t>
             </w:r>
           </w:p>
           <w:p>
             <w:pPr>
               <w:widowControl w:val="0"/>
-              <w:rPr>
-                <w:rFonts w:ascii="Calibri" w:eastAsia="Calibri" w:hAnsi="Calibri" w:cs="Calibri"/>
-                <w:sz w:val="18"/>
-                <w:szCs w:val="18"/>
-              </w:rPr>
-            </w:pPr>
-            <w:r>
-              <w:rPr>
-                <w:rFonts w:ascii="Calibri" w:eastAsia="Calibri" w:hAnsi="Calibri" w:cs="Calibri"/>
-                <w:sz w:val="18"/>
-                <w:szCs w:val="18"/>
-              </w:rPr>
-              <w:t>951, 180</w:t>
+              <w:spacing w:line="240" w:lineRule="auto"/>
+              <w:rPr>
+                <w:rFonts w:ascii="Calibri" w:eastAsia="Calibri" w:hAnsi="Calibri" w:cs="Calibri"/>
+                <w:sz w:val="18"/>
+                <w:szCs w:val="18"/>
+              </w:rPr>
+            </w:pPr>
+            <w:r>
+              <w:rPr>
+                <w:rFonts w:ascii="Calibri" w:eastAsia="Calibri" w:hAnsi="Calibri" w:cs="Calibri"/>
+                <w:sz w:val="18"/>
+                <w:szCs w:val="18"/>
+              </w:rPr>
+              <w:t>960, 180</w:t>
             </w:r>
           </w:p>
           <w:p>
             <w:pPr>
               <w:widowControl w:val="0"/>
-              <w:rPr>
-                <w:rFonts w:ascii="Calibri" w:eastAsia="Calibri" w:hAnsi="Calibri" w:cs="Calibri"/>
-                <w:sz w:val="18"/>
-                <w:szCs w:val="18"/>
-              </w:rPr>
-            </w:pPr>
-            <w:r>
-              <w:rPr>
-                <w:rFonts w:ascii="Calibri" w:eastAsia="Calibri" w:hAnsi="Calibri" w:cs="Calibri"/>
-                <w:sz w:val="18"/>
-                <w:szCs w:val="18"/>
-              </w:rPr>
-              <w:t>960, 180</w:t>
+              <w:spacing w:line="240" w:lineRule="auto"/>
+              <w:rPr>
+                <w:rFonts w:ascii="Calibri" w:eastAsia="Calibri" w:hAnsi="Calibri" w:cs="Calibri"/>
+                <w:sz w:val="18"/>
+                <w:szCs w:val="18"/>
+              </w:rPr>
+            </w:pPr>
+            <w:r>
+              <w:rPr>
+                <w:rFonts w:ascii="Calibri" w:eastAsia="Calibri" w:hAnsi="Calibri" w:cs="Calibri"/>
+                <w:sz w:val="18"/>
+                <w:szCs w:val="18"/>
+              </w:rPr>
+              <w:t>970.3, 180</w:t>
             </w:r>
           </w:p>
           <w:p>
             <w:pPr>
               <w:widowControl w:val="0"/>
-              <w:rPr>
-                <w:rFonts w:ascii="Calibri" w:eastAsia="Calibri" w:hAnsi="Calibri" w:cs="Calibri"/>
-                <w:sz w:val="18"/>
-                <w:szCs w:val="18"/>
-              </w:rPr>
-            </w:pPr>
-            <w:r>
-              <w:rPr>
-                <w:rFonts w:ascii="Calibri" w:eastAsia="Calibri" w:hAnsi="Calibri" w:cs="Calibri"/>
-                <w:sz w:val="18"/>
-                <w:szCs w:val="18"/>
-              </w:rPr>
-              <w:t>970.3, 180</w:t>
+              <w:spacing w:line="240" w:lineRule="auto"/>
+              <w:rPr>
+                <w:rFonts w:ascii="Calibri" w:eastAsia="Calibri" w:hAnsi="Calibri" w:cs="Calibri"/>
+                <w:sz w:val="18"/>
+                <w:szCs w:val="18"/>
+              </w:rPr>
+            </w:pPr>
+            <w:r>
+              <w:rPr>
+                <w:rFonts w:ascii="Calibri" w:eastAsia="Calibri" w:hAnsi="Calibri" w:cs="Calibri"/>
+                <w:sz w:val="18"/>
+                <w:szCs w:val="18"/>
+              </w:rPr>
+              <w:t>978.1, 180</w:t>
             </w:r>
           </w:p>
           <w:p>
             <w:pPr>
               <w:widowControl w:val="0"/>
-              <w:rPr>
-                <w:rFonts w:ascii="Calibri" w:eastAsia="Calibri" w:hAnsi="Calibri" w:cs="Calibri"/>
-                <w:sz w:val="18"/>
-                <w:szCs w:val="18"/>
-              </w:rPr>
-            </w:pPr>
-            <w:r>
-              <w:rPr>
-                <w:rFonts w:ascii="Calibri" w:eastAsia="Calibri" w:hAnsi="Calibri" w:cs="Calibri"/>
-                <w:sz w:val="18"/>
-                <w:szCs w:val="18"/>
-              </w:rPr>
-              <w:t>978.1, 180</w:t>
+              <w:spacing w:line="240" w:lineRule="auto"/>
+              <w:rPr>
+                <w:rFonts w:ascii="Calibri" w:eastAsia="Calibri" w:hAnsi="Calibri" w:cs="Calibri"/>
+                <w:sz w:val="18"/>
+                <w:szCs w:val="18"/>
+              </w:rPr>
+            </w:pPr>
+            <w:r>
+              <w:rPr>
+                <w:rFonts w:ascii="Calibri" w:eastAsia="Calibri" w:hAnsi="Calibri" w:cs="Calibri"/>
+                <w:sz w:val="18"/>
+                <w:szCs w:val="18"/>
+              </w:rPr>
+              <w:t>984, 180</w:t>
             </w:r>
           </w:p>
           <w:p>
             <w:pPr>
               <w:widowControl w:val="0"/>
-              <w:rPr>
-                <w:rFonts w:ascii="Calibri" w:eastAsia="Calibri" w:hAnsi="Calibri" w:cs="Calibri"/>
-                <w:sz w:val="18"/>
-                <w:szCs w:val="18"/>
-              </w:rPr>
-            </w:pPr>
-            <w:r>
-              <w:rPr>
-                <w:rFonts w:ascii="Calibri" w:eastAsia="Calibri" w:hAnsi="Calibri" w:cs="Calibri"/>
-                <w:sz w:val="18"/>
-                <w:szCs w:val="18"/>
-              </w:rPr>
-              <w:t>984, 180</w:t>
-            </w:r>
-          </w:p>
-          <w:p>
-            <w:pPr>
-              <w:widowControl w:val="0"/>
+              <w:spacing w:line="240" w:lineRule="auto"/>
               <w:rPr>
                 <w:rFonts w:ascii="Calibri" w:eastAsia="Calibri" w:hAnsi="Calibri" w:cs="Calibri"/>
                 <w:sz w:val="18"/>
@@ -2368,44 +2260,6 @@
                 <w:szCs w:val="18"/>
               </w:rPr>
               <w:t># Tomar bastante água no decorrer da sessão</w:t>
-            </w:r>
-          </w:p>
-          <w:p>
-            <w:pPr>
-              <w:keepLines/>
-              <w:spacing w:line="240" w:lineRule="auto"/>
-              <w:rPr>
-                <w:rFonts w:ascii="Calibri" w:eastAsia="Calibri" w:hAnsi="Calibri" w:cs="Calibri"/>
-                <w:sz w:val="18"/>
-                <w:szCs w:val="18"/>
-              </w:rPr>
-            </w:pPr>
-            <w:r>
-              <w:rPr>
-                <w:rFonts w:ascii="Calibri" w:eastAsia="Calibri" w:hAnsi="Calibri" w:cs="Calibri"/>
-                <w:sz w:val="18"/>
-                <w:szCs w:val="18"/>
-              </w:rPr>
-              <w:t># Tempo: 30 minutos</w:t>
-            </w:r>
-          </w:p>
-          <w:p>
-            <w:pPr>
-              <w:keepLines/>
-              <w:spacing w:line="240" w:lineRule="auto"/>
-              <w:rPr>
-                <w:rFonts w:ascii="Calibri" w:eastAsia="Calibri" w:hAnsi="Calibri" w:cs="Calibri"/>
-                <w:sz w:val="18"/>
-                <w:szCs w:val="18"/>
-              </w:rPr>
-            </w:pPr>
-            <w:r>
-              <w:rPr>
-                <w:rFonts w:ascii="Calibri" w:eastAsia="Calibri" w:hAnsi="Calibri" w:cs="Calibri"/>
-                <w:sz w:val="18"/>
-                <w:szCs w:val="18"/>
-              </w:rPr>
-              <w:t># Usar em offset Negativo</w:t>
             </w:r>
           </w:p>
           <w:p>
@@ -3227,187 +3081,187 @@
                 <w:sz w:val="18"/>
                 <w:szCs w:val="18"/>
               </w:rPr>
+              <w:t>742, 180</w:t>
+            </w:r>
+          </w:p>
+          <w:p>
+            <w:pPr>
+              <w:spacing w:line="240" w:lineRule="auto"/>
+              <w:rPr>
+                <w:rFonts w:ascii="Calibri" w:eastAsia="Calibri" w:hAnsi="Calibri" w:cs="Calibri"/>
+                <w:sz w:val="18"/>
+                <w:szCs w:val="18"/>
+              </w:rPr>
+            </w:pPr>
+            <w:r>
+              <w:rPr>
+                <w:rFonts w:ascii="Calibri" w:eastAsia="Calibri" w:hAnsi="Calibri" w:cs="Calibri"/>
+                <w:sz w:val="18"/>
+                <w:szCs w:val="18"/>
+              </w:rPr>
+              <w:t>418, 180</w:t>
+            </w:r>
+          </w:p>
+          <w:p>
+            <w:pPr>
+              <w:spacing w:line="240" w:lineRule="auto"/>
+              <w:rPr>
+                <w:rFonts w:ascii="Calibri" w:eastAsia="Calibri" w:hAnsi="Calibri" w:cs="Calibri"/>
+                <w:sz w:val="18"/>
+                <w:szCs w:val="18"/>
+              </w:rPr>
+            </w:pPr>
+            <w:r>
+              <w:rPr>
+                <w:rFonts w:ascii="Calibri" w:eastAsia="Calibri" w:hAnsi="Calibri" w:cs="Calibri"/>
+                <w:sz w:val="18"/>
+                <w:szCs w:val="18"/>
+              </w:rPr>
+              <w:t>320, 180</w:t>
+            </w:r>
+          </w:p>
+          <w:p>
+            <w:pPr>
+              <w:spacing w:line="240" w:lineRule="auto"/>
+              <w:rPr>
+                <w:rFonts w:ascii="Calibri" w:eastAsia="Calibri" w:hAnsi="Calibri" w:cs="Calibri"/>
+                <w:sz w:val="18"/>
+                <w:szCs w:val="18"/>
+              </w:rPr>
+            </w:pPr>
+            <w:r>
+              <w:rPr>
+                <w:rFonts w:ascii="Calibri" w:eastAsia="Calibri" w:hAnsi="Calibri" w:cs="Calibri"/>
+                <w:sz w:val="18"/>
+                <w:szCs w:val="18"/>
+              </w:rPr>
+              <w:t>669, 180</w:t>
+            </w:r>
+          </w:p>
+          <w:p>
+            <w:pPr>
+              <w:spacing w:line="240" w:lineRule="auto"/>
+              <w:rPr>
+                <w:rFonts w:ascii="Calibri" w:eastAsia="Calibri" w:hAnsi="Calibri" w:cs="Calibri"/>
+                <w:sz w:val="18"/>
+                <w:szCs w:val="18"/>
+              </w:rPr>
+            </w:pPr>
+            <w:r>
+              <w:rPr>
+                <w:rFonts w:ascii="Calibri" w:eastAsia="Calibri" w:hAnsi="Calibri" w:cs="Calibri"/>
+                <w:sz w:val="18"/>
+                <w:szCs w:val="18"/>
+              </w:rPr>
+              <w:t>33, 180</w:t>
+            </w:r>
+          </w:p>
+          <w:p>
+            <w:pPr>
+              <w:spacing w:line="240" w:lineRule="auto"/>
+              <w:rPr>
+                <w:rFonts w:ascii="Calibri" w:eastAsia="Calibri" w:hAnsi="Calibri" w:cs="Calibri"/>
+                <w:sz w:val="18"/>
+                <w:szCs w:val="18"/>
+              </w:rPr>
+            </w:pPr>
+            <w:r>
+              <w:rPr>
+                <w:rFonts w:ascii="Calibri" w:eastAsia="Calibri" w:hAnsi="Calibri" w:cs="Calibri"/>
+                <w:sz w:val="18"/>
+                <w:szCs w:val="18"/>
+              </w:rPr>
+              <w:t>433, 180</w:t>
+            </w:r>
+          </w:p>
+          <w:p>
+            <w:pPr>
+              <w:spacing w:line="240" w:lineRule="auto"/>
+              <w:rPr>
+                <w:rFonts w:ascii="Calibri" w:eastAsia="Calibri" w:hAnsi="Calibri" w:cs="Calibri"/>
+                <w:sz w:val="18"/>
+                <w:szCs w:val="18"/>
+              </w:rPr>
+            </w:pPr>
+            <w:r>
+              <w:rPr>
+                <w:rFonts w:ascii="Calibri" w:eastAsia="Calibri" w:hAnsi="Calibri" w:cs="Calibri"/>
+                <w:sz w:val="18"/>
+                <w:szCs w:val="18"/>
+              </w:rPr>
+              <w:t>877, 180</w:t>
+            </w:r>
+          </w:p>
+          <w:p>
+            <w:pPr>
+              <w:spacing w:line="240" w:lineRule="auto"/>
+              <w:rPr>
+                <w:rFonts w:ascii="Calibri" w:eastAsia="Calibri" w:hAnsi="Calibri" w:cs="Calibri"/>
+                <w:sz w:val="18"/>
+                <w:szCs w:val="18"/>
+              </w:rPr>
+            </w:pPr>
+            <w:r>
+              <w:rPr>
+                <w:rFonts w:ascii="Calibri" w:eastAsia="Calibri" w:hAnsi="Calibri" w:cs="Calibri"/>
+                <w:sz w:val="18"/>
+                <w:szCs w:val="18"/>
+              </w:rPr>
+              <w:t>522, 180</w:t>
+            </w:r>
+          </w:p>
+          <w:p>
+            <w:pPr>
+              <w:spacing w:line="240" w:lineRule="auto"/>
+              <w:rPr>
+                <w:rFonts w:ascii="Calibri" w:eastAsia="Calibri" w:hAnsi="Calibri" w:cs="Calibri"/>
+                <w:sz w:val="18"/>
+                <w:szCs w:val="18"/>
+              </w:rPr>
+            </w:pPr>
+            <w:r>
+              <w:rPr>
+                <w:rFonts w:ascii="Calibri" w:eastAsia="Calibri" w:hAnsi="Calibri" w:cs="Calibri"/>
+                <w:sz w:val="18"/>
+                <w:szCs w:val="18"/>
+              </w:rPr>
+              <w:t>1044, 180</w:t>
+            </w:r>
+          </w:p>
+          <w:p>
+            <w:pPr>
+              <w:spacing w:line="240" w:lineRule="auto"/>
+              <w:rPr>
+                <w:rFonts w:ascii="Calibri" w:eastAsia="Calibri" w:hAnsi="Calibri" w:cs="Calibri"/>
+                <w:sz w:val="18"/>
+                <w:szCs w:val="18"/>
+              </w:rPr>
+            </w:pPr>
+            <w:r>
+              <w:rPr>
+                <w:rFonts w:ascii="Calibri" w:eastAsia="Calibri" w:hAnsi="Calibri" w:cs="Calibri"/>
+                <w:sz w:val="18"/>
+                <w:szCs w:val="18"/>
+              </w:rPr>
+              <w:t>397, 180</w:t>
+            </w:r>
+          </w:p>
+          <w:p>
+            <w:pPr>
+              <w:spacing w:line="240" w:lineRule="auto"/>
+              <w:rPr>
+                <w:rFonts w:ascii="Calibri" w:eastAsia="Calibri" w:hAnsi="Calibri" w:cs="Calibri"/>
+                <w:sz w:val="18"/>
+                <w:szCs w:val="18"/>
+              </w:rPr>
+            </w:pPr>
+            <w:r>
+              <w:rPr>
+                <w:rFonts w:ascii="Calibri" w:eastAsia="Calibri" w:hAnsi="Calibri" w:cs="Calibri"/>
+                <w:sz w:val="18"/>
+                <w:szCs w:val="18"/>
+              </w:rPr>
               <w:lastRenderedPageBreak/>
-              <w:t>742, 180</w:t>
-            </w:r>
-          </w:p>
-          <w:p>
-            <w:pPr>
-              <w:spacing w:line="240" w:lineRule="auto"/>
-              <w:rPr>
-                <w:rFonts w:ascii="Calibri" w:eastAsia="Calibri" w:hAnsi="Calibri" w:cs="Calibri"/>
-                <w:sz w:val="18"/>
-                <w:szCs w:val="18"/>
-              </w:rPr>
-            </w:pPr>
-            <w:r>
-              <w:rPr>
-                <w:rFonts w:ascii="Calibri" w:eastAsia="Calibri" w:hAnsi="Calibri" w:cs="Calibri"/>
-                <w:sz w:val="18"/>
-                <w:szCs w:val="18"/>
-              </w:rPr>
-              <w:t>418, 180</w:t>
-            </w:r>
-          </w:p>
-          <w:p>
-            <w:pPr>
-              <w:spacing w:line="240" w:lineRule="auto"/>
-              <w:rPr>
-                <w:rFonts w:ascii="Calibri" w:eastAsia="Calibri" w:hAnsi="Calibri" w:cs="Calibri"/>
-                <w:sz w:val="18"/>
-                <w:szCs w:val="18"/>
-              </w:rPr>
-            </w:pPr>
-            <w:r>
-              <w:rPr>
-                <w:rFonts w:ascii="Calibri" w:eastAsia="Calibri" w:hAnsi="Calibri" w:cs="Calibri"/>
-                <w:sz w:val="18"/>
-                <w:szCs w:val="18"/>
-              </w:rPr>
-              <w:t>320, 180</w:t>
-            </w:r>
-          </w:p>
-          <w:p>
-            <w:pPr>
-              <w:spacing w:line="240" w:lineRule="auto"/>
-              <w:rPr>
-                <w:rFonts w:ascii="Calibri" w:eastAsia="Calibri" w:hAnsi="Calibri" w:cs="Calibri"/>
-                <w:sz w:val="18"/>
-                <w:szCs w:val="18"/>
-              </w:rPr>
-            </w:pPr>
-            <w:r>
-              <w:rPr>
-                <w:rFonts w:ascii="Calibri" w:eastAsia="Calibri" w:hAnsi="Calibri" w:cs="Calibri"/>
-                <w:sz w:val="18"/>
-                <w:szCs w:val="18"/>
-              </w:rPr>
-              <w:t>669, 180</w:t>
-            </w:r>
-          </w:p>
-          <w:p>
-            <w:pPr>
-              <w:spacing w:line="240" w:lineRule="auto"/>
-              <w:rPr>
-                <w:rFonts w:ascii="Calibri" w:eastAsia="Calibri" w:hAnsi="Calibri" w:cs="Calibri"/>
-                <w:sz w:val="18"/>
-                <w:szCs w:val="18"/>
-              </w:rPr>
-            </w:pPr>
-            <w:r>
-              <w:rPr>
-                <w:rFonts w:ascii="Calibri" w:eastAsia="Calibri" w:hAnsi="Calibri" w:cs="Calibri"/>
-                <w:sz w:val="18"/>
-                <w:szCs w:val="18"/>
-              </w:rPr>
-              <w:t>33, 180</w:t>
-            </w:r>
-          </w:p>
-          <w:p>
-            <w:pPr>
-              <w:spacing w:line="240" w:lineRule="auto"/>
-              <w:rPr>
-                <w:rFonts w:ascii="Calibri" w:eastAsia="Calibri" w:hAnsi="Calibri" w:cs="Calibri"/>
-                <w:sz w:val="18"/>
-                <w:szCs w:val="18"/>
-              </w:rPr>
-            </w:pPr>
-            <w:r>
-              <w:rPr>
-                <w:rFonts w:ascii="Calibri" w:eastAsia="Calibri" w:hAnsi="Calibri" w:cs="Calibri"/>
-                <w:sz w:val="18"/>
-                <w:szCs w:val="18"/>
-              </w:rPr>
-              <w:t>433, 180</w:t>
-            </w:r>
-          </w:p>
-          <w:p>
-            <w:pPr>
-              <w:spacing w:line="240" w:lineRule="auto"/>
-              <w:rPr>
-                <w:rFonts w:ascii="Calibri" w:eastAsia="Calibri" w:hAnsi="Calibri" w:cs="Calibri"/>
-                <w:sz w:val="18"/>
-                <w:szCs w:val="18"/>
-              </w:rPr>
-            </w:pPr>
-            <w:r>
-              <w:rPr>
-                <w:rFonts w:ascii="Calibri" w:eastAsia="Calibri" w:hAnsi="Calibri" w:cs="Calibri"/>
-                <w:sz w:val="18"/>
-                <w:szCs w:val="18"/>
-              </w:rPr>
-              <w:t>877, 180</w:t>
-            </w:r>
-          </w:p>
-          <w:p>
-            <w:pPr>
-              <w:spacing w:line="240" w:lineRule="auto"/>
-              <w:rPr>
-                <w:rFonts w:ascii="Calibri" w:eastAsia="Calibri" w:hAnsi="Calibri" w:cs="Calibri"/>
-                <w:sz w:val="18"/>
-                <w:szCs w:val="18"/>
-              </w:rPr>
-            </w:pPr>
-            <w:r>
-              <w:rPr>
-                <w:rFonts w:ascii="Calibri" w:eastAsia="Calibri" w:hAnsi="Calibri" w:cs="Calibri"/>
-                <w:sz w:val="18"/>
-                <w:szCs w:val="18"/>
-              </w:rPr>
-              <w:t>522, 180</w:t>
-            </w:r>
-          </w:p>
-          <w:p>
-            <w:pPr>
-              <w:spacing w:line="240" w:lineRule="auto"/>
-              <w:rPr>
-                <w:rFonts w:ascii="Calibri" w:eastAsia="Calibri" w:hAnsi="Calibri" w:cs="Calibri"/>
-                <w:sz w:val="18"/>
-                <w:szCs w:val="18"/>
-              </w:rPr>
-            </w:pPr>
-            <w:r>
-              <w:rPr>
-                <w:rFonts w:ascii="Calibri" w:eastAsia="Calibri" w:hAnsi="Calibri" w:cs="Calibri"/>
-                <w:sz w:val="18"/>
-                <w:szCs w:val="18"/>
-              </w:rPr>
-              <w:t>1044, 180</w:t>
-            </w:r>
-          </w:p>
-          <w:p>
-            <w:pPr>
-              <w:spacing w:line="240" w:lineRule="auto"/>
-              <w:rPr>
-                <w:rFonts w:ascii="Calibri" w:eastAsia="Calibri" w:hAnsi="Calibri" w:cs="Calibri"/>
-                <w:sz w:val="18"/>
-                <w:szCs w:val="18"/>
-              </w:rPr>
-            </w:pPr>
-            <w:r>
-              <w:rPr>
-                <w:rFonts w:ascii="Calibri" w:eastAsia="Calibri" w:hAnsi="Calibri" w:cs="Calibri"/>
-                <w:sz w:val="18"/>
-                <w:szCs w:val="18"/>
-              </w:rPr>
-              <w:t>397, 180</w:t>
-            </w:r>
-          </w:p>
-          <w:p>
-            <w:pPr>
-              <w:spacing w:line="240" w:lineRule="auto"/>
-              <w:rPr>
-                <w:rFonts w:ascii="Calibri" w:eastAsia="Calibri" w:hAnsi="Calibri" w:cs="Calibri"/>
-                <w:sz w:val="18"/>
-                <w:szCs w:val="18"/>
-              </w:rPr>
-            </w:pPr>
-            <w:r>
-              <w:rPr>
-                <w:rFonts w:ascii="Calibri" w:eastAsia="Calibri" w:hAnsi="Calibri" w:cs="Calibri"/>
-                <w:sz w:val="18"/>
-                <w:szCs w:val="18"/>
-              </w:rPr>
               <w:t>776, 180</w:t>
             </w:r>
           </w:p>
@@ -4216,6 +4070,7 @@
           <w:p>
             <w:pPr>
               <w:widowControl w:val="0"/>
+              <w:spacing w:line="240" w:lineRule="auto"/>
               <w:rPr>
                 <w:rFonts w:ascii="Calibri" w:eastAsia="Calibri" w:hAnsi="Calibri" w:cs="Calibri"/>
                 <w:sz w:val="18"/>
@@ -4236,6 +4091,7 @@
           <w:p>
             <w:pPr>
               <w:widowControl w:val="0"/>
+              <w:spacing w:line="240" w:lineRule="auto"/>
               <w:rPr>
                 <w:rFonts w:ascii="Calibri" w:eastAsia="Calibri" w:hAnsi="Calibri" w:cs="Calibri"/>
                 <w:sz w:val="18"/>
@@ -4256,6 +4112,7 @@
           <w:p>
             <w:pPr>
               <w:widowControl w:val="0"/>
+              <w:spacing w:line="240" w:lineRule="auto"/>
               <w:rPr>
                 <w:rFonts w:ascii="Calibri" w:eastAsia="Calibri" w:hAnsi="Calibri" w:cs="Calibri"/>
                 <w:sz w:val="18"/>
@@ -4276,6 +4133,7 @@
           <w:p>
             <w:pPr>
               <w:widowControl w:val="0"/>
+              <w:spacing w:line="240" w:lineRule="auto"/>
               <w:rPr>
                 <w:rFonts w:ascii="Calibri" w:eastAsia="Calibri" w:hAnsi="Calibri" w:cs="Calibri"/>
                 <w:sz w:val="18"/>
@@ -4296,6 +4154,7 @@
           <w:p>
             <w:pPr>
               <w:widowControl w:val="0"/>
+              <w:spacing w:line="240" w:lineRule="auto"/>
               <w:rPr>
                 <w:rFonts w:ascii="Calibri" w:eastAsia="Calibri" w:hAnsi="Calibri" w:cs="Calibri"/>
                 <w:sz w:val="18"/>
@@ -4316,6 +4175,7 @@
           <w:p>
             <w:pPr>
               <w:widowControl w:val="0"/>
+              <w:spacing w:line="240" w:lineRule="auto"/>
               <w:rPr>
                 <w:rFonts w:ascii="Calibri" w:eastAsia="Calibri" w:hAnsi="Calibri" w:cs="Calibri"/>
                 <w:sz w:val="18"/>
@@ -4336,6 +4196,7 @@
           <w:p>
             <w:pPr>
               <w:widowControl w:val="0"/>
+              <w:spacing w:line="240" w:lineRule="auto"/>
               <w:rPr>
                 <w:rFonts w:ascii="Calibri" w:eastAsia="Calibri" w:hAnsi="Calibri" w:cs="Calibri"/>
                 <w:sz w:val="18"/>
@@ -4356,6 +4217,7 @@
           <w:p>
             <w:pPr>
               <w:widowControl w:val="0"/>
+              <w:spacing w:line="240" w:lineRule="auto"/>
               <w:rPr>
                 <w:rFonts w:ascii="Calibri" w:eastAsia="Calibri" w:hAnsi="Calibri" w:cs="Calibri"/>
                 <w:sz w:val="18"/>
@@ -4376,6 +4238,7 @@
           <w:p>
             <w:pPr>
               <w:widowControl w:val="0"/>
+              <w:spacing w:line="240" w:lineRule="auto"/>
               <w:rPr>
                 <w:rFonts w:ascii="Calibri" w:eastAsia="Calibri" w:hAnsi="Calibri" w:cs="Calibri"/>
                 <w:sz w:val="18"/>
@@ -4396,6 +4259,7 @@
           <w:p>
             <w:pPr>
               <w:widowControl w:val="0"/>
+              <w:spacing w:line="240" w:lineRule="auto"/>
               <w:rPr>
                 <w:rFonts w:ascii="Calibri" w:eastAsia="Calibri" w:hAnsi="Calibri" w:cs="Calibri"/>
                 <w:sz w:val="18"/>
@@ -4416,6 +4280,7 @@
           <w:p>
             <w:pPr>
               <w:widowControl w:val="0"/>
+              <w:spacing w:line="240" w:lineRule="auto"/>
               <w:rPr>
                 <w:rFonts w:ascii="Calibri" w:eastAsia="Calibri" w:hAnsi="Calibri" w:cs="Calibri"/>
                 <w:sz w:val="18"/>
@@ -4436,6 +4301,7 @@
           <w:p>
             <w:pPr>
               <w:widowControl w:val="0"/>
+              <w:spacing w:line="240" w:lineRule="auto"/>
               <w:rPr>
                 <w:rFonts w:ascii="Calibri" w:eastAsia="Calibri" w:hAnsi="Calibri" w:cs="Calibri"/>
                 <w:sz w:val="18"/>
@@ -4456,6 +4322,7 @@
           <w:p>
             <w:pPr>
               <w:widowControl w:val="0"/>
+              <w:spacing w:line="240" w:lineRule="auto"/>
               <w:rPr>
                 <w:rFonts w:ascii="Calibri" w:eastAsia="Calibri" w:hAnsi="Calibri" w:cs="Calibri"/>
                 <w:sz w:val="18"/>
@@ -4476,6 +4343,7 @@
           <w:p>
             <w:pPr>
               <w:widowControl w:val="0"/>
+              <w:spacing w:line="240" w:lineRule="auto"/>
               <w:rPr>
                 <w:rFonts w:ascii="Calibri" w:eastAsia="Calibri" w:hAnsi="Calibri" w:cs="Calibri"/>
                 <w:sz w:val="18"/>
@@ -4496,6 +4364,7 @@
           <w:p>
             <w:pPr>
               <w:widowControl w:val="0"/>
+              <w:spacing w:line="240" w:lineRule="auto"/>
               <w:rPr>
                 <w:rFonts w:ascii="Calibri" w:eastAsia="Calibri" w:hAnsi="Calibri" w:cs="Calibri"/>
                 <w:sz w:val="18"/>
@@ -4516,6 +4385,7 @@
           <w:p>
             <w:pPr>
               <w:widowControl w:val="0"/>
+              <w:spacing w:line="240" w:lineRule="auto"/>
               <w:rPr>
                 <w:rFonts w:ascii="Calibri" w:eastAsia="Calibri" w:hAnsi="Calibri" w:cs="Calibri"/>
                 <w:sz w:val="18"/>
@@ -4536,6 +4406,7 @@
           <w:p>
             <w:pPr>
               <w:widowControl w:val="0"/>
+              <w:spacing w:line="240" w:lineRule="auto"/>
               <w:rPr>
                 <w:rFonts w:ascii="Calibri" w:eastAsia="Calibri" w:hAnsi="Calibri" w:cs="Calibri"/>
                 <w:sz w:val="18"/>
@@ -4556,6 +4427,7 @@
           <w:p>
             <w:pPr>
               <w:widowControl w:val="0"/>
+              <w:spacing w:line="240" w:lineRule="auto"/>
               <w:rPr>
                 <w:rFonts w:ascii="Calibri" w:eastAsia="Calibri" w:hAnsi="Calibri" w:cs="Calibri"/>
                 <w:sz w:val="18"/>
@@ -4576,6 +4448,7 @@
           <w:p>
             <w:pPr>
               <w:widowControl w:val="0"/>
+              <w:spacing w:line="240" w:lineRule="auto"/>
               <w:rPr>
                 <w:rFonts w:ascii="Calibri" w:eastAsia="Calibri" w:hAnsi="Calibri" w:cs="Calibri"/>
                 <w:sz w:val="18"/>
@@ -4596,25 +4469,26 @@
           <w:p>
             <w:pPr>
               <w:widowControl w:val="0"/>
-              <w:rPr>
-                <w:rFonts w:ascii="Calibri" w:eastAsia="Calibri" w:hAnsi="Calibri" w:cs="Calibri"/>
-                <w:sz w:val="18"/>
-                <w:szCs w:val="18"/>
-              </w:rPr>
-            </w:pPr>
-            <w:r>
-              <w:rPr>
-                <w:rFonts w:ascii="Calibri" w:eastAsia="Calibri" w:hAnsi="Calibri" w:cs="Calibri"/>
-                <w:sz w:val="18"/>
-                <w:szCs w:val="18"/>
-              </w:rPr>
-              <w:lastRenderedPageBreak/>
+              <w:spacing w:line="240" w:lineRule="auto"/>
+              <w:rPr>
+                <w:rFonts w:ascii="Calibri" w:eastAsia="Calibri" w:hAnsi="Calibri" w:cs="Calibri"/>
+                <w:sz w:val="18"/>
+                <w:szCs w:val="18"/>
+              </w:rPr>
+            </w:pPr>
+            <w:r>
+              <w:rPr>
+                <w:rFonts w:ascii="Calibri" w:eastAsia="Calibri" w:hAnsi="Calibri" w:cs="Calibri"/>
+                <w:sz w:val="18"/>
+                <w:szCs w:val="18"/>
+              </w:rPr>
               <w:t>411, 180</w:t>
             </w:r>
           </w:p>
           <w:p>
             <w:pPr>
               <w:widowControl w:val="0"/>
+              <w:spacing w:line="240" w:lineRule="auto"/>
               <w:rPr>
                 <w:rFonts w:ascii="Calibri" w:eastAsia="Calibri" w:hAnsi="Calibri" w:cs="Calibri"/>
                 <w:sz w:val="18"/>
@@ -4633,6 +4507,7 @@
           <w:p>
             <w:pPr>
               <w:widowControl w:val="0"/>
+              <w:spacing w:line="240" w:lineRule="auto"/>
               <w:rPr>
                 <w:rFonts w:ascii="Calibri" w:eastAsia="Calibri" w:hAnsi="Calibri" w:cs="Calibri"/>
                 <w:sz w:val="18"/>
@@ -4651,6 +4526,7 @@
           <w:p>
             <w:pPr>
               <w:widowControl w:val="0"/>
+              <w:spacing w:line="240" w:lineRule="auto"/>
               <w:rPr>
                 <w:rFonts w:ascii="Calibri" w:eastAsia="Calibri" w:hAnsi="Calibri" w:cs="Calibri"/>
                 <w:sz w:val="18"/>
@@ -4669,6 +4545,7 @@
           <w:p>
             <w:pPr>
               <w:widowControl w:val="0"/>
+              <w:spacing w:line="240" w:lineRule="auto"/>
               <w:rPr>
                 <w:rFonts w:ascii="Calibri" w:eastAsia="Calibri" w:hAnsi="Calibri" w:cs="Calibri"/>
                 <w:sz w:val="18"/>
@@ -4687,6 +4564,7 @@
           <w:p>
             <w:pPr>
               <w:widowControl w:val="0"/>
+              <w:spacing w:line="240" w:lineRule="auto"/>
               <w:rPr>
                 <w:rFonts w:ascii="Calibri" w:eastAsia="Calibri" w:hAnsi="Calibri" w:cs="Calibri"/>
                 <w:sz w:val="18"/>
@@ -4701,16 +4579,6 @@
               </w:rPr>
               <w:t>111, 180</w:t>
             </w:r>
-          </w:p>
-          <w:p>
-            <w:pPr>
-              <w:spacing w:line="240" w:lineRule="auto"/>
-              <w:rPr>
-                <w:rFonts w:ascii="Calibri" w:eastAsia="Calibri" w:hAnsi="Calibri" w:cs="Calibri"/>
-                <w:sz w:val="18"/>
-                <w:szCs w:val="18"/>
-              </w:rPr>
-            </w:pPr>
           </w:p>
         </w:tc>
       </w:tr>
@@ -4888,6 +4756,7 @@
           <w:p>
             <w:pPr>
               <w:widowControl w:val="0"/>
+              <w:spacing w:line="240" w:lineRule="auto"/>
               <w:rPr>
                 <w:rFonts w:ascii="Calibri" w:eastAsia="Calibri" w:hAnsi="Calibri" w:cs="Calibri"/>
                 <w:sz w:val="18"/>
@@ -4906,6 +4775,7 @@
           <w:p>
             <w:pPr>
               <w:widowControl w:val="0"/>
+              <w:spacing w:line="240" w:lineRule="auto"/>
               <w:rPr>
                 <w:rFonts w:ascii="Calibri" w:eastAsia="Calibri" w:hAnsi="Calibri" w:cs="Calibri"/>
                 <w:sz w:val="18"/>
@@ -4924,6 +4794,7 @@
           <w:p>
             <w:pPr>
               <w:widowControl w:val="0"/>
+              <w:spacing w:line="240" w:lineRule="auto"/>
               <w:rPr>
                 <w:rFonts w:ascii="Calibri" w:eastAsia="Calibri" w:hAnsi="Calibri" w:cs="Calibri"/>
                 <w:sz w:val="18"/>
@@ -4942,6 +4813,7 @@
           <w:p>
             <w:pPr>
               <w:widowControl w:val="0"/>
+              <w:spacing w:line="240" w:lineRule="auto"/>
               <w:rPr>
                 <w:rFonts w:ascii="Calibri" w:eastAsia="Calibri" w:hAnsi="Calibri" w:cs="Calibri"/>
                 <w:sz w:val="18"/>
@@ -4960,6 +4832,7 @@
           <w:p>
             <w:pPr>
               <w:widowControl w:val="0"/>
+              <w:spacing w:line="240" w:lineRule="auto"/>
               <w:rPr>
                 <w:rFonts w:ascii="Calibri" w:eastAsia="Calibri" w:hAnsi="Calibri" w:cs="Calibri"/>
                 <w:sz w:val="18"/>
@@ -4978,24 +4851,27 @@
           <w:p>
             <w:pPr>
               <w:widowControl w:val="0"/>
-              <w:rPr>
-                <w:rFonts w:ascii="Calibri" w:eastAsia="Calibri" w:hAnsi="Calibri" w:cs="Calibri"/>
-                <w:sz w:val="18"/>
-                <w:szCs w:val="18"/>
-              </w:rPr>
-            </w:pPr>
-            <w:r>
-              <w:rPr>
-                <w:rFonts w:ascii="Calibri" w:eastAsia="Calibri" w:hAnsi="Calibri" w:cs="Calibri"/>
-                <w:sz w:val="18"/>
-                <w:szCs w:val="18"/>
-              </w:rPr>
+              <w:spacing w:line="240" w:lineRule="auto"/>
+              <w:rPr>
+                <w:rFonts w:ascii="Calibri" w:eastAsia="Calibri" w:hAnsi="Calibri" w:cs="Calibri"/>
+                <w:sz w:val="18"/>
+                <w:szCs w:val="18"/>
+              </w:rPr>
+            </w:pPr>
+            <w:r>
+              <w:rPr>
+                <w:rFonts w:ascii="Calibri" w:eastAsia="Calibri" w:hAnsi="Calibri" w:cs="Calibri"/>
+                <w:sz w:val="18"/>
+                <w:szCs w:val="18"/>
+              </w:rPr>
+              <w:lastRenderedPageBreak/>
               <w:t>1147, 180</w:t>
             </w:r>
           </w:p>
           <w:p>
             <w:pPr>
               <w:widowControl w:val="0"/>
+              <w:spacing w:line="240" w:lineRule="auto"/>
               <w:rPr>
                 <w:rFonts w:ascii="Calibri" w:eastAsia="Calibri" w:hAnsi="Calibri" w:cs="Calibri"/>
                 <w:sz w:val="18"/>
@@ -5014,6 +4890,7 @@
           <w:p>
             <w:pPr>
               <w:widowControl w:val="0"/>
+              <w:spacing w:line="240" w:lineRule="auto"/>
               <w:rPr>
                 <w:rFonts w:ascii="Calibri" w:eastAsia="Calibri" w:hAnsi="Calibri" w:cs="Calibri"/>
                 <w:sz w:val="18"/>
@@ -5032,6 +4909,7 @@
           <w:p>
             <w:pPr>
               <w:widowControl w:val="0"/>
+              <w:spacing w:line="240" w:lineRule="auto"/>
               <w:rPr>
                 <w:rFonts w:ascii="Calibri" w:eastAsia="Calibri" w:hAnsi="Calibri" w:cs="Calibri"/>
                 <w:sz w:val="18"/>
@@ -5050,6 +4928,7 @@
           <w:p>
             <w:pPr>
               <w:widowControl w:val="0"/>
+              <w:spacing w:line="240" w:lineRule="auto"/>
               <w:rPr>
                 <w:rFonts w:ascii="Calibri" w:eastAsia="Calibri" w:hAnsi="Calibri" w:cs="Calibri"/>
                 <w:sz w:val="18"/>
@@ -5068,6 +4947,7 @@
           <w:p>
             <w:pPr>
               <w:widowControl w:val="0"/>
+              <w:spacing w:line="240" w:lineRule="auto"/>
               <w:rPr>
                 <w:rFonts w:ascii="Calibri" w:eastAsia="Calibri" w:hAnsi="Calibri" w:cs="Calibri"/>
                 <w:sz w:val="18"/>
@@ -5086,6 +4966,7 @@
           <w:p>
             <w:pPr>
               <w:widowControl w:val="0"/>
+              <w:spacing w:line="240" w:lineRule="auto"/>
               <w:rPr>
                 <w:rFonts w:ascii="Calibri" w:eastAsia="Calibri" w:hAnsi="Calibri" w:cs="Calibri"/>
                 <w:sz w:val="18"/>
@@ -5104,6 +4985,7 @@
           <w:p>
             <w:pPr>
               <w:widowControl w:val="0"/>
+              <w:spacing w:line="240" w:lineRule="auto"/>
               <w:rPr>
                 <w:rFonts w:ascii="Calibri" w:eastAsia="Calibri" w:hAnsi="Calibri" w:cs="Calibri"/>
                 <w:sz w:val="18"/>
@@ -5122,6 +5004,7 @@
           <w:p>
             <w:pPr>
               <w:widowControl w:val="0"/>
+              <w:spacing w:line="240" w:lineRule="auto"/>
               <w:rPr>
                 <w:rFonts w:ascii="Calibri" w:eastAsia="Calibri" w:hAnsi="Calibri" w:cs="Calibri"/>
                 <w:sz w:val="18"/>
@@ -5140,6 +5023,7 @@
           <w:p>
             <w:pPr>
               <w:widowControl w:val="0"/>
+              <w:spacing w:line="240" w:lineRule="auto"/>
               <w:rPr>
                 <w:rFonts w:ascii="Calibri" w:eastAsia="Calibri" w:hAnsi="Calibri" w:cs="Calibri"/>
                 <w:sz w:val="18"/>
@@ -5158,6 +5042,7 @@
           <w:p>
             <w:pPr>
               <w:widowControl w:val="0"/>
+              <w:spacing w:line="240" w:lineRule="auto"/>
               <w:rPr>
                 <w:rFonts w:ascii="Calibri" w:eastAsia="Calibri" w:hAnsi="Calibri" w:cs="Calibri"/>
                 <w:sz w:val="18"/>
@@ -5176,6 +5061,7 @@
           <w:p>
             <w:pPr>
               <w:widowControl w:val="0"/>
+              <w:spacing w:line="240" w:lineRule="auto"/>
               <w:rPr>
                 <w:rFonts w:ascii="Calibri" w:eastAsia="Calibri" w:hAnsi="Calibri" w:cs="Calibri"/>
                 <w:sz w:val="18"/>
@@ -5194,6 +5080,7 @@
           <w:p>
             <w:pPr>
               <w:widowControl w:val="0"/>
+              <w:spacing w:line="240" w:lineRule="auto"/>
               <w:rPr>
                 <w:rFonts w:ascii="Calibri" w:eastAsia="Calibri" w:hAnsi="Calibri" w:cs="Calibri"/>
                 <w:sz w:val="18"/>
@@ -5212,6 +5099,7 @@
           <w:p>
             <w:pPr>
               <w:widowControl w:val="0"/>
+              <w:spacing w:line="240" w:lineRule="auto"/>
               <w:rPr>
                 <w:rFonts w:ascii="Calibri" w:eastAsia="Calibri" w:hAnsi="Calibri" w:cs="Calibri"/>
                 <w:sz w:val="18"/>
@@ -5230,6 +5118,7 @@
           <w:p>
             <w:pPr>
               <w:widowControl w:val="0"/>
+              <w:spacing w:line="240" w:lineRule="auto"/>
               <w:rPr>
                 <w:rFonts w:ascii="Calibri" w:eastAsia="Calibri" w:hAnsi="Calibri" w:cs="Calibri"/>
                 <w:sz w:val="18"/>
@@ -5248,6 +5137,7 @@
           <w:p>
             <w:pPr>
               <w:widowControl w:val="0"/>
+              <w:spacing w:line="240" w:lineRule="auto"/>
               <w:rPr>
                 <w:rFonts w:ascii="Calibri" w:eastAsia="Calibri" w:hAnsi="Calibri" w:cs="Calibri"/>
                 <w:sz w:val="18"/>
@@ -5262,16 +5152,6 @@
               </w:rPr>
               <w:t>690, 180</w:t>
             </w:r>
-          </w:p>
-          <w:p>
-            <w:pPr>
-              <w:widowControl w:val="0"/>
-              <w:rPr>
-                <w:rFonts w:ascii="Calibri" w:eastAsia="Calibri" w:hAnsi="Calibri" w:cs="Calibri"/>
-                <w:sz w:val="18"/>
-                <w:szCs w:val="18"/>
-              </w:rPr>
-            </w:pPr>
           </w:p>
         </w:tc>
       </w:tr>
@@ -5455,32 +5335,28 @@
             <w:pPr>
               <w:pStyle w:val="NormalWeb"/>
               <w:spacing w:before="0" w:beforeAutospacing="0" w:after="0" w:afterAutospacing="0"/>
-            </w:pPr>
-            <w:r>
               <w:rPr>
                 <w:rFonts w:ascii="Calibri" w:hAnsi="Calibri" w:cs="Calibri"/>
                 <w:color w:val="000000"/>
                 <w:sz w:val="18"/>
                 <w:szCs w:val="18"/>
               </w:rPr>
+            </w:pPr>
+            <w:r>
+              <w:rPr>
+                <w:rFonts w:ascii="Calibri" w:hAnsi="Calibri" w:cs="Calibri"/>
+                <w:color w:val="000000"/>
+                <w:sz w:val="18"/>
+                <w:szCs w:val="18"/>
+              </w:rPr>
               <w:t>RPD- Metais tóxicos</w:t>
             </w:r>
           </w:p>
-          <w:p/>
           <w:p>
             <w:pPr>
               <w:pStyle w:val="NormalWeb"/>
               <w:spacing w:before="0" w:beforeAutospacing="0" w:after="0" w:afterAutospacing="0"/>
             </w:pPr>
-            <w:r>
-              <w:rPr>
-                <w:rFonts w:ascii="Calibri" w:hAnsi="Calibri" w:cs="Calibri"/>
-                <w:color w:val="000000"/>
-                <w:sz w:val="18"/>
-                <w:szCs w:val="18"/>
-              </w:rPr>
-              <w:t># Programa para quelação de metais pesados</w:t>
-            </w:r>
           </w:p>
           <w:p>
             <w:pPr>
@@ -5494,7 +5370,7 @@
                 <w:sz w:val="18"/>
                 <w:szCs w:val="18"/>
               </w:rPr>
-              <w:t># Utilizar a chave de offset em negativo!</w:t>
+              <w:t># Programa para quelação de metais pesados</w:t>
             </w:r>
           </w:p>
           <w:p>
@@ -5509,7 +5385,37 @@
                 <w:sz w:val="18"/>
                 <w:szCs w:val="18"/>
               </w:rPr>
-              <w:t># Tempo: 30 min</w:t>
+              <w:t xml:space="preserve"># </w:t>
+            </w:r>
+            <w:proofErr w:type="spellStart"/>
+            <w:r>
+              <w:rPr>
+                <w:rFonts w:ascii="Calibri" w:hAnsi="Calibri" w:cs="Calibri"/>
+                <w:color w:val="000000"/>
+                <w:sz w:val="18"/>
+                <w:szCs w:val="18"/>
+              </w:rPr>
+              <w:t>Cd</w:t>
+            </w:r>
+            <w:proofErr w:type="spellEnd"/>
+            <w:r>
+              <w:rPr>
+                <w:rFonts w:ascii="Calibri" w:hAnsi="Calibri" w:cs="Calibri"/>
+                <w:color w:val="000000"/>
+                <w:sz w:val="18"/>
+                <w:szCs w:val="18"/>
+              </w:rPr>
+              <w:t xml:space="preserve"> (Cádmio)</w:t>
+            </w:r>
+            <w:r>
+              <w:rPr>
+                <w:rStyle w:val="apple-tab-span"/>
+                <w:rFonts w:ascii="Calibri" w:hAnsi="Calibri" w:cs="Calibri"/>
+                <w:color w:val="000000"/>
+                <w:sz w:val="18"/>
+                <w:szCs w:val="18"/>
+              </w:rPr>
+              <w:tab/>
             </w:r>
           </w:p>
           <w:p>
@@ -5524,37 +5430,7 @@
                 <w:sz w:val="18"/>
                 <w:szCs w:val="18"/>
               </w:rPr>
-              <w:t xml:space="preserve"># </w:t>
-            </w:r>
-            <w:proofErr w:type="spellStart"/>
-            <w:r>
-              <w:rPr>
-                <w:rFonts w:ascii="Calibri" w:hAnsi="Calibri" w:cs="Calibri"/>
-                <w:color w:val="000000"/>
-                <w:sz w:val="18"/>
-                <w:szCs w:val="18"/>
-              </w:rPr>
-              <w:t>Cd</w:t>
-            </w:r>
-            <w:proofErr w:type="spellEnd"/>
-            <w:r>
-              <w:rPr>
-                <w:rFonts w:ascii="Calibri" w:hAnsi="Calibri" w:cs="Calibri"/>
-                <w:color w:val="000000"/>
-                <w:sz w:val="18"/>
-                <w:szCs w:val="18"/>
-              </w:rPr>
-              <w:t xml:space="preserve"> (Cádmio)</w:t>
-            </w:r>
-            <w:r>
-              <w:rPr>
-                <w:rStyle w:val="apple-tab-span"/>
-                <w:rFonts w:ascii="Calibri" w:hAnsi="Calibri" w:cs="Calibri"/>
-                <w:color w:val="000000"/>
-                <w:sz w:val="18"/>
-                <w:szCs w:val="18"/>
-              </w:rPr>
-              <w:tab/>
+              <w:t>1192, 120</w:t>
             </w:r>
           </w:p>
           <w:p>
@@ -5569,7 +5445,7 @@
                 <w:sz w:val="18"/>
                 <w:szCs w:val="18"/>
               </w:rPr>
-              <w:t>1192, 120</w:t>
+              <w:t>1310, 120</w:t>
             </w:r>
           </w:p>
           <w:p>
@@ -5584,7 +5460,7 @@
                 <w:sz w:val="18"/>
                 <w:szCs w:val="18"/>
               </w:rPr>
-              <w:t>1310, 120</w:t>
+              <w:t>2284, 120</w:t>
             </w:r>
           </w:p>
           <w:p>
@@ -5599,7 +5475,17 @@
                 <w:sz w:val="18"/>
                 <w:szCs w:val="18"/>
               </w:rPr>
-              <w:t>2284, 120</w:t>
+              <w:t># Hg (Mercúrio)</w:t>
+            </w:r>
+            <w:r>
+              <w:rPr>
+                <w:rStyle w:val="apple-tab-span"/>
+                <w:rFonts w:ascii="Calibri" w:hAnsi="Calibri" w:cs="Calibri"/>
+                <w:color w:val="000000"/>
+                <w:sz w:val="18"/>
+                <w:szCs w:val="18"/>
+              </w:rPr>
+              <w:tab/>
             </w:r>
           </w:p>
           <w:p>
@@ -5614,7 +5500,7 @@
                 <w:sz w:val="18"/>
                 <w:szCs w:val="18"/>
               </w:rPr>
-              <w:t># Hg (Mercúrio)</w:t>
+              <w:t>1075, 120</w:t>
             </w:r>
             <w:r>
               <w:rPr>
@@ -5639,17 +5525,7 @@
                 <w:sz w:val="18"/>
                 <w:szCs w:val="18"/>
               </w:rPr>
-              <w:t>1075, 120</w:t>
-            </w:r>
-            <w:r>
-              <w:rPr>
-                <w:rStyle w:val="apple-tab-span"/>
-                <w:rFonts w:ascii="Calibri" w:hAnsi="Calibri" w:cs="Calibri"/>
-                <w:color w:val="000000"/>
-                <w:sz w:val="18"/>
-                <w:szCs w:val="18"/>
-              </w:rPr>
-              <w:tab/>
+              <w:t>1182, 120</w:t>
             </w:r>
           </w:p>
           <w:p>
@@ -5664,7 +5540,7 @@
                 <w:sz w:val="18"/>
                 <w:szCs w:val="18"/>
               </w:rPr>
-              <w:t>1182, 120</w:t>
+              <w:t>2430, 120</w:t>
             </w:r>
           </w:p>
           <w:p>
@@ -5679,7 +5555,37 @@
                 <w:sz w:val="18"/>
                 <w:szCs w:val="18"/>
               </w:rPr>
-              <w:t>2430, 120</w:t>
+              <w:t xml:space="preserve"># </w:t>
+            </w:r>
+            <w:proofErr w:type="spellStart"/>
+            <w:r>
+              <w:rPr>
+                <w:rFonts w:ascii="Calibri" w:hAnsi="Calibri" w:cs="Calibri"/>
+                <w:color w:val="000000"/>
+                <w:sz w:val="18"/>
+                <w:szCs w:val="18"/>
+              </w:rPr>
+              <w:t>Pb</w:t>
+            </w:r>
+            <w:proofErr w:type="spellEnd"/>
+            <w:r>
+              <w:rPr>
+                <w:rFonts w:ascii="Calibri" w:hAnsi="Calibri" w:cs="Calibri"/>
+                <w:color w:val="000000"/>
+                <w:sz w:val="18"/>
+                <w:szCs w:val="18"/>
+              </w:rPr>
+              <w:t xml:space="preserve"> (Chumbo)</w:t>
+            </w:r>
+            <w:r>
+              <w:rPr>
+                <w:rStyle w:val="apple-tab-span"/>
+                <w:rFonts w:ascii="Calibri" w:hAnsi="Calibri" w:cs="Calibri"/>
+                <w:color w:val="000000"/>
+                <w:sz w:val="18"/>
+                <w:szCs w:val="18"/>
+              </w:rPr>
+              <w:tab/>
             </w:r>
           </w:p>
           <w:p>
@@ -5694,37 +5600,7 @@
                 <w:sz w:val="18"/>
                 <w:szCs w:val="18"/>
               </w:rPr>
-              <w:t xml:space="preserve"># </w:t>
-            </w:r>
-            <w:proofErr w:type="spellStart"/>
-            <w:r>
-              <w:rPr>
-                <w:rFonts w:ascii="Calibri" w:hAnsi="Calibri" w:cs="Calibri"/>
-                <w:color w:val="000000"/>
-                <w:sz w:val="18"/>
-                <w:szCs w:val="18"/>
-              </w:rPr>
-              <w:t>Pb</w:t>
-            </w:r>
-            <w:proofErr w:type="spellEnd"/>
-            <w:r>
-              <w:rPr>
-                <w:rFonts w:ascii="Calibri" w:hAnsi="Calibri" w:cs="Calibri"/>
-                <w:color w:val="000000"/>
-                <w:sz w:val="18"/>
-                <w:szCs w:val="18"/>
-              </w:rPr>
-              <w:t xml:space="preserve"> (Chumbo)</w:t>
-            </w:r>
-            <w:r>
-              <w:rPr>
-                <w:rStyle w:val="apple-tab-span"/>
-                <w:rFonts w:ascii="Calibri" w:hAnsi="Calibri" w:cs="Calibri"/>
-                <w:color w:val="000000"/>
-                <w:sz w:val="18"/>
-                <w:szCs w:val="18"/>
-              </w:rPr>
-              <w:tab/>
+              <w:t>1257, 120</w:t>
             </w:r>
           </w:p>
           <w:p>
@@ -5739,7 +5615,7 @@
                 <w:sz w:val="18"/>
                 <w:szCs w:val="18"/>
               </w:rPr>
-              <w:t>1257, 120</w:t>
+              <w:t>1382, 120</w:t>
             </w:r>
           </w:p>
           <w:p>
@@ -5754,7 +5630,7 @@
                 <w:sz w:val="18"/>
                 <w:szCs w:val="18"/>
               </w:rPr>
-              <w:t>1382, 120</w:t>
+              <w:t>2092, 120</w:t>
             </w:r>
           </w:p>
           <w:p>
@@ -5769,7 +5645,17 @@
                 <w:sz w:val="18"/>
                 <w:szCs w:val="18"/>
               </w:rPr>
-              <w:t>2092, 120</w:t>
+              <w:t># Al (Alumínio)</w:t>
+            </w:r>
+            <w:r>
+              <w:rPr>
+                <w:rStyle w:val="apple-tab-span"/>
+                <w:rFonts w:ascii="Calibri" w:hAnsi="Calibri" w:cs="Calibri"/>
+                <w:color w:val="000000"/>
+                <w:sz w:val="18"/>
+                <w:szCs w:val="18"/>
+              </w:rPr>
+              <w:tab/>
             </w:r>
           </w:p>
           <w:p>
@@ -5784,17 +5670,7 @@
                 <w:sz w:val="18"/>
                 <w:szCs w:val="18"/>
               </w:rPr>
-              <w:t># Al (Alumínio)</w:t>
-            </w:r>
-            <w:r>
-              <w:rPr>
-                <w:rStyle w:val="apple-tab-span"/>
-                <w:rFonts w:ascii="Calibri" w:hAnsi="Calibri" w:cs="Calibri"/>
-                <w:color w:val="000000"/>
-                <w:sz w:val="18"/>
-                <w:szCs w:val="18"/>
-              </w:rPr>
-              <w:tab/>
+              <w:t>688, 120</w:t>
             </w:r>
           </w:p>
           <w:p>
@@ -5809,7 +5685,7 @@
                 <w:sz w:val="18"/>
                 <w:szCs w:val="18"/>
               </w:rPr>
-              <w:t>688, 120</w:t>
+              <w:t>757, 120</w:t>
             </w:r>
           </w:p>
           <w:p>
@@ -5824,7 +5700,7 @@
                 <w:sz w:val="18"/>
                 <w:szCs w:val="18"/>
               </w:rPr>
-              <w:t>757, 120</w:t>
+              <w:t>3946, 120</w:t>
             </w:r>
           </w:p>
           <w:p>
@@ -5839,7 +5715,27 @@
                 <w:sz w:val="18"/>
                 <w:szCs w:val="18"/>
               </w:rPr>
-              <w:t>3946, 120</w:t>
+              <w:t xml:space="preserve"># </w:t>
+            </w:r>
+            <w:proofErr w:type="gramStart"/>
+            <w:r>
+              <w:rPr>
+                <w:rFonts w:ascii="Calibri" w:hAnsi="Calibri" w:cs="Calibri"/>
+                <w:color w:val="000000"/>
+                <w:sz w:val="18"/>
+                <w:szCs w:val="18"/>
+              </w:rPr>
+              <w:t>As(</w:t>
+            </w:r>
+            <w:proofErr w:type="gramEnd"/>
+            <w:r>
+              <w:rPr>
+                <w:rFonts w:ascii="Calibri" w:hAnsi="Calibri" w:cs="Calibri"/>
+                <w:color w:val="000000"/>
+                <w:sz w:val="18"/>
+                <w:szCs w:val="18"/>
+              </w:rPr>
+              <w:t>Arsênico)</w:t>
             </w:r>
           </w:p>
           <w:p>
@@ -5854,27 +5750,17 @@
                 <w:sz w:val="18"/>
                 <w:szCs w:val="18"/>
               </w:rPr>
-              <w:t xml:space="preserve"># </w:t>
-            </w:r>
-            <w:proofErr w:type="gramStart"/>
-            <w:r>
-              <w:rPr>
+              <w:t>1408, 120</w:t>
+            </w:r>
+            <w:r>
+              <w:rPr>
+                <w:rStyle w:val="apple-tab-span"/>
                 <w:rFonts w:ascii="Calibri" w:hAnsi="Calibri" w:cs="Calibri"/>
                 <w:color w:val="000000"/>
                 <w:sz w:val="18"/>
                 <w:szCs w:val="18"/>
               </w:rPr>
-              <w:t>As(</w:t>
-            </w:r>
-            <w:proofErr w:type="gramEnd"/>
-            <w:r>
-              <w:rPr>
-                <w:rFonts w:ascii="Calibri" w:hAnsi="Calibri" w:cs="Calibri"/>
-                <w:color w:val="000000"/>
-                <w:sz w:val="18"/>
-                <w:szCs w:val="18"/>
-              </w:rPr>
-              <w:t>Arsênico)</w:t>
+              <w:tab/>
             </w:r>
           </w:p>
           <w:p>
@@ -5889,17 +5775,7 @@
                 <w:sz w:val="18"/>
                 <w:szCs w:val="18"/>
               </w:rPr>
-              <w:t>1408, 120</w:t>
-            </w:r>
-            <w:r>
-              <w:rPr>
-                <w:rStyle w:val="apple-tab-span"/>
-                <w:rFonts w:ascii="Calibri" w:hAnsi="Calibri" w:cs="Calibri"/>
-                <w:color w:val="000000"/>
-                <w:sz w:val="18"/>
-                <w:szCs w:val="18"/>
-              </w:rPr>
-              <w:tab/>
+              <w:t>1548, 120</w:t>
             </w:r>
           </w:p>
           <w:p>
@@ -5914,7 +5790,7 @@
                 <w:sz w:val="18"/>
                 <w:szCs w:val="18"/>
               </w:rPr>
-              <w:t>1548, 120</w:t>
+              <w:t>1875, 120</w:t>
             </w:r>
           </w:p>
           <w:p>
@@ -5929,7 +5805,27 @@
                 <w:sz w:val="18"/>
                 <w:szCs w:val="18"/>
               </w:rPr>
-              <w:t>1875, 120</w:t>
+              <w:t xml:space="preserve"># </w:t>
+            </w:r>
+            <w:proofErr w:type="gramStart"/>
+            <w:r>
+              <w:rPr>
+                <w:rFonts w:ascii="Calibri" w:hAnsi="Calibri" w:cs="Calibri"/>
+                <w:color w:val="000000"/>
+                <w:sz w:val="18"/>
+                <w:szCs w:val="18"/>
+              </w:rPr>
+              <w:t>Ag(</w:t>
+            </w:r>
+            <w:proofErr w:type="gramEnd"/>
+            <w:r>
+              <w:rPr>
+                <w:rFonts w:ascii="Calibri" w:hAnsi="Calibri" w:cs="Calibri"/>
+                <w:color w:val="000000"/>
+                <w:sz w:val="18"/>
+                <w:szCs w:val="18"/>
+              </w:rPr>
+              <w:t>Prata)</w:t>
             </w:r>
           </w:p>
           <w:p>
@@ -5944,28 +5840,7 @@
                 <w:sz w:val="18"/>
                 <w:szCs w:val="18"/>
               </w:rPr>
-              <w:lastRenderedPageBreak/>
-              <w:t xml:space="preserve"># </w:t>
-            </w:r>
-            <w:proofErr w:type="gramStart"/>
-            <w:r>
-              <w:rPr>
-                <w:rFonts w:ascii="Calibri" w:hAnsi="Calibri" w:cs="Calibri"/>
-                <w:color w:val="000000"/>
-                <w:sz w:val="18"/>
-                <w:szCs w:val="18"/>
-              </w:rPr>
-              <w:t>Ag(</w:t>
-            </w:r>
-            <w:proofErr w:type="gramEnd"/>
-            <w:r>
-              <w:rPr>
-                <w:rFonts w:ascii="Calibri" w:hAnsi="Calibri" w:cs="Calibri"/>
-                <w:color w:val="000000"/>
-                <w:sz w:val="18"/>
-                <w:szCs w:val="18"/>
-              </w:rPr>
-              <w:t>Prata)</w:t>
+              <w:t>830, 360</w:t>
             </w:r>
           </w:p>
           <w:p>
@@ -5980,7 +5855,7 @@
                 <w:sz w:val="18"/>
                 <w:szCs w:val="18"/>
               </w:rPr>
-              <w:t>830, 360</w:t>
+              <w:t>913, 360</w:t>
             </w:r>
           </w:p>
           <w:p>
@@ -5995,7 +5870,7 @@
                 <w:sz w:val="18"/>
                 <w:szCs w:val="18"/>
               </w:rPr>
-              <w:t>913, 360</w:t>
+              <w:t>3269, 360</w:t>
             </w:r>
           </w:p>
           <w:p>
@@ -6010,7 +5885,7 @@
                 <w:sz w:val="18"/>
                 <w:szCs w:val="18"/>
               </w:rPr>
-              <w:t>3269, 360</w:t>
+              <w:t># Ni (Níquel) </w:t>
             </w:r>
           </w:p>
           <w:p>
@@ -6025,7 +5900,7 @@
                 <w:sz w:val="18"/>
                 <w:szCs w:val="18"/>
               </w:rPr>
-              <w:t># Ni (Níquel) </w:t>
+              <w:t># Tempo: 18 min </w:t>
             </w:r>
           </w:p>
           <w:p>
@@ -6040,7 +5915,7 @@
                 <w:sz w:val="18"/>
                 <w:szCs w:val="18"/>
               </w:rPr>
-              <w:t># Tempo: 18 min </w:t>
+              <w:t>2233, 360</w:t>
             </w:r>
           </w:p>
           <w:p>
@@ -6055,7 +5930,7 @@
                 <w:sz w:val="18"/>
                 <w:szCs w:val="18"/>
               </w:rPr>
-              <w:t>2233, 360</w:t>
+              <w:t>1175, 360</w:t>
             </w:r>
           </w:p>
           <w:p>
@@ -6070,33 +5945,8 @@
                 <w:sz w:val="18"/>
                 <w:szCs w:val="18"/>
               </w:rPr>
-              <w:t>1175, 360</w:t>
-            </w:r>
-          </w:p>
-          <w:p>
-            <w:pPr>
-              <w:pStyle w:val="NormalWeb"/>
-              <w:spacing w:before="0" w:beforeAutospacing="0" w:after="0" w:afterAutospacing="0"/>
-            </w:pPr>
-            <w:r>
-              <w:rPr>
-                <w:rFonts w:ascii="Calibri" w:hAnsi="Calibri" w:cs="Calibri"/>
-                <w:color w:val="000000"/>
-                <w:sz w:val="18"/>
-                <w:szCs w:val="18"/>
-              </w:rPr>
               <w:t>1292, 360</w:t>
             </w:r>
-          </w:p>
-          <w:p>
-            <w:pPr>
-              <w:spacing w:line="240" w:lineRule="auto"/>
-              <w:rPr>
-                <w:rFonts w:ascii="Calibri" w:eastAsia="Calibri" w:hAnsi="Calibri" w:cs="Calibri"/>
-                <w:sz w:val="18"/>
-                <w:szCs w:val="18"/>
-              </w:rPr>
-            </w:pPr>
           </w:p>
         </w:tc>
       </w:tr>
@@ -6177,7 +6027,7 @@
     <w:p/>
     <w:tbl>
       <w:tblPr>
-        <w:tblStyle w:val="SimplesTabela1"/>
+        <w:tblStyle w:val="PlainTable1"/>
         <w:tblW w:w="0" w:type="auto"/>
         <w:tblLook w:val="04A0" w:firstRow="1" w:lastRow="0" w:firstColumn="1" w:lastColumn="0" w:noHBand="0" w:noVBand="1"/>
       </w:tblPr>
@@ -6498,7 +6348,7 @@
     </w:p>
     <w:tbl>
       <w:tblPr>
-        <w:tblStyle w:val="SimplesTabela1"/>
+        <w:tblStyle w:val="PlainTable1"/>
         <w:tblW w:w="0" w:type="auto"/>
         <w:tblLook w:val="04A0" w:firstRow="1" w:lastRow="0" w:firstColumn="1" w:lastColumn="0" w:noHBand="0" w:noVBand="1"/>
       </w:tblPr>
@@ -6843,7 +6693,7 @@
     </w:p>
     <w:tbl>
       <w:tblPr>
-        <w:tblStyle w:val="SimplesTabela1"/>
+        <w:tblStyle w:val="PlainTable1"/>
         <w:tblW w:w="0" w:type="auto"/>
         <w:tblLook w:val="04A0" w:firstRow="1" w:lastRow="0" w:firstColumn="1" w:lastColumn="0" w:noHBand="0" w:noVBand="1"/>
       </w:tblPr>
@@ -7164,7 +7014,7 @@
     </w:p>
     <w:tbl>
       <w:tblPr>
-        <w:tblStyle w:val="SimplesTabela1"/>
+        <w:tblStyle w:val="PlainTable1"/>
         <w:tblW w:w="0" w:type="auto"/>
         <w:tblLook w:val="04A0" w:firstRow="1" w:lastRow="0" w:firstColumn="1" w:lastColumn="0" w:noHBand="0" w:noVBand="1"/>
       </w:tblPr>
@@ -7491,7 +7341,7 @@
     </w:p>
     <w:tbl>
       <w:tblPr>
-        <w:tblStyle w:val="SimplesTabela1"/>
+        <w:tblStyle w:val="PlainTable1"/>
         <w:tblW w:w="0" w:type="auto"/>
         <w:tblLook w:val="04A0" w:firstRow="1" w:lastRow="0" w:firstColumn="1" w:lastColumn="0" w:noHBand="0" w:noVBand="1"/>
       </w:tblPr>
@@ -8236,11 +8086,11 @@
       <w14:ligatures w14:val="none"/>
     </w:rPr>
   </w:style>
-  <w:style w:type="paragraph" w:styleId="Ttulo1">
+  <w:style w:type="paragraph" w:styleId="Heading1">
     <w:name w:val="heading 1"/>
     <w:basedOn w:val="Normal"/>
     <w:next w:val="Normal"/>
-    <w:link w:val="Ttulo1Char"/>
+    <w:link w:val="Heading1Char"/>
     <w:uiPriority w:val="9"/>
     <w:qFormat/>
     <w:rsid w:val="00A508B6"/>
@@ -8260,11 +8110,11 @@
       <w14:ligatures w14:val="standardContextual"/>
     </w:rPr>
   </w:style>
-  <w:style w:type="paragraph" w:styleId="Ttulo2">
+  <w:style w:type="paragraph" w:styleId="Heading2">
     <w:name w:val="heading 2"/>
     <w:basedOn w:val="Normal"/>
     <w:next w:val="Normal"/>
-    <w:link w:val="Ttulo2Char"/>
+    <w:link w:val="Heading2Char"/>
     <w:uiPriority w:val="9"/>
     <w:semiHidden/>
     <w:unhideWhenUsed/>
@@ -8286,11 +8136,11 @@
       <w14:ligatures w14:val="standardContextual"/>
     </w:rPr>
   </w:style>
-  <w:style w:type="paragraph" w:styleId="Ttulo3">
+  <w:style w:type="paragraph" w:styleId="Heading3">
     <w:name w:val="heading 3"/>
     <w:basedOn w:val="Normal"/>
     <w:next w:val="Normal"/>
-    <w:link w:val="Ttulo3Char"/>
+    <w:link w:val="Heading3Char"/>
     <w:uiPriority w:val="9"/>
     <w:semiHidden/>
     <w:unhideWhenUsed/>
@@ -8312,11 +8162,11 @@
       <w14:ligatures w14:val="standardContextual"/>
     </w:rPr>
   </w:style>
-  <w:style w:type="paragraph" w:styleId="Ttulo4">
+  <w:style w:type="paragraph" w:styleId="Heading4">
     <w:name w:val="heading 4"/>
     <w:basedOn w:val="Normal"/>
     <w:next w:val="Normal"/>
-    <w:link w:val="Ttulo4Char"/>
+    <w:link w:val="Heading4Char"/>
     <w:uiPriority w:val="9"/>
     <w:semiHidden/>
     <w:unhideWhenUsed/>
@@ -8340,11 +8190,11 @@
       <w14:ligatures w14:val="standardContextual"/>
     </w:rPr>
   </w:style>
-  <w:style w:type="paragraph" w:styleId="Ttulo5">
+  <w:style w:type="paragraph" w:styleId="Heading5">
     <w:name w:val="heading 5"/>
     <w:basedOn w:val="Normal"/>
     <w:next w:val="Normal"/>
-    <w:link w:val="Ttulo5Char"/>
+    <w:link w:val="Heading5Char"/>
     <w:uiPriority w:val="9"/>
     <w:semiHidden/>
     <w:unhideWhenUsed/>
@@ -8366,11 +8216,11 @@
       <w14:ligatures w14:val="standardContextual"/>
     </w:rPr>
   </w:style>
-  <w:style w:type="paragraph" w:styleId="Ttulo6">
+  <w:style w:type="paragraph" w:styleId="Heading6">
     <w:name w:val="heading 6"/>
     <w:basedOn w:val="Normal"/>
     <w:next w:val="Normal"/>
-    <w:link w:val="Ttulo6Char"/>
+    <w:link w:val="Heading6Char"/>
     <w:uiPriority w:val="9"/>
     <w:semiHidden/>
     <w:unhideWhenUsed/>
@@ -8394,11 +8244,11 @@
       <w14:ligatures w14:val="standardContextual"/>
     </w:rPr>
   </w:style>
-  <w:style w:type="paragraph" w:styleId="Ttulo7">
+  <w:style w:type="paragraph" w:styleId="Heading7">
     <w:name w:val="heading 7"/>
     <w:basedOn w:val="Normal"/>
     <w:next w:val="Normal"/>
-    <w:link w:val="Ttulo7Char"/>
+    <w:link w:val="Heading7Char"/>
     <w:uiPriority w:val="9"/>
     <w:semiHidden/>
     <w:unhideWhenUsed/>
@@ -8420,11 +8270,11 @@
       <w14:ligatures w14:val="standardContextual"/>
     </w:rPr>
   </w:style>
-  <w:style w:type="paragraph" w:styleId="Ttulo8">
+  <w:style w:type="paragraph" w:styleId="Heading8">
     <w:name w:val="heading 8"/>
     <w:basedOn w:val="Normal"/>
     <w:next w:val="Normal"/>
-    <w:link w:val="Ttulo8Char"/>
+    <w:link w:val="Heading8Char"/>
     <w:uiPriority w:val="9"/>
     <w:semiHidden/>
     <w:unhideWhenUsed/>
@@ -8448,11 +8298,11 @@
       <w14:ligatures w14:val="standardContextual"/>
     </w:rPr>
   </w:style>
-  <w:style w:type="paragraph" w:styleId="Ttulo9">
+  <w:style w:type="paragraph" w:styleId="Heading9">
     <w:name w:val="heading 9"/>
     <w:basedOn w:val="Normal"/>
     <w:next w:val="Normal"/>
-    <w:link w:val="Ttulo9Char"/>
+    <w:link w:val="Heading9Char"/>
     <w:uiPriority w:val="9"/>
     <w:semiHidden/>
     <w:unhideWhenUsed/>
@@ -8474,13 +8324,13 @@
       <w14:ligatures w14:val="standardContextual"/>
     </w:rPr>
   </w:style>
-  <w:style w:type="character" w:default="1" w:styleId="Fontepargpadro">
+  <w:style w:type="character" w:default="1" w:styleId="DefaultParagraphFont">
     <w:name w:val="Default Paragraph Font"/>
     <w:uiPriority w:val="1"/>
     <w:semiHidden/>
     <w:unhideWhenUsed/>
   </w:style>
-  <w:style w:type="table" w:default="1" w:styleId="Tabelanormal">
+  <w:style w:type="table" w:default="1" w:styleId="TableNormal">
     <w:name w:val="Normal Table"/>
     <w:uiPriority w:val="99"/>
     <w:semiHidden/>
@@ -8495,16 +8345,16 @@
       </w:tblCellMar>
     </w:tblPr>
   </w:style>
-  <w:style w:type="numbering" w:default="1" w:styleId="Semlista">
+  <w:style w:type="numbering" w:default="1" w:styleId="NoList">
     <w:name w:val="No List"/>
     <w:uiPriority w:val="99"/>
     <w:semiHidden/>
     <w:unhideWhenUsed/>
   </w:style>
-  <w:style w:type="character" w:customStyle="1" w:styleId="Ttulo1Char">
-    <w:name w:val="Título 1 Char"/>
-    <w:basedOn w:val="Fontepargpadro"/>
-    <w:link w:val="Ttulo1"/>
+  <w:style w:type="character" w:customStyle="1" w:styleId="Heading1Char">
+    <w:name w:val="Heading 1 Char"/>
+    <w:basedOn w:val="DefaultParagraphFont"/>
+    <w:link w:val="Heading1"/>
     <w:uiPriority w:val="9"/>
     <w:rsid w:val="00A508B6"/>
     <w:rPr>
@@ -8514,10 +8364,10 @@
       <w:szCs w:val="40"/>
     </w:rPr>
   </w:style>
-  <w:style w:type="character" w:customStyle="1" w:styleId="Ttulo2Char">
-    <w:name w:val="Título 2 Char"/>
-    <w:basedOn w:val="Fontepargpadro"/>
-    <w:link w:val="Ttulo2"/>
+  <w:style w:type="character" w:customStyle="1" w:styleId="Heading2Char">
+    <w:name w:val="Heading 2 Char"/>
+    <w:basedOn w:val="DefaultParagraphFont"/>
+    <w:link w:val="Heading2"/>
     <w:uiPriority w:val="9"/>
     <w:semiHidden/>
     <w:rsid w:val="00A508B6"/>
@@ -8528,10 +8378,10 @@
       <w:szCs w:val="32"/>
     </w:rPr>
   </w:style>
-  <w:style w:type="character" w:customStyle="1" w:styleId="Ttulo3Char">
-    <w:name w:val="Título 3 Char"/>
-    <w:basedOn w:val="Fontepargpadro"/>
-    <w:link w:val="Ttulo3"/>
+  <w:style w:type="character" w:customStyle="1" w:styleId="Heading3Char">
+    <w:name w:val="Heading 3 Char"/>
+    <w:basedOn w:val="DefaultParagraphFont"/>
+    <w:link w:val="Heading3"/>
     <w:uiPriority w:val="9"/>
     <w:semiHidden/>
     <w:rsid w:val="00A508B6"/>
@@ -8542,10 +8392,10 @@
       <w:szCs w:val="28"/>
     </w:rPr>
   </w:style>
-  <w:style w:type="character" w:customStyle="1" w:styleId="Ttulo4Char">
-    <w:name w:val="Título 4 Char"/>
-    <w:basedOn w:val="Fontepargpadro"/>
-    <w:link w:val="Ttulo4"/>
+  <w:style w:type="character" w:customStyle="1" w:styleId="Heading4Char">
+    <w:name w:val="Heading 4 Char"/>
+    <w:basedOn w:val="DefaultParagraphFont"/>
+    <w:link w:val="Heading4"/>
     <w:uiPriority w:val="9"/>
     <w:semiHidden/>
     <w:rsid w:val="00A508B6"/>
@@ -8556,10 +8406,10 @@
       <w:color w:val="0F4761" w:themeColor="accent1" w:themeShade="BF"/>
     </w:rPr>
   </w:style>
-  <w:style w:type="character" w:customStyle="1" w:styleId="Ttulo5Char">
-    <w:name w:val="Título 5 Char"/>
-    <w:basedOn w:val="Fontepargpadro"/>
-    <w:link w:val="Ttulo5"/>
+  <w:style w:type="character" w:customStyle="1" w:styleId="Heading5Char">
+    <w:name w:val="Heading 5 Char"/>
+    <w:basedOn w:val="DefaultParagraphFont"/>
+    <w:link w:val="Heading5"/>
     <w:uiPriority w:val="9"/>
     <w:semiHidden/>
     <w:rsid w:val="00A508B6"/>
@@ -8568,10 +8418,10 @@
       <w:color w:val="0F4761" w:themeColor="accent1" w:themeShade="BF"/>
     </w:rPr>
   </w:style>
-  <w:style w:type="character" w:customStyle="1" w:styleId="Ttulo6Char">
-    <w:name w:val="Título 6 Char"/>
-    <w:basedOn w:val="Fontepargpadro"/>
-    <w:link w:val="Ttulo6"/>
+  <w:style w:type="character" w:customStyle="1" w:styleId="Heading6Char">
+    <w:name w:val="Heading 6 Char"/>
+    <w:basedOn w:val="DefaultParagraphFont"/>
+    <w:link w:val="Heading6"/>
     <w:uiPriority w:val="9"/>
     <w:semiHidden/>
     <w:rsid w:val="00A508B6"/>
@@ -8582,10 +8432,10 @@
       <w:color w:val="595959" w:themeColor="text1" w:themeTint="A6"/>
     </w:rPr>
   </w:style>
-  <w:style w:type="character" w:customStyle="1" w:styleId="Ttulo7Char">
-    <w:name w:val="Título 7 Char"/>
-    <w:basedOn w:val="Fontepargpadro"/>
-    <w:link w:val="Ttulo7"/>
+  <w:style w:type="character" w:customStyle="1" w:styleId="Heading7Char">
+    <w:name w:val="Heading 7 Char"/>
+    <w:basedOn w:val="DefaultParagraphFont"/>
+    <w:link w:val="Heading7"/>
     <w:uiPriority w:val="9"/>
     <w:semiHidden/>
     <w:rsid w:val="00A508B6"/>
@@ -8594,10 +8444,10 @@
       <w:color w:val="595959" w:themeColor="text1" w:themeTint="A6"/>
     </w:rPr>
   </w:style>
-  <w:style w:type="character" w:customStyle="1" w:styleId="Ttulo8Char">
-    <w:name w:val="Título 8 Char"/>
-    <w:basedOn w:val="Fontepargpadro"/>
-    <w:link w:val="Ttulo8"/>
+  <w:style w:type="character" w:customStyle="1" w:styleId="Heading8Char">
+    <w:name w:val="Heading 8 Char"/>
+    <w:basedOn w:val="DefaultParagraphFont"/>
+    <w:link w:val="Heading8"/>
     <w:uiPriority w:val="9"/>
     <w:semiHidden/>
     <w:rsid w:val="00A508B6"/>
@@ -8608,10 +8458,10 @@
       <w:color w:val="272727" w:themeColor="text1" w:themeTint="D8"/>
     </w:rPr>
   </w:style>
-  <w:style w:type="character" w:customStyle="1" w:styleId="Ttulo9Char">
-    <w:name w:val="Título 9 Char"/>
-    <w:basedOn w:val="Fontepargpadro"/>
-    <w:link w:val="Ttulo9"/>
+  <w:style w:type="character" w:customStyle="1" w:styleId="Heading9Char">
+    <w:name w:val="Heading 9 Char"/>
+    <w:basedOn w:val="DefaultParagraphFont"/>
+    <w:link w:val="Heading9"/>
     <w:uiPriority w:val="9"/>
     <w:semiHidden/>
     <w:rsid w:val="00A508B6"/>
@@ -8620,11 +8470,11 @@
       <w:color w:val="272727" w:themeColor="text1" w:themeTint="D8"/>
     </w:rPr>
   </w:style>
-  <w:style w:type="paragraph" w:styleId="Ttulo">
+  <w:style w:type="paragraph" w:styleId="Title">
     <w:name w:val="Title"/>
     <w:basedOn w:val="Normal"/>
     <w:next w:val="Normal"/>
-    <w:link w:val="TtuloChar"/>
+    <w:link w:val="TitleChar"/>
     <w:uiPriority w:val="10"/>
     <w:qFormat/>
     <w:rsid w:val="00A508B6"/>
@@ -8642,10 +8492,10 @@
       <w14:ligatures w14:val="standardContextual"/>
     </w:rPr>
   </w:style>
-  <w:style w:type="character" w:customStyle="1" w:styleId="TtuloChar">
-    <w:name w:val="Título Char"/>
-    <w:basedOn w:val="Fontepargpadro"/>
-    <w:link w:val="Ttulo"/>
+  <w:style w:type="character" w:customStyle="1" w:styleId="TitleChar">
+    <w:name w:val="Title Char"/>
+    <w:basedOn w:val="DefaultParagraphFont"/>
+    <w:link w:val="Title"/>
     <w:uiPriority w:val="10"/>
     <w:rsid w:val="00A508B6"/>
     <w:rPr>
@@ -8656,11 +8506,11 @@
       <w:szCs w:val="56"/>
     </w:rPr>
   </w:style>
-  <w:style w:type="paragraph" w:styleId="Subttulo">
+  <w:style w:type="paragraph" w:styleId="Subtitle">
     <w:name w:val="Subtitle"/>
     <w:basedOn w:val="Normal"/>
     <w:next w:val="Normal"/>
-    <w:link w:val="SubttuloChar"/>
+    <w:link w:val="SubtitleChar"/>
     <w:uiPriority w:val="11"/>
     <w:qFormat/>
     <w:rsid w:val="00A508B6"/>
@@ -8681,10 +8531,10 @@
       <w14:ligatures w14:val="standardContextual"/>
     </w:rPr>
   </w:style>
-  <w:style w:type="character" w:customStyle="1" w:styleId="SubttuloChar">
-    <w:name w:val="Subtítulo Char"/>
-    <w:basedOn w:val="Fontepargpadro"/>
-    <w:link w:val="Subttulo"/>
+  <w:style w:type="character" w:customStyle="1" w:styleId="SubtitleChar">
+    <w:name w:val="Subtitle Char"/>
+    <w:basedOn w:val="DefaultParagraphFont"/>
+    <w:link w:val="Subtitle"/>
     <w:uiPriority w:val="11"/>
     <w:rsid w:val="00A508B6"/>
     <w:rPr>
@@ -8695,11 +8545,11 @@
       <w:szCs w:val="28"/>
     </w:rPr>
   </w:style>
-  <w:style w:type="paragraph" w:styleId="Citao">
+  <w:style w:type="paragraph" w:styleId="Quote">
     <w:name w:val="Quote"/>
     <w:basedOn w:val="Normal"/>
     <w:next w:val="Normal"/>
-    <w:link w:val="CitaoChar"/>
+    <w:link w:val="QuoteChar"/>
     <w:uiPriority w:val="29"/>
     <w:qFormat/>
     <w:rsid w:val="00A508B6"/>
@@ -8719,10 +8569,10 @@
       <w14:ligatures w14:val="standardContextual"/>
     </w:rPr>
   </w:style>
-  <w:style w:type="character" w:customStyle="1" w:styleId="CitaoChar">
-    <w:name w:val="Citação Char"/>
-    <w:basedOn w:val="Fontepargpadro"/>
-    <w:link w:val="Citao"/>
+  <w:style w:type="character" w:customStyle="1" w:styleId="QuoteChar">
+    <w:name w:val="Quote Char"/>
+    <w:basedOn w:val="DefaultParagraphFont"/>
+    <w:link w:val="Quote"/>
     <w:uiPriority w:val="29"/>
     <w:rsid w:val="00A508B6"/>
     <w:rPr>
@@ -8731,7 +8581,7 @@
       <w:color w:val="404040" w:themeColor="text1" w:themeTint="BF"/>
     </w:rPr>
   </w:style>
-  <w:style w:type="paragraph" w:styleId="PargrafodaLista">
+  <w:style w:type="paragraph" w:styleId="ListParagraph">
     <w:name w:val="List Paragraph"/>
     <w:basedOn w:val="Normal"/>
     <w:uiPriority w:val="34"/>
@@ -8751,9 +8601,9 @@
       <w14:ligatures w14:val="standardContextual"/>
     </w:rPr>
   </w:style>
-  <w:style w:type="character" w:styleId="nfaseIntensa">
+  <w:style w:type="character" w:styleId="IntenseEmphasis">
     <w:name w:val="Intense Emphasis"/>
-    <w:basedOn w:val="Fontepargpadro"/>
+    <w:basedOn w:val="DefaultParagraphFont"/>
     <w:uiPriority w:val="21"/>
     <w:qFormat/>
     <w:rsid w:val="00A508B6"/>
@@ -8763,11 +8613,11 @@
       <w:color w:val="0F4761" w:themeColor="accent1" w:themeShade="BF"/>
     </w:rPr>
   </w:style>
-  <w:style w:type="paragraph" w:styleId="CitaoIntensa">
+  <w:style w:type="paragraph" w:styleId="IntenseQuote">
     <w:name w:val="Intense Quote"/>
     <w:basedOn w:val="Normal"/>
     <w:next w:val="Normal"/>
-    <w:link w:val="CitaoIntensaChar"/>
+    <w:link w:val="IntenseQuoteChar"/>
     <w:uiPriority w:val="30"/>
     <w:qFormat/>
     <w:rsid w:val="00A508B6"/>
@@ -8792,10 +8642,10 @@
       <w14:ligatures w14:val="standardContextual"/>
     </w:rPr>
   </w:style>
-  <w:style w:type="character" w:customStyle="1" w:styleId="CitaoIntensaChar">
-    <w:name w:val="Citação Intensa Char"/>
-    <w:basedOn w:val="Fontepargpadro"/>
-    <w:link w:val="CitaoIntensa"/>
+  <w:style w:type="character" w:customStyle="1" w:styleId="IntenseQuoteChar">
+    <w:name w:val="Intense Quote Char"/>
+    <w:basedOn w:val="DefaultParagraphFont"/>
+    <w:link w:val="IntenseQuote"/>
     <w:uiPriority w:val="30"/>
     <w:rsid w:val="00A508B6"/>
     <w:rPr>
@@ -8804,9 +8654,9 @@
       <w:color w:val="0F4761" w:themeColor="accent1" w:themeShade="BF"/>
     </w:rPr>
   </w:style>
-  <w:style w:type="character" w:styleId="RefernciaIntensa">
+  <w:style w:type="character" w:styleId="IntenseReference">
     <w:name w:val="Intense Reference"/>
-    <w:basedOn w:val="Fontepargpadro"/>
+    <w:basedOn w:val="DefaultParagraphFont"/>
     <w:uiPriority w:val="32"/>
     <w:qFormat/>
     <w:rsid w:val="00A508B6"/>
@@ -8822,7 +8672,6 @@
     <w:name w:val="Normal (Web)"/>
     <w:basedOn w:val="Normal"/>
     <w:uiPriority w:val="99"/>
-    <w:semiHidden/>
     <w:unhideWhenUsed/>
     <w:rsid w:val="00A508B6"/>
     <w:pPr>
@@ -8836,12 +8685,12 @@
   </w:style>
   <w:style w:type="character" w:customStyle="1" w:styleId="apple-tab-span">
     <w:name w:val="apple-tab-span"/>
-    <w:basedOn w:val="Fontepargpadro"/>
+    <w:basedOn w:val="DefaultParagraphFont"/>
     <w:rsid w:val="00A508B6"/>
   </w:style>
-  <w:style w:type="table" w:styleId="Tabelacomgrade">
+  <w:style w:type="table" w:styleId="TableGrid">
     <w:name w:val="Table Grid"/>
-    <w:basedOn w:val="Tabelanormal"/>
+    <w:basedOn w:val="TableNormal"/>
     <w:uiPriority w:val="39"/>
     <w:rsid w:val="00E37125"/>
     <w:pPr>
@@ -8858,9 +8707,9 @@
       </w:tblBorders>
     </w:tblPr>
   </w:style>
-  <w:style w:type="table" w:styleId="SimplesTabela1">
+  <w:style w:type="table" w:styleId="PlainTable1">
     <w:name w:val="Plain Table 1"/>
-    <w:basedOn w:val="Tabelanormal"/>
+    <w:basedOn w:val="TableNormal"/>
     <w:uiPriority w:val="41"/>
     <w:rsid w:val="0047070A"/>
     <w:pPr>
@@ -8921,9 +8770,9 @@
       </w:tcPr>
     </w:tblStylePr>
   </w:style>
-  <w:style w:type="table" w:styleId="TabeladeGrade3">
+  <w:style w:type="table" w:styleId="GridTable3">
     <w:name w:val="Grid Table 3"/>
-    <w:basedOn w:val="Tabelanormal"/>
+    <w:basedOn w:val="TableNormal"/>
     <w:uiPriority w:val="48"/>
     <w:rsid w:val="006B0BC6"/>
     <w:pPr>

</xml_diff>

<commit_message>
Atualiza template do protocolo
</commit_message>
<xml_diff>
--- a/src/assets/protocol/template_protocolo_microrganismos.docx
+++ b/src/assets/protocol/template_protocolo_microrganismos.docx
@@ -1200,23 +1200,7 @@
                 <w:sz w:val="14"/>
                 <w:szCs w:val="14"/>
               </w:rPr>
-              <w:t># Prot</w:t>
-            </w:r>
-            <w:r>
-              <w:rPr>
-                <w:rFonts w:ascii="Calibri" w:eastAsia="Calibri" w:hAnsi="Calibri" w:cs="Calibri"/>
-                <w:sz w:val="14"/>
-                <w:szCs w:val="14"/>
-              </w:rPr>
-              <w:t>eína</w:t>
-            </w:r>
-            <w:r>
-              <w:rPr>
-                <w:rFonts w:ascii="Calibri" w:eastAsia="Calibri" w:hAnsi="Calibri" w:cs="Calibri"/>
-                <w:sz w:val="14"/>
-                <w:szCs w:val="14"/>
-              </w:rPr>
-              <w:t xml:space="preserve"> S </w:t>
+              <w:t># Proteína S </w:t>
             </w:r>
           </w:p>
           <w:p>
@@ -4317,23 +4301,7 @@
                 <w:sz w:val="14"/>
                 <w:szCs w:val="14"/>
               </w:rPr>
-              <w:t xml:space="preserve">RPD </w:t>
-            </w:r>
-            <w:r>
-              <w:rPr>
-                <w:rFonts w:ascii="Calibri" w:eastAsia="Calibri" w:hAnsi="Calibri" w:cs="Calibri"/>
-                <w:sz w:val="14"/>
-                <w:szCs w:val="14"/>
-              </w:rPr>
-              <w:t>–</w:t>
-            </w:r>
-            <w:r>
-              <w:rPr>
-                <w:rFonts w:ascii="Calibri" w:eastAsia="Calibri" w:hAnsi="Calibri" w:cs="Calibri"/>
-                <w:sz w:val="14"/>
-                <w:szCs w:val="14"/>
-              </w:rPr>
-              <w:t xml:space="preserve"> Xenoestrógenos</w:t>
+              <w:t>RPD – Xenoestrógenos</w:t>
             </w:r>
           </w:p>
           <w:p>
@@ -6953,15 +6921,7 @@
                 <w:sz w:val="14"/>
                 <w:szCs w:val="14"/>
               </w:rPr>
-              <w:t>RPD - Sangue e Linf</w:t>
-            </w:r>
-            <w:r>
-              <w:rPr>
-                <w:rFonts w:ascii="Calibri" w:eastAsia="Calibri" w:hAnsi="Calibri" w:cs="Calibri"/>
-                <w:sz w:val="14"/>
-                <w:szCs w:val="14"/>
-              </w:rPr>
-              <w:t>a</w:t>
+              <w:t>RPD - Sangue e Linfa</w:t>
             </w:r>
           </w:p>
           <w:p>
@@ -8415,7 +8375,16 @@
                 <w:szCs w:val="14"/>
                 <w:lang w:val="en-US"/>
               </w:rPr>
-              <w:t>_c</w:t>
+              <w:t>_</w:t>
+            </w:r>
+            <w:r>
+              <w:rPr>
+                <w:rFonts w:ascii="Calibri" w:eastAsia="Calibri" w:hAnsi="Calibri" w:cs="Calibri"/>
+                <w:sz w:val="14"/>
+                <w:szCs w:val="14"/>
+                <w:lang w:val="en-US"/>
+              </w:rPr>
+              <w:t>p</w:t>
             </w:r>
             <w:proofErr w:type="spellEnd"/>
             <w:r>
@@ -8990,6 +8959,7 @@
               <w:t>{{</w:t>
             </w:r>
             <w:proofErr w:type="spellStart"/>
+            <w:proofErr w:type="gramStart"/>
             <w:r>
               <w:rPr>
                 <w:rFonts w:ascii="Calibri" w:hAnsi="Calibri" w:cs="Calibri"/>
@@ -8999,7 +8969,17 @@
               </w:rPr>
               <w:t>i</w:t>
             </w:r>
+            <w:r>
+              <w:rPr>
+                <w:rFonts w:ascii="Calibri" w:hAnsi="Calibri" w:cs="Calibri"/>
+                <w:sz w:val="18"/>
+                <w:szCs w:val="18"/>
+                <w:lang w:val="en-US"/>
+              </w:rPr>
+              <w:t>.display</w:t>
+            </w:r>
             <w:proofErr w:type="spellEnd"/>
+            <w:proofErr w:type="gramEnd"/>
             <w:r>
               <w:rPr>
                 <w:rFonts w:ascii="Calibri" w:hAnsi="Calibri" w:cs="Calibri"/>
@@ -9335,6 +9315,7 @@
               <w:t>{{</w:t>
             </w:r>
             <w:proofErr w:type="spellStart"/>
+            <w:proofErr w:type="gramStart"/>
             <w:r>
               <w:rPr>
                 <w:rFonts w:ascii="Calibri" w:hAnsi="Calibri" w:cs="Calibri"/>
@@ -9344,7 +9325,17 @@
               </w:rPr>
               <w:t>i</w:t>
             </w:r>
+            <w:r>
+              <w:rPr>
+                <w:rFonts w:ascii="Calibri" w:hAnsi="Calibri" w:cs="Calibri"/>
+                <w:sz w:val="18"/>
+                <w:szCs w:val="18"/>
+                <w:lang w:val="en-US"/>
+              </w:rPr>
+              <w:t>.display</w:t>
+            </w:r>
             <w:proofErr w:type="spellEnd"/>
+            <w:proofErr w:type="gramEnd"/>
             <w:r>
               <w:rPr>
                 <w:rFonts w:ascii="Calibri" w:hAnsi="Calibri" w:cs="Calibri"/>

</xml_diff>